<commit_message>
feat: MapLoader & MapSaver
</commit_message>
<xml_diff>
--- a/Document.docx
+++ b/Document.docx
@@ -2,6 +2,737 @@
 <file path=word/document.xml><?xml version="1.0" encoding="utf-8"?>
 <w:document xmlns:wpc="http://schemas.microsoft.com/office/word/2010/wordprocessingCanvas" xmlns:mc="http://schemas.openxmlformats.org/markup-compatibility/2006" xmlns:o="urn:schemas-microsoft-com:office:office" xmlns:r="http://schemas.openxmlformats.org/officeDocument/2006/relationships" xmlns:m="http://schemas.openxmlformats.org/officeDocument/2006/math" xmlns:v="urn:schemas-microsoft-com:vml" xmlns:wp14="http://schemas.microsoft.com/office/word/2010/wordprocessingDrawing" xmlns:wp="http://schemas.openxmlformats.org/drawingml/2006/wordprocessingDrawing" xmlns:w10="urn:schemas-microsoft-com:office:word" xmlns:w="http://schemas.openxmlformats.org/wordprocessingml/2006/main" xmlns:w14="http://schemas.microsoft.com/office/word/2010/wordml" xmlns:w15="http://schemas.microsoft.com/office/word/2012/wordml" xmlns:wpg="http://schemas.microsoft.com/office/word/2010/wordprocessingGroup" xmlns:wpi="http://schemas.microsoft.com/office/word/2010/wordprocessingInk" xmlns:wne="http://schemas.microsoft.com/office/word/2006/wordml" xmlns:wps="http://schemas.microsoft.com/office/word/2010/wordprocessingShape" mc:Ignorable="w14 w15 wp14">
   <w:body>
+    <w:p>
+      <w:pPr>
+        <w:jc w:val="center"/>
+        <w:rPr>
+          <w:rFonts w:ascii="Times New Roman" w:hAnsi="Times New Roman" w:cs="Times New Roman"/>
+          <w:b/>
+          <w:sz w:val="40"/>
+          <w:lang w:val="vi-VN"/>
+        </w:rPr>
+      </w:pPr>
+      <w:r>
+        <w:rPr>
+          <w:rFonts w:ascii="Times New Roman" w:hAnsi="Times New Roman" w:cs="Times New Roman"/>
+          <w:b/>
+          <w:sz w:val="40"/>
+          <w:lang w:val="vi-VN"/>
+        </w:rPr>
+        <w:t>Defenora</w:t>
+      </w:r>
+    </w:p>
+    <w:p>
+      <w:pPr>
+        <w:rPr>
+          <w:rFonts w:ascii="Times New Roman" w:hAnsi="Times New Roman" w:cs="Times New Roman"/>
+          <w:sz w:val="28"/>
+          <w:lang w:val="vi-VN"/>
+        </w:rPr>
+      </w:pPr>
+      <w:r>
+        <w:rPr>
+          <w:rFonts w:ascii="Times New Roman" w:hAnsi="Times New Roman" w:cs="Times New Roman"/>
+          <w:sz w:val="28"/>
+          <w:lang w:val="vi-VN"/>
+        </w:rPr>
+        <w:t xml:space="preserve">Ý tưởng: </w:t>
+      </w:r>
+    </w:p>
+    <w:p>
+      <w:pPr>
+        <w:pStyle w:val="ListParagraph"/>
+        <w:numPr>
+          <w:ilvl w:val="0"/>
+          <w:numId w:val="2"/>
+        </w:numPr>
+        <w:rPr>
+          <w:rFonts w:ascii="Times New Roman" w:hAnsi="Times New Roman" w:cs="Times New Roman"/>
+          <w:sz w:val="28"/>
+          <w:lang w:val="vi-VN"/>
+        </w:rPr>
+      </w:pPr>
+      <w:r>
+        <w:rPr>
+          <w:rFonts w:ascii="Times New Roman" w:hAnsi="Times New Roman" w:cs="Times New Roman"/>
+          <w:sz w:val="28"/>
+          <w:lang w:val="vi-VN"/>
+        </w:rPr>
+        <w:t>Đây là tựa game thủ thành tương tự như Kingdom: Classic kết hợp với tìm kiếm tài nguyên và xây dựng kiến trúc như Class of Clan</w:t>
+      </w:r>
+    </w:p>
+    <w:p>
+      <w:pPr>
+        <w:pStyle w:val="ListParagraph"/>
+        <w:numPr>
+          <w:ilvl w:val="0"/>
+          <w:numId w:val="2"/>
+        </w:numPr>
+        <w:rPr>
+          <w:rFonts w:ascii="Times New Roman" w:hAnsi="Times New Roman" w:cs="Times New Roman"/>
+          <w:sz w:val="28"/>
+          <w:lang w:val="vi-VN"/>
+        </w:rPr>
+      </w:pPr>
+      <w:r>
+        <w:rPr>
+          <w:rFonts w:ascii="Times New Roman" w:hAnsi="Times New Roman" w:cs="Times New Roman"/>
+          <w:sz w:val="28"/>
+          <w:lang w:val="vi-VN"/>
+        </w:rPr>
+        <w:t xml:space="preserve">Bối cảnh: Người chơi </w:t>
+      </w:r>
+      <w:r>
+        <w:rPr>
+          <w:rFonts w:ascii="Times New Roman" w:hAnsi="Times New Roman" w:cs="Times New Roman"/>
+          <w:sz w:val="28"/>
+          <w:lang w:val="vi-VN"/>
+        </w:rPr>
+        <w:t xml:space="preserve">bị đày ra ngoài biển và phải tự mình xây dựng hòn đảo cho riêng mình để sinh sống. Tuy nhiên việc xây dựng hòn đảo ngoài biển tiêu hao hiểu tính hợp lí của thế giới. Vì vậy khi hòn đảo xây dựng xong thì hằng đêm sẽ có quái vật đến đánh phá. Công việc của người chơi là phải xây dựng lực lượng, tạo ra các tòa thành để phòng thủ trước làn sóng quái vật. </w:t>
+      </w:r>
+    </w:p>
+    <w:p>
+      <w:pPr>
+        <w:pStyle w:val="ListParagraph"/>
+        <w:numPr>
+          <w:ilvl w:val="0"/>
+          <w:numId w:val="2"/>
+        </w:numPr>
+        <w:rPr>
+          <w:rFonts w:ascii="Times New Roman" w:hAnsi="Times New Roman" w:cs="Times New Roman"/>
+          <w:sz w:val="28"/>
+          <w:lang w:val="vi-VN"/>
+        </w:rPr>
+      </w:pPr>
+      <w:r>
+        <w:rPr>
+          <w:rFonts w:ascii="Times New Roman" w:hAnsi="Times New Roman" w:cs="Times New Roman"/>
+          <w:sz w:val="28"/>
+          <w:lang w:val="vi-VN"/>
+        </w:rPr>
+        <w:t xml:space="preserve">Gameplay: </w:t>
+      </w:r>
+    </w:p>
+    <w:p>
+      <w:pPr>
+        <w:pStyle w:val="ListParagraph"/>
+        <w:numPr>
+          <w:ilvl w:val="0"/>
+          <w:numId w:val="3"/>
+        </w:numPr>
+        <w:rPr>
+          <w:rFonts w:ascii="Times New Roman" w:hAnsi="Times New Roman" w:cs="Times New Roman"/>
+          <w:sz w:val="28"/>
+          <w:lang w:val="vi-VN"/>
+        </w:rPr>
+      </w:pPr>
+      <w:r>
+        <w:rPr>
+          <w:rFonts w:ascii="Times New Roman" w:hAnsi="Times New Roman" w:cs="Times New Roman"/>
+          <w:sz w:val="28"/>
+          <w:lang w:val="vi-VN"/>
+        </w:rPr>
+        <w:t>Khi bắt đầu game thì người chơi sẽ được cho các item để tạo nên hòn đảo của mình. Người chơi có thể thiết kế hòn đảo tùy theo ý thích của mình. Tuy nhiên số lượng item sẽ bị giới hạn và hòn đảo phải đảm bảo có thể để nhân vật di chuyển 1 cách logic.</w:t>
+      </w:r>
+    </w:p>
+    <w:p>
+      <w:pPr>
+        <w:pStyle w:val="ListParagraph"/>
+        <w:numPr>
+          <w:ilvl w:val="0"/>
+          <w:numId w:val="3"/>
+        </w:numPr>
+        <w:rPr>
+          <w:rFonts w:ascii="Times New Roman" w:hAnsi="Times New Roman" w:cs="Times New Roman"/>
+          <w:sz w:val="28"/>
+          <w:lang w:val="vi-VN"/>
+        </w:rPr>
+      </w:pPr>
+      <w:r>
+        <w:rPr>
+          <w:rFonts w:ascii="Times New Roman" w:hAnsi="Times New Roman" w:cs="Times New Roman"/>
+          <w:sz w:val="28"/>
+          <w:lang w:val="vi-VN"/>
+        </w:rPr>
+        <w:t>Game sẽ xoay quanh việc hoạt động theo ngày. Ban ngày đơn vị thuộc hạ sẽ khai thác, chế tạo, săn bắn quanh map. Khi về đêm thì các đơn vị sẽ trở về để phòng thủ</w:t>
+      </w:r>
+    </w:p>
+    <w:p>
+      <w:pPr>
+        <w:pStyle w:val="ListParagraph"/>
+        <w:numPr>
+          <w:ilvl w:val="0"/>
+          <w:numId w:val="3"/>
+        </w:numPr>
+        <w:rPr>
+          <w:rFonts w:ascii="Times New Roman" w:hAnsi="Times New Roman" w:cs="Times New Roman"/>
+          <w:sz w:val="28"/>
+          <w:lang w:val="vi-VN"/>
+        </w:rPr>
+      </w:pPr>
+      <w:r>
+        <w:rPr>
+          <w:rFonts w:ascii="Times New Roman" w:hAnsi="Times New Roman" w:cs="Times New Roman"/>
+          <w:sz w:val="28"/>
+          <w:lang w:val="vi-VN"/>
+        </w:rPr>
+        <w:t>Sau mỗi ngày thì những phần còn trống trong map sẽ sinh ra những cây mới để người chơi kiếm gỗ, cũng như động vật như cừu sẽ được sản sinh ra thêm</w:t>
+      </w:r>
+      <w:r>
+        <w:rPr>
+          <w:rFonts w:ascii="Times New Roman" w:hAnsi="Times New Roman" w:cs="Times New Roman"/>
+          <w:sz w:val="28"/>
+          <w:lang w:val="vi-VN"/>
+        </w:rPr>
+        <w:t xml:space="preserve">. Tuy nhiên lượng sinh ra sẽ tuân theo quy định để không để map quá chật và quá nhiều tài nguyên. </w:t>
+      </w:r>
+    </w:p>
+    <w:p>
+      <w:pPr>
+        <w:pStyle w:val="ListParagraph"/>
+        <w:numPr>
+          <w:ilvl w:val="0"/>
+          <w:numId w:val="3"/>
+        </w:numPr>
+        <w:rPr>
+          <w:rFonts w:ascii="Times New Roman" w:hAnsi="Times New Roman" w:cs="Times New Roman"/>
+          <w:sz w:val="28"/>
+          <w:lang w:val="vi-VN"/>
+        </w:rPr>
+      </w:pPr>
+      <w:r>
+        <w:rPr>
+          <w:rFonts w:ascii="Times New Roman" w:hAnsi="Times New Roman" w:cs="Times New Roman"/>
+          <w:sz w:val="28"/>
+          <w:lang w:val="vi-VN"/>
+        </w:rPr>
+        <w:t>Khi xây dựng xong map thì các tài nguyên sẽ được generate ngẫu nhiên trên map. Người chơi sẽ cho thuộc hạ đi khai thác tài nguyên để chế tạo vũ khí, xây dựng tháp canh, nhà huấn luyện,..</w:t>
+      </w:r>
+    </w:p>
+    <w:p>
+      <w:pPr>
+        <w:pStyle w:val="ListParagraph"/>
+        <w:numPr>
+          <w:ilvl w:val="0"/>
+          <w:numId w:val="3"/>
+        </w:numPr>
+        <w:rPr>
+          <w:rFonts w:ascii="Times New Roman" w:hAnsi="Times New Roman" w:cs="Times New Roman"/>
+          <w:sz w:val="28"/>
+          <w:lang w:val="vi-VN"/>
+        </w:rPr>
+      </w:pPr>
+      <w:r>
+        <w:rPr>
+          <w:rFonts w:ascii="Times New Roman" w:hAnsi="Times New Roman" w:cs="Times New Roman"/>
+          <w:sz w:val="28"/>
+          <w:lang w:val="vi-VN"/>
+        </w:rPr>
+        <w:t>Mỗi đơn vị thuộc hạ sẽ tiêu hao 1 lượng thức ăn hằng ngày, vì vậy người chơi sẽ phải đi săn những con cừu rải rác trên map để kiếm thực phẩm. Khi 1 đơn vị thuộc hạ không đủ thực phẩm thì sẽ bị đói và đơn vị ấy sẽ biến mất.</w:t>
+      </w:r>
+    </w:p>
+    <w:p>
+      <w:pPr>
+        <w:pStyle w:val="ListParagraph"/>
+        <w:numPr>
+          <w:ilvl w:val="0"/>
+          <w:numId w:val="3"/>
+        </w:numPr>
+        <w:rPr>
+          <w:rFonts w:ascii="Times New Roman" w:hAnsi="Times New Roman" w:cs="Times New Roman"/>
+          <w:sz w:val="28"/>
+          <w:lang w:val="vi-VN"/>
+        </w:rPr>
+      </w:pPr>
+      <w:r>
+        <w:rPr>
+          <w:rFonts w:ascii="Times New Roman" w:hAnsi="Times New Roman" w:cs="Times New Roman"/>
+          <w:sz w:val="28"/>
+          <w:lang w:val="vi-VN"/>
+        </w:rPr>
+        <w:t>Lính thợ đóng vai trò quan trọng vì đây là đơn vị khai thác, vận chuyển nguyên liệu, chế tạo vật phẩm. Vì lượng tài nguyên có hạn nên người chơi sẽ phải tính toán việc chế tạo và phân bổ vật tư như cung tên cho các tháp canh 1 cách hợp lí. Khi 1 tháp canh hết mũi tên thì cung thủ sẽ trở nên vô dụ</w:t>
+      </w:r>
+      <w:r>
+        <w:rPr>
+          <w:rFonts w:ascii="Times New Roman" w:hAnsi="Times New Roman" w:cs="Times New Roman"/>
+          <w:sz w:val="28"/>
+          <w:lang w:val="vi-VN"/>
+        </w:rPr>
+        <w:t>ng.</w:t>
+      </w:r>
+    </w:p>
+    <w:p>
+      <w:pPr>
+        <w:jc w:val="center"/>
+        <w:rPr>
+          <w:rFonts w:ascii="Times New Roman" w:hAnsi="Times New Roman" w:cs="Times New Roman"/>
+          <w:sz w:val="28"/>
+          <w:lang w:val="vi-VN"/>
+        </w:rPr>
+      </w:pPr>
+      <w:r>
+        <w:rPr>
+          <w:rFonts w:ascii="Times New Roman" w:hAnsi="Times New Roman" w:cs="Times New Roman"/>
+          <w:sz w:val="28"/>
+          <w:lang w:val="vi-VN"/>
+        </w:rPr>
+        <w:drawing>
+          <wp:inline distT="0" distB="0" distL="0" distR="0" wp14:anchorId="34C298D2" wp14:editId="3A0FD7F5">
+            <wp:extent cx="1095528" cy="952633"/>
+            <wp:effectExtent l="0" t="0" r="9525" b="0"/>
+            <wp:docPr id="5" name="Picture 5"/>
+            <wp:cNvGraphicFramePr>
+              <a:graphicFrameLocks xmlns:a="http://schemas.openxmlformats.org/drawingml/2006/main" noChangeAspect="1"/>
+            </wp:cNvGraphicFramePr>
+            <a:graphic xmlns:a="http://schemas.openxmlformats.org/drawingml/2006/main">
+              <a:graphicData uri="http://schemas.openxmlformats.org/drawingml/2006/picture">
+                <pic:pic xmlns:pic="http://schemas.openxmlformats.org/drawingml/2006/picture">
+                  <pic:nvPicPr>
+                    <pic:cNvPr id="1" name=""/>
+                    <pic:cNvPicPr/>
+                  </pic:nvPicPr>
+                  <pic:blipFill>
+                    <a:blip r:embed="rId5"/>
+                    <a:stretch>
+                      <a:fillRect/>
+                    </a:stretch>
+                  </pic:blipFill>
+                  <pic:spPr>
+                    <a:xfrm>
+                      <a:off x="0" y="0"/>
+                      <a:ext cx="1095528" cy="952633"/>
+                    </a:xfrm>
+                    <a:prstGeom prst="rect">
+                      <a:avLst/>
+                    </a:prstGeom>
+                  </pic:spPr>
+                </pic:pic>
+              </a:graphicData>
+            </a:graphic>
+          </wp:inline>
+        </w:drawing>
+      </w:r>
+    </w:p>
+    <w:p>
+      <w:pPr>
+        <w:pStyle w:val="ListParagraph"/>
+        <w:numPr>
+          <w:ilvl w:val="0"/>
+          <w:numId w:val="3"/>
+        </w:numPr>
+        <w:rPr>
+          <w:rFonts w:ascii="Times New Roman" w:hAnsi="Times New Roman" w:cs="Times New Roman"/>
+          <w:sz w:val="28"/>
+          <w:lang w:val="vi-VN"/>
+        </w:rPr>
+      </w:pPr>
+      <w:r>
+        <w:rPr>
+          <w:rFonts w:ascii="Times New Roman" w:hAnsi="Times New Roman" w:cs="Times New Roman"/>
+          <w:sz w:val="28"/>
+          <w:lang w:val="vi-VN"/>
+        </w:rPr>
+        <w:lastRenderedPageBreak/>
+        <w:t xml:space="preserve">Mỗi công trình có 1 công dụng khác nhau cho từng đơn vị: </w:t>
+      </w:r>
+    </w:p>
+    <w:p>
+      <w:pPr>
+        <w:pStyle w:val="ListParagraph"/>
+        <w:numPr>
+          <w:ilvl w:val="0"/>
+          <w:numId w:val="4"/>
+        </w:numPr>
+        <w:rPr>
+          <w:rFonts w:ascii="Times New Roman" w:hAnsi="Times New Roman" w:cs="Times New Roman"/>
+          <w:sz w:val="28"/>
+          <w:lang w:val="vi-VN"/>
+        </w:rPr>
+      </w:pPr>
+      <w:r>
+        <w:rPr>
+          <w:rFonts w:ascii="Times New Roman" w:hAnsi="Times New Roman" w:cs="Times New Roman"/>
+          <w:sz w:val="28"/>
+          <w:lang w:val="vi-VN"/>
+        </w:rPr>
+        <w:t>Nhà huấn luyện sẽ biến đơn vị lính thợ thành kị sĩ khi chế tạo được vũ khí cũng như nâng cấp sức mạnh của các kị sĩ</w:t>
+      </w:r>
+    </w:p>
+    <w:p>
+      <w:pPr>
+        <w:pStyle w:val="ListParagraph"/>
+        <w:numPr>
+          <w:ilvl w:val="0"/>
+          <w:numId w:val="4"/>
+        </w:numPr>
+        <w:rPr>
+          <w:rFonts w:ascii="Times New Roman" w:hAnsi="Times New Roman" w:cs="Times New Roman"/>
+          <w:sz w:val="28"/>
+          <w:lang w:val="vi-VN"/>
+        </w:rPr>
+      </w:pPr>
+      <w:r>
+        <w:rPr>
+          <w:rFonts w:ascii="Times New Roman" w:hAnsi="Times New Roman" w:cs="Times New Roman"/>
+          <w:sz w:val="28"/>
+          <w:lang w:val="vi-VN"/>
+        </w:rPr>
+        <w:t>Tháp canh sẽ là đơn vị phòng thủ của lãnh địa và cung thủ là người duy nhất có thể lên đó và phòng thủ. Khi chế tạo được cung tên thì lính thợ sẽ cầm cung và trở thành cung thủ</w:t>
+      </w:r>
+      <w:r>
+        <w:rPr>
+          <w:rFonts w:ascii="Times New Roman" w:hAnsi="Times New Roman" w:cs="Times New Roman"/>
+          <w:sz w:val="28"/>
+          <w:lang w:val="vi-VN"/>
+        </w:rPr>
+        <w:t>. Mỗi tháp canh sẽ có 1 số lượng kị sĩ nhất định bảo vệ ở xung quanh.</w:t>
+      </w:r>
+      <w:r>
+        <w:rPr>
+          <w:rFonts w:ascii="Times New Roman" w:hAnsi="Times New Roman" w:cs="Times New Roman"/>
+          <w:sz w:val="28"/>
+          <w:lang w:val="vi-VN"/>
+        </w:rPr>
+        <w:t xml:space="preserve"> Mỗi tháp canh sẽ có phạm vi tấn công cố định. Khi nâng cấp thì có thể tăng phạm vi tấn công </w:t>
+      </w:r>
+    </w:p>
+    <w:p>
+      <w:pPr>
+        <w:jc w:val="center"/>
+        <w:rPr>
+          <w:rFonts w:ascii="Times New Roman" w:hAnsi="Times New Roman" w:cs="Times New Roman"/>
+          <w:sz w:val="28"/>
+          <w:lang w:val="vi-VN"/>
+        </w:rPr>
+      </w:pPr>
+      <w:r>
+        <w:rPr>
+          <w:rFonts w:ascii="Times New Roman" w:hAnsi="Times New Roman" w:cs="Times New Roman"/>
+          <w:sz w:val="28"/>
+          <w:lang w:val="vi-VN"/>
+        </w:rPr>
+        <w:drawing>
+          <wp:inline distT="0" distB="0" distL="0" distR="0" wp14:anchorId="7137C7BF" wp14:editId="0875597E">
+            <wp:extent cx="1171739" cy="1438476"/>
+            <wp:effectExtent l="0" t="0" r="9525" b="9525"/>
+            <wp:docPr id="4" name="Picture 4"/>
+            <wp:cNvGraphicFramePr>
+              <a:graphicFrameLocks xmlns:a="http://schemas.openxmlformats.org/drawingml/2006/main" noChangeAspect="1"/>
+            </wp:cNvGraphicFramePr>
+            <a:graphic xmlns:a="http://schemas.openxmlformats.org/drawingml/2006/main">
+              <a:graphicData uri="http://schemas.openxmlformats.org/drawingml/2006/picture">
+                <pic:pic xmlns:pic="http://schemas.openxmlformats.org/drawingml/2006/picture">
+                  <pic:nvPicPr>
+                    <pic:cNvPr id="1" name=""/>
+                    <pic:cNvPicPr/>
+                  </pic:nvPicPr>
+                  <pic:blipFill>
+                    <a:blip r:embed="rId6"/>
+                    <a:stretch>
+                      <a:fillRect/>
+                    </a:stretch>
+                  </pic:blipFill>
+                  <pic:spPr>
+                    <a:xfrm>
+                      <a:off x="0" y="0"/>
+                      <a:ext cx="1171739" cy="1438476"/>
+                    </a:xfrm>
+                    <a:prstGeom prst="rect">
+                      <a:avLst/>
+                    </a:prstGeom>
+                  </pic:spPr>
+                </pic:pic>
+              </a:graphicData>
+            </a:graphic>
+          </wp:inline>
+        </w:drawing>
+      </w:r>
+    </w:p>
+    <w:p>
+      <w:pPr>
+        <w:pStyle w:val="ListParagraph"/>
+        <w:numPr>
+          <w:ilvl w:val="0"/>
+          <w:numId w:val="4"/>
+        </w:numPr>
+        <w:rPr>
+          <w:rFonts w:ascii="Times New Roman" w:hAnsi="Times New Roman" w:cs="Times New Roman"/>
+          <w:sz w:val="28"/>
+          <w:lang w:val="vi-VN"/>
+        </w:rPr>
+      </w:pPr>
+      <w:r>
+        <w:rPr>
+          <w:rFonts w:ascii="Times New Roman" w:hAnsi="Times New Roman" w:cs="Times New Roman"/>
+          <w:sz w:val="28"/>
+          <w:lang w:val="vi-VN"/>
+        </w:rPr>
+        <w:t>Lò rèn sẽ là nơi chế tạo vũ khí, nơi ở của lính thợ và cũng là nơi để bạn tiêu tốn tài nguyên để triệu hồi lính thợ. Có thể nói đây là nơi đầu tiên cần phải xây dựng trong game.</w:t>
+      </w:r>
+    </w:p>
+    <w:p>
+      <w:pPr>
+        <w:pStyle w:val="ListParagraph"/>
+        <w:numPr>
+          <w:ilvl w:val="0"/>
+          <w:numId w:val="2"/>
+        </w:numPr>
+        <w:rPr>
+          <w:rFonts w:ascii="Times New Roman" w:hAnsi="Times New Roman" w:cs="Times New Roman"/>
+          <w:sz w:val="28"/>
+          <w:lang w:val="vi-VN"/>
+        </w:rPr>
+      </w:pPr>
+      <w:r>
+        <w:rPr>
+          <w:rFonts w:ascii="Times New Roman" w:hAnsi="Times New Roman" w:cs="Times New Roman"/>
+          <w:sz w:val="28"/>
+          <w:lang w:val="vi-VN"/>
+        </w:rPr>
+        <w:t>Các đơn vị thuộc hạ trong game:</w:t>
+      </w:r>
+    </w:p>
+    <w:p>
+      <w:pPr>
+        <w:pStyle w:val="ListParagraph"/>
+        <w:numPr>
+          <w:ilvl w:val="0"/>
+          <w:numId w:val="5"/>
+        </w:numPr>
+        <w:rPr>
+          <w:rFonts w:ascii="Times New Roman" w:hAnsi="Times New Roman" w:cs="Times New Roman"/>
+          <w:sz w:val="28"/>
+          <w:lang w:val="vi-VN"/>
+        </w:rPr>
+      </w:pPr>
+      <w:r>
+        <w:rPr>
+          <w:rFonts w:ascii="Times New Roman" w:hAnsi="Times New Roman" w:cs="Times New Roman"/>
+          <w:sz w:val="28"/>
+          <w:lang w:val="vi-VN"/>
+        </w:rPr>
+        <w:t>Lính thợ:</w:t>
+      </w:r>
+    </w:p>
+    <w:p>
+      <w:pPr>
+        <w:jc w:val="center"/>
+        <w:rPr>
+          <w:rFonts w:ascii="Times New Roman" w:hAnsi="Times New Roman" w:cs="Times New Roman"/>
+          <w:sz w:val="28"/>
+          <w:lang w:val="vi-VN"/>
+        </w:rPr>
+      </w:pPr>
+      <w:r>
+        <w:rPr>
+          <w:rFonts w:ascii="Times New Roman" w:hAnsi="Times New Roman" w:cs="Times New Roman"/>
+          <w:sz w:val="28"/>
+          <w:lang w:val="vi-VN"/>
+        </w:rPr>
+        <w:drawing>
+          <wp:inline distT="0" distB="0" distL="0" distR="0" wp14:anchorId="44DEA3FF" wp14:editId="15D70499">
+            <wp:extent cx="581106" cy="514422"/>
+            <wp:effectExtent l="0" t="0" r="9525" b="0"/>
+            <wp:docPr id="1" name="Picture 1"/>
+            <wp:cNvGraphicFramePr>
+              <a:graphicFrameLocks xmlns:a="http://schemas.openxmlformats.org/drawingml/2006/main" noChangeAspect="1"/>
+            </wp:cNvGraphicFramePr>
+            <a:graphic xmlns:a="http://schemas.openxmlformats.org/drawingml/2006/main">
+              <a:graphicData uri="http://schemas.openxmlformats.org/drawingml/2006/picture">
+                <pic:pic xmlns:pic="http://schemas.openxmlformats.org/drawingml/2006/picture">
+                  <pic:nvPicPr>
+                    <pic:cNvPr id="1" name=""/>
+                    <pic:cNvPicPr/>
+                  </pic:nvPicPr>
+                  <pic:blipFill>
+                    <a:blip r:embed="rId7"/>
+                    <a:stretch>
+                      <a:fillRect/>
+                    </a:stretch>
+                  </pic:blipFill>
+                  <pic:spPr>
+                    <a:xfrm>
+                      <a:off x="0" y="0"/>
+                      <a:ext cx="581106" cy="514422"/>
+                    </a:xfrm>
+                    <a:prstGeom prst="rect">
+                      <a:avLst/>
+                    </a:prstGeom>
+                  </pic:spPr>
+                </pic:pic>
+              </a:graphicData>
+            </a:graphic>
+          </wp:inline>
+        </w:drawing>
+      </w:r>
+    </w:p>
+    <w:p>
+      <w:pPr>
+        <w:pStyle w:val="ListParagraph"/>
+        <w:numPr>
+          <w:ilvl w:val="0"/>
+          <w:numId w:val="5"/>
+        </w:numPr>
+        <w:rPr>
+          <w:rFonts w:ascii="Times New Roman" w:hAnsi="Times New Roman" w:cs="Times New Roman"/>
+          <w:sz w:val="28"/>
+          <w:lang w:val="vi-VN"/>
+        </w:rPr>
+      </w:pPr>
+      <w:r>
+        <w:rPr>
+          <w:rFonts w:ascii="Times New Roman" w:hAnsi="Times New Roman" w:cs="Times New Roman"/>
+          <w:sz w:val="28"/>
+          <w:lang w:val="vi-VN"/>
+        </w:rPr>
+        <w:t>Cung thủ:</w:t>
+      </w:r>
+    </w:p>
+    <w:p>
+      <w:pPr>
+        <w:jc w:val="center"/>
+        <w:rPr>
+          <w:rFonts w:ascii="Times New Roman" w:hAnsi="Times New Roman" w:cs="Times New Roman"/>
+          <w:sz w:val="28"/>
+          <w:lang w:val="vi-VN"/>
+        </w:rPr>
+      </w:pPr>
+      <w:r>
+        <w:rPr>
+          <w:rFonts w:ascii="Times New Roman" w:hAnsi="Times New Roman" w:cs="Times New Roman"/>
+          <w:sz w:val="28"/>
+          <w:lang w:val="vi-VN"/>
+        </w:rPr>
+        <w:drawing>
+          <wp:inline distT="0" distB="0" distL="0" distR="0" wp14:anchorId="2F90AD9B" wp14:editId="55BBB0A8">
+            <wp:extent cx="562053" cy="638264"/>
+            <wp:effectExtent l="0" t="0" r="9525" b="9525"/>
+            <wp:docPr id="3" name="Picture 3"/>
+            <wp:cNvGraphicFramePr>
+              <a:graphicFrameLocks xmlns:a="http://schemas.openxmlformats.org/drawingml/2006/main" noChangeAspect="1"/>
+            </wp:cNvGraphicFramePr>
+            <a:graphic xmlns:a="http://schemas.openxmlformats.org/drawingml/2006/main">
+              <a:graphicData uri="http://schemas.openxmlformats.org/drawingml/2006/picture">
+                <pic:pic xmlns:pic="http://schemas.openxmlformats.org/drawingml/2006/picture">
+                  <pic:nvPicPr>
+                    <pic:cNvPr id="1" name=""/>
+                    <pic:cNvPicPr/>
+                  </pic:nvPicPr>
+                  <pic:blipFill>
+                    <a:blip r:embed="rId8"/>
+                    <a:stretch>
+                      <a:fillRect/>
+                    </a:stretch>
+                  </pic:blipFill>
+                  <pic:spPr>
+                    <a:xfrm>
+                      <a:off x="0" y="0"/>
+                      <a:ext cx="562053" cy="638264"/>
+                    </a:xfrm>
+                    <a:prstGeom prst="rect">
+                      <a:avLst/>
+                    </a:prstGeom>
+                  </pic:spPr>
+                </pic:pic>
+              </a:graphicData>
+            </a:graphic>
+          </wp:inline>
+        </w:drawing>
+      </w:r>
+    </w:p>
+    <w:p>
+      <w:pPr>
+        <w:pStyle w:val="ListParagraph"/>
+        <w:numPr>
+          <w:ilvl w:val="0"/>
+          <w:numId w:val="5"/>
+        </w:numPr>
+        <w:rPr>
+          <w:rFonts w:ascii="Times New Roman" w:hAnsi="Times New Roman" w:cs="Times New Roman"/>
+          <w:sz w:val="28"/>
+          <w:lang w:val="vi-VN"/>
+        </w:rPr>
+      </w:pPr>
+      <w:r>
+        <w:rPr>
+          <w:rFonts w:ascii="Times New Roman" w:hAnsi="Times New Roman" w:cs="Times New Roman"/>
+          <w:sz w:val="28"/>
+          <w:lang w:val="vi-VN"/>
+        </w:rPr>
+        <w:t>Kị sĩ:</w:t>
+      </w:r>
+    </w:p>
+    <w:p>
+      <w:pPr>
+        <w:pStyle w:val="ListParagraph"/>
+        <w:ind w:left="1440"/>
+        <w:jc w:val="center"/>
+        <w:rPr>
+          <w:rFonts w:ascii="Times New Roman" w:hAnsi="Times New Roman" w:cs="Times New Roman"/>
+          <w:sz w:val="28"/>
+          <w:lang w:val="vi-VN"/>
+        </w:rPr>
+      </w:pPr>
+      <w:r>
+        <w:rPr>
+          <w:rFonts w:ascii="Times New Roman" w:hAnsi="Times New Roman" w:cs="Times New Roman"/>
+          <w:sz w:val="28"/>
+          <w:lang w:val="vi-VN"/>
+        </w:rPr>
+        <w:drawing>
+          <wp:inline distT="0" distB="0" distL="0" distR="0" wp14:anchorId="6545437D" wp14:editId="7A08E24B">
+            <wp:extent cx="523948" cy="609685"/>
+            <wp:effectExtent l="0" t="0" r="9525" b="0"/>
+            <wp:docPr id="2" name="Picture 2"/>
+            <wp:cNvGraphicFramePr>
+              <a:graphicFrameLocks xmlns:a="http://schemas.openxmlformats.org/drawingml/2006/main" noChangeAspect="1"/>
+            </wp:cNvGraphicFramePr>
+            <a:graphic xmlns:a="http://schemas.openxmlformats.org/drawingml/2006/main">
+              <a:graphicData uri="http://schemas.openxmlformats.org/drawingml/2006/picture">
+                <pic:pic xmlns:pic="http://schemas.openxmlformats.org/drawingml/2006/picture">
+                  <pic:nvPicPr>
+                    <pic:cNvPr id="1" name=""/>
+                    <pic:cNvPicPr/>
+                  </pic:nvPicPr>
+                  <pic:blipFill>
+                    <a:blip r:embed="rId9"/>
+                    <a:stretch>
+                      <a:fillRect/>
+                    </a:stretch>
+                  </pic:blipFill>
+                  <pic:spPr>
+                    <a:xfrm>
+                      <a:off x="0" y="0"/>
+                      <a:ext cx="523948" cy="609685"/>
+                    </a:xfrm>
+                    <a:prstGeom prst="rect">
+                      <a:avLst/>
+                    </a:prstGeom>
+                  </pic:spPr>
+                </pic:pic>
+              </a:graphicData>
+            </a:graphic>
+          </wp:inline>
+        </w:drawing>
+      </w:r>
+    </w:p>
+    <w:p>
+      <w:pPr>
+        <w:rPr>
+          <w:rFonts w:ascii="Times New Roman" w:hAnsi="Times New Roman" w:cs="Times New Roman"/>
+          <w:sz w:val="28"/>
+          <w:lang w:val="vi-VN"/>
+        </w:rPr>
+      </w:pPr>
+      <w:r>
+        <w:rPr>
+          <w:rFonts w:ascii="Times New Roman" w:hAnsi="Times New Roman" w:cs="Times New Roman"/>
+          <w:sz w:val="28"/>
+          <w:lang w:val="vi-VN"/>
+        </w:rPr>
+        <w:t>Những thứ đã sử dụng trong game:</w:t>
+      </w:r>
+    </w:p>
     <w:p>
       <w:pPr>
         <w:pStyle w:val="ListParagraph"/>
@@ -48,10 +779,52 @@
     </w:p>
     <w:p>
       <w:pPr>
+        <w:rPr>
+          <w:rFonts w:ascii="Times New Roman" w:hAnsi="Times New Roman" w:cs="Times New Roman"/>
+          <w:sz w:val="28"/>
+          <w:lang w:val="vi-VN"/>
+        </w:rPr>
+      </w:pPr>
+    </w:p>
+    <w:p>
+      <w:pPr>
+        <w:rPr>
+          <w:rFonts w:ascii="Times New Roman" w:hAnsi="Times New Roman" w:cs="Times New Roman"/>
+          <w:sz w:val="28"/>
+          <w:lang w:val="vi-VN"/>
+        </w:rPr>
+      </w:pPr>
+      <w:r>
+        <w:rPr>
+          <w:rFonts w:ascii="Times New Roman" w:hAnsi="Times New Roman" w:cs="Times New Roman"/>
+          <w:sz w:val="28"/>
+          <w:lang w:val="vi-VN"/>
+        </w:rPr>
+        <w:t xml:space="preserve">Những </w:t>
+      </w:r>
+      <w:r>
+        <w:rPr>
+          <w:rFonts w:ascii="Times New Roman" w:hAnsi="Times New Roman" w:cs="Times New Roman"/>
+          <w:sz w:val="28"/>
+          <w:lang w:val="vi-VN"/>
+        </w:rPr>
+        <w:t xml:space="preserve">chức năng </w:t>
+      </w:r>
+      <w:r>
+        <w:rPr>
+          <w:rFonts w:ascii="Times New Roman" w:hAnsi="Times New Roman" w:cs="Times New Roman"/>
+          <w:sz w:val="28"/>
+          <w:lang w:val="vi-VN"/>
+        </w:rPr>
+        <w:t>chính:</w:t>
+      </w:r>
+    </w:p>
+    <w:p>
+      <w:pPr>
         <w:pStyle w:val="ListParagraph"/>
         <w:numPr>
           <w:ilvl w:val="0"/>
-          <w:numId w:val="1"/>
+          <w:numId w:val="5"/>
         </w:numPr>
         <w:rPr>
           <w:rFonts w:ascii="Times New Roman" w:hAnsi="Times New Roman" w:cs="Times New Roman"/>
@@ -59,8 +832,46 @@
           <w:lang w:val="vi-VN"/>
         </w:rPr>
       </w:pPr>
+      <w:r>
+        <w:rPr>
+          <w:rFonts w:ascii="Times New Roman" w:hAnsi="Times New Roman" w:cs="Times New Roman"/>
+          <w:sz w:val="28"/>
+          <w:lang w:val="vi-VN"/>
+        </w:rPr>
+        <w:t xml:space="preserve">Map Editor Ingame: Người chơi có thể sử dụng tile để thiết kế map cho mình </w:t>
+      </w:r>
+    </w:p>
+    <w:p>
+      <w:pPr>
+        <w:pStyle w:val="ListParagraph"/>
+        <w:numPr>
+          <w:ilvl w:val="0"/>
+          <w:numId w:val="5"/>
+        </w:numPr>
+        <w:rPr>
+          <w:rFonts w:ascii="Times New Roman" w:hAnsi="Times New Roman" w:cs="Times New Roman"/>
+          <w:sz w:val="28"/>
+          <w:lang w:val="vi-VN"/>
+        </w:rPr>
+      </w:pPr>
+      <w:r>
+        <w:rPr>
+          <w:rFonts w:ascii="Times New Roman" w:hAnsi="Times New Roman" w:cs="Times New Roman"/>
+          <w:sz w:val="28"/>
+          <w:lang w:val="vi-VN"/>
+        </w:rPr>
+        <w:t>Hệ thống nâng c</w:t>
+      </w:r>
       <w:bookmarkStart w:id="0" w:name="_GoBack"/>
       <w:bookmarkEnd w:id="0"/>
+      <w:r>
+        <w:rPr>
+          <w:rFonts w:ascii="Times New Roman" w:hAnsi="Times New Roman" w:cs="Times New Roman"/>
+          <w:sz w:val="28"/>
+          <w:lang w:val="vi-VN"/>
+        </w:rPr>
+        <w:t>ấp kiến trúc</w:t>
+      </w:r>
     </w:p>
     <w:sectPr>
       <w:pgSz w:w="12240" w:h="15840"/>
@@ -75,6 +886,119 @@
 <file path=word/numbering.xml><?xml version="1.0" encoding="utf-8"?>
 <w:numbering xmlns:wpc="http://schemas.microsoft.com/office/word/2010/wordprocessingCanvas" xmlns:mc="http://schemas.openxmlformats.org/markup-compatibility/2006" xmlns:o="urn:schemas-microsoft-com:office:office" xmlns:r="http://schemas.openxmlformats.org/officeDocument/2006/relationships" xmlns:m="http://schemas.openxmlformats.org/officeDocument/2006/math" xmlns:v="urn:schemas-microsoft-com:vml" xmlns:wp14="http://schemas.microsoft.com/office/word/2010/wordprocessingDrawing" xmlns:wp="http://schemas.openxmlformats.org/drawingml/2006/wordprocessingDrawing" xmlns:w10="urn:schemas-microsoft-com:office:word" xmlns:w="http://schemas.openxmlformats.org/wordprocessingml/2006/main" xmlns:w14="http://schemas.microsoft.com/office/word/2010/wordml" xmlns:w15="http://schemas.microsoft.com/office/word/2012/wordml" xmlns:wpg="http://schemas.microsoft.com/office/word/2010/wordprocessingGroup" xmlns:wpi="http://schemas.microsoft.com/office/word/2010/wordprocessingInk" xmlns:wne="http://schemas.microsoft.com/office/word/2006/wordml" xmlns:wps="http://schemas.microsoft.com/office/word/2010/wordprocessingShape" mc:Ignorable="w14 w15 wp14">
   <w:abstractNum w:abstractNumId="0">
+    <w:nsid w:val="06D82F64"/>
+    <w:multiLevelType w:val="hybridMultilevel"/>
+    <w:tmpl w:val="CB3A0376"/>
+    <w:lvl w:ilvl="0" w:tplc="04090001">
+      <w:start w:val="1"/>
+      <w:numFmt w:val="bullet"/>
+      <w:lvlText w:val=""/>
+      <w:lvlJc w:val="left"/>
+      <w:pPr>
+        <w:ind w:left="1440" w:hanging="360"/>
+      </w:pPr>
+      <w:rPr>
+        <w:rFonts w:ascii="Symbol" w:hAnsi="Symbol" w:hint="default"/>
+      </w:rPr>
+    </w:lvl>
+    <w:lvl w:ilvl="1" w:tplc="04090003" w:tentative="1">
+      <w:start w:val="1"/>
+      <w:numFmt w:val="bullet"/>
+      <w:lvlText w:val="o"/>
+      <w:lvlJc w:val="left"/>
+      <w:pPr>
+        <w:ind w:left="2160" w:hanging="360"/>
+      </w:pPr>
+      <w:rPr>
+        <w:rFonts w:ascii="Courier New" w:hAnsi="Courier New" w:cs="Courier New" w:hint="default"/>
+      </w:rPr>
+    </w:lvl>
+    <w:lvl w:ilvl="2" w:tplc="04090005" w:tentative="1">
+      <w:start w:val="1"/>
+      <w:numFmt w:val="bullet"/>
+      <w:lvlText w:val=""/>
+      <w:lvlJc w:val="left"/>
+      <w:pPr>
+        <w:ind w:left="2880" w:hanging="360"/>
+      </w:pPr>
+      <w:rPr>
+        <w:rFonts w:ascii="Wingdings" w:hAnsi="Wingdings" w:hint="default"/>
+      </w:rPr>
+    </w:lvl>
+    <w:lvl w:ilvl="3" w:tplc="04090001" w:tentative="1">
+      <w:start w:val="1"/>
+      <w:numFmt w:val="bullet"/>
+      <w:lvlText w:val=""/>
+      <w:lvlJc w:val="left"/>
+      <w:pPr>
+        <w:ind w:left="3600" w:hanging="360"/>
+      </w:pPr>
+      <w:rPr>
+        <w:rFonts w:ascii="Symbol" w:hAnsi="Symbol" w:hint="default"/>
+      </w:rPr>
+    </w:lvl>
+    <w:lvl w:ilvl="4" w:tplc="04090003" w:tentative="1">
+      <w:start w:val="1"/>
+      <w:numFmt w:val="bullet"/>
+      <w:lvlText w:val="o"/>
+      <w:lvlJc w:val="left"/>
+      <w:pPr>
+        <w:ind w:left="4320" w:hanging="360"/>
+      </w:pPr>
+      <w:rPr>
+        <w:rFonts w:ascii="Courier New" w:hAnsi="Courier New" w:cs="Courier New" w:hint="default"/>
+      </w:rPr>
+    </w:lvl>
+    <w:lvl w:ilvl="5" w:tplc="04090005" w:tentative="1">
+      <w:start w:val="1"/>
+      <w:numFmt w:val="bullet"/>
+      <w:lvlText w:val=""/>
+      <w:lvlJc w:val="left"/>
+      <w:pPr>
+        <w:ind w:left="5040" w:hanging="360"/>
+      </w:pPr>
+      <w:rPr>
+        <w:rFonts w:ascii="Wingdings" w:hAnsi="Wingdings" w:hint="default"/>
+      </w:rPr>
+    </w:lvl>
+    <w:lvl w:ilvl="6" w:tplc="04090001" w:tentative="1">
+      <w:start w:val="1"/>
+      <w:numFmt w:val="bullet"/>
+      <w:lvlText w:val=""/>
+      <w:lvlJc w:val="left"/>
+      <w:pPr>
+        <w:ind w:left="5760" w:hanging="360"/>
+      </w:pPr>
+      <w:rPr>
+        <w:rFonts w:ascii="Symbol" w:hAnsi="Symbol" w:hint="default"/>
+      </w:rPr>
+    </w:lvl>
+    <w:lvl w:ilvl="7" w:tplc="04090003" w:tentative="1">
+      <w:start w:val="1"/>
+      <w:numFmt w:val="bullet"/>
+      <w:lvlText w:val="o"/>
+      <w:lvlJc w:val="left"/>
+      <w:pPr>
+        <w:ind w:left="6480" w:hanging="360"/>
+      </w:pPr>
+      <w:rPr>
+        <w:rFonts w:ascii="Courier New" w:hAnsi="Courier New" w:cs="Courier New" w:hint="default"/>
+      </w:rPr>
+    </w:lvl>
+    <w:lvl w:ilvl="8" w:tplc="04090005" w:tentative="1">
+      <w:start w:val="1"/>
+      <w:numFmt w:val="bullet"/>
+      <w:lvlText w:val=""/>
+      <w:lvlJc w:val="left"/>
+      <w:pPr>
+        <w:ind w:left="7200" w:hanging="360"/>
+      </w:pPr>
+      <w:rPr>
+        <w:rFonts w:ascii="Wingdings" w:hAnsi="Wingdings" w:hint="default"/>
+      </w:rPr>
+    </w:lvl>
+  </w:abstractNum>
+  <w:abstractNum w:abstractNumId="1">
     <w:nsid w:val="165E42C4"/>
     <w:multiLevelType w:val="hybridMultilevel"/>
     <w:tmpl w:val="64A2F55C"/>
@@ -186,7 +1110,357 @@
       </w:rPr>
     </w:lvl>
   </w:abstractNum>
+  <w:abstractNum w:abstractNumId="2">
+    <w:nsid w:val="34CC260E"/>
+    <w:multiLevelType w:val="hybridMultilevel"/>
+    <w:tmpl w:val="B5C841D0"/>
+    <w:lvl w:ilvl="0" w:tplc="47E80428">
+      <w:numFmt w:val="bullet"/>
+      <w:lvlText w:val="-"/>
+      <w:lvlJc w:val="left"/>
+      <w:pPr>
+        <w:ind w:left="720" w:hanging="360"/>
+      </w:pPr>
+      <w:rPr>
+        <w:rFonts w:ascii="Times New Roman" w:eastAsiaTheme="minorHAnsi" w:hAnsi="Times New Roman" w:cs="Times New Roman" w:hint="default"/>
+      </w:rPr>
+    </w:lvl>
+    <w:lvl w:ilvl="1" w:tplc="04090003" w:tentative="1">
+      <w:start w:val="1"/>
+      <w:numFmt w:val="bullet"/>
+      <w:lvlText w:val="o"/>
+      <w:lvlJc w:val="left"/>
+      <w:pPr>
+        <w:ind w:left="1440" w:hanging="360"/>
+      </w:pPr>
+      <w:rPr>
+        <w:rFonts w:ascii="Courier New" w:hAnsi="Courier New" w:cs="Courier New" w:hint="default"/>
+      </w:rPr>
+    </w:lvl>
+    <w:lvl w:ilvl="2" w:tplc="04090005" w:tentative="1">
+      <w:start w:val="1"/>
+      <w:numFmt w:val="bullet"/>
+      <w:lvlText w:val=""/>
+      <w:lvlJc w:val="left"/>
+      <w:pPr>
+        <w:ind w:left="2160" w:hanging="360"/>
+      </w:pPr>
+      <w:rPr>
+        <w:rFonts w:ascii="Wingdings" w:hAnsi="Wingdings" w:hint="default"/>
+      </w:rPr>
+    </w:lvl>
+    <w:lvl w:ilvl="3" w:tplc="04090001" w:tentative="1">
+      <w:start w:val="1"/>
+      <w:numFmt w:val="bullet"/>
+      <w:lvlText w:val=""/>
+      <w:lvlJc w:val="left"/>
+      <w:pPr>
+        <w:ind w:left="2880" w:hanging="360"/>
+      </w:pPr>
+      <w:rPr>
+        <w:rFonts w:ascii="Symbol" w:hAnsi="Symbol" w:hint="default"/>
+      </w:rPr>
+    </w:lvl>
+    <w:lvl w:ilvl="4" w:tplc="04090003" w:tentative="1">
+      <w:start w:val="1"/>
+      <w:numFmt w:val="bullet"/>
+      <w:lvlText w:val="o"/>
+      <w:lvlJc w:val="left"/>
+      <w:pPr>
+        <w:ind w:left="3600" w:hanging="360"/>
+      </w:pPr>
+      <w:rPr>
+        <w:rFonts w:ascii="Courier New" w:hAnsi="Courier New" w:cs="Courier New" w:hint="default"/>
+      </w:rPr>
+    </w:lvl>
+    <w:lvl w:ilvl="5" w:tplc="04090005" w:tentative="1">
+      <w:start w:val="1"/>
+      <w:numFmt w:val="bullet"/>
+      <w:lvlText w:val=""/>
+      <w:lvlJc w:val="left"/>
+      <w:pPr>
+        <w:ind w:left="4320" w:hanging="360"/>
+      </w:pPr>
+      <w:rPr>
+        <w:rFonts w:ascii="Wingdings" w:hAnsi="Wingdings" w:hint="default"/>
+      </w:rPr>
+    </w:lvl>
+    <w:lvl w:ilvl="6" w:tplc="04090001" w:tentative="1">
+      <w:start w:val="1"/>
+      <w:numFmt w:val="bullet"/>
+      <w:lvlText w:val=""/>
+      <w:lvlJc w:val="left"/>
+      <w:pPr>
+        <w:ind w:left="5040" w:hanging="360"/>
+      </w:pPr>
+      <w:rPr>
+        <w:rFonts w:ascii="Symbol" w:hAnsi="Symbol" w:hint="default"/>
+      </w:rPr>
+    </w:lvl>
+    <w:lvl w:ilvl="7" w:tplc="04090003" w:tentative="1">
+      <w:start w:val="1"/>
+      <w:numFmt w:val="bullet"/>
+      <w:lvlText w:val="o"/>
+      <w:lvlJc w:val="left"/>
+      <w:pPr>
+        <w:ind w:left="5760" w:hanging="360"/>
+      </w:pPr>
+      <w:rPr>
+        <w:rFonts w:ascii="Courier New" w:hAnsi="Courier New" w:cs="Courier New" w:hint="default"/>
+      </w:rPr>
+    </w:lvl>
+    <w:lvl w:ilvl="8" w:tplc="04090005" w:tentative="1">
+      <w:start w:val="1"/>
+      <w:numFmt w:val="bullet"/>
+      <w:lvlText w:val=""/>
+      <w:lvlJc w:val="left"/>
+      <w:pPr>
+        <w:ind w:left="6480" w:hanging="360"/>
+      </w:pPr>
+      <w:rPr>
+        <w:rFonts w:ascii="Wingdings" w:hAnsi="Wingdings" w:hint="default"/>
+      </w:rPr>
+    </w:lvl>
+  </w:abstractNum>
+  <w:abstractNum w:abstractNumId="3">
+    <w:nsid w:val="354552A6"/>
+    <w:multiLevelType w:val="hybridMultilevel"/>
+    <w:tmpl w:val="C9020C54"/>
+    <w:lvl w:ilvl="0" w:tplc="04090001">
+      <w:start w:val="1"/>
+      <w:numFmt w:val="bullet"/>
+      <w:lvlText w:val=""/>
+      <w:lvlJc w:val="left"/>
+      <w:pPr>
+        <w:ind w:left="1440" w:hanging="360"/>
+      </w:pPr>
+      <w:rPr>
+        <w:rFonts w:ascii="Symbol" w:hAnsi="Symbol" w:hint="default"/>
+      </w:rPr>
+    </w:lvl>
+    <w:lvl w:ilvl="1" w:tplc="04090003" w:tentative="1">
+      <w:start w:val="1"/>
+      <w:numFmt w:val="bullet"/>
+      <w:lvlText w:val="o"/>
+      <w:lvlJc w:val="left"/>
+      <w:pPr>
+        <w:ind w:left="2160" w:hanging="360"/>
+      </w:pPr>
+      <w:rPr>
+        <w:rFonts w:ascii="Courier New" w:hAnsi="Courier New" w:cs="Courier New" w:hint="default"/>
+      </w:rPr>
+    </w:lvl>
+    <w:lvl w:ilvl="2" w:tplc="04090005" w:tentative="1">
+      <w:start w:val="1"/>
+      <w:numFmt w:val="bullet"/>
+      <w:lvlText w:val=""/>
+      <w:lvlJc w:val="left"/>
+      <w:pPr>
+        <w:ind w:left="2880" w:hanging="360"/>
+      </w:pPr>
+      <w:rPr>
+        <w:rFonts w:ascii="Wingdings" w:hAnsi="Wingdings" w:hint="default"/>
+      </w:rPr>
+    </w:lvl>
+    <w:lvl w:ilvl="3" w:tplc="04090001" w:tentative="1">
+      <w:start w:val="1"/>
+      <w:numFmt w:val="bullet"/>
+      <w:lvlText w:val=""/>
+      <w:lvlJc w:val="left"/>
+      <w:pPr>
+        <w:ind w:left="3600" w:hanging="360"/>
+      </w:pPr>
+      <w:rPr>
+        <w:rFonts w:ascii="Symbol" w:hAnsi="Symbol" w:hint="default"/>
+      </w:rPr>
+    </w:lvl>
+    <w:lvl w:ilvl="4" w:tplc="04090003" w:tentative="1">
+      <w:start w:val="1"/>
+      <w:numFmt w:val="bullet"/>
+      <w:lvlText w:val="o"/>
+      <w:lvlJc w:val="left"/>
+      <w:pPr>
+        <w:ind w:left="4320" w:hanging="360"/>
+      </w:pPr>
+      <w:rPr>
+        <w:rFonts w:ascii="Courier New" w:hAnsi="Courier New" w:cs="Courier New" w:hint="default"/>
+      </w:rPr>
+    </w:lvl>
+    <w:lvl w:ilvl="5" w:tplc="04090005" w:tentative="1">
+      <w:start w:val="1"/>
+      <w:numFmt w:val="bullet"/>
+      <w:lvlText w:val=""/>
+      <w:lvlJc w:val="left"/>
+      <w:pPr>
+        <w:ind w:left="5040" w:hanging="360"/>
+      </w:pPr>
+      <w:rPr>
+        <w:rFonts w:ascii="Wingdings" w:hAnsi="Wingdings" w:hint="default"/>
+      </w:rPr>
+    </w:lvl>
+    <w:lvl w:ilvl="6" w:tplc="04090001" w:tentative="1">
+      <w:start w:val="1"/>
+      <w:numFmt w:val="bullet"/>
+      <w:lvlText w:val=""/>
+      <w:lvlJc w:val="left"/>
+      <w:pPr>
+        <w:ind w:left="5760" w:hanging="360"/>
+      </w:pPr>
+      <w:rPr>
+        <w:rFonts w:ascii="Symbol" w:hAnsi="Symbol" w:hint="default"/>
+      </w:rPr>
+    </w:lvl>
+    <w:lvl w:ilvl="7" w:tplc="04090003" w:tentative="1">
+      <w:start w:val="1"/>
+      <w:numFmt w:val="bullet"/>
+      <w:lvlText w:val="o"/>
+      <w:lvlJc w:val="left"/>
+      <w:pPr>
+        <w:ind w:left="6480" w:hanging="360"/>
+      </w:pPr>
+      <w:rPr>
+        <w:rFonts w:ascii="Courier New" w:hAnsi="Courier New" w:cs="Courier New" w:hint="default"/>
+      </w:rPr>
+    </w:lvl>
+    <w:lvl w:ilvl="8" w:tplc="04090005" w:tentative="1">
+      <w:start w:val="1"/>
+      <w:numFmt w:val="bullet"/>
+      <w:lvlText w:val=""/>
+      <w:lvlJc w:val="left"/>
+      <w:pPr>
+        <w:ind w:left="7200" w:hanging="360"/>
+      </w:pPr>
+      <w:rPr>
+        <w:rFonts w:ascii="Wingdings" w:hAnsi="Wingdings" w:hint="default"/>
+      </w:rPr>
+    </w:lvl>
+  </w:abstractNum>
+  <w:abstractNum w:abstractNumId="4">
+    <w:nsid w:val="53BE79AD"/>
+    <w:multiLevelType w:val="hybridMultilevel"/>
+    <w:tmpl w:val="85DEFE72"/>
+    <w:lvl w:ilvl="0" w:tplc="04090003">
+      <w:start w:val="1"/>
+      <w:numFmt w:val="bullet"/>
+      <w:lvlText w:val="o"/>
+      <w:lvlJc w:val="left"/>
+      <w:pPr>
+        <w:ind w:left="720" w:hanging="360"/>
+      </w:pPr>
+      <w:rPr>
+        <w:rFonts w:ascii="Courier New" w:hAnsi="Courier New" w:cs="Courier New" w:hint="default"/>
+      </w:rPr>
+    </w:lvl>
+    <w:lvl w:ilvl="1" w:tplc="04090003" w:tentative="1">
+      <w:start w:val="1"/>
+      <w:numFmt w:val="bullet"/>
+      <w:lvlText w:val="o"/>
+      <w:lvlJc w:val="left"/>
+      <w:pPr>
+        <w:ind w:left="1440" w:hanging="360"/>
+      </w:pPr>
+      <w:rPr>
+        <w:rFonts w:ascii="Courier New" w:hAnsi="Courier New" w:cs="Courier New" w:hint="default"/>
+      </w:rPr>
+    </w:lvl>
+    <w:lvl w:ilvl="2" w:tplc="04090005" w:tentative="1">
+      <w:start w:val="1"/>
+      <w:numFmt w:val="bullet"/>
+      <w:lvlText w:val=""/>
+      <w:lvlJc w:val="left"/>
+      <w:pPr>
+        <w:ind w:left="2160" w:hanging="360"/>
+      </w:pPr>
+      <w:rPr>
+        <w:rFonts w:ascii="Wingdings" w:hAnsi="Wingdings" w:hint="default"/>
+      </w:rPr>
+    </w:lvl>
+    <w:lvl w:ilvl="3" w:tplc="04090001" w:tentative="1">
+      <w:start w:val="1"/>
+      <w:numFmt w:val="bullet"/>
+      <w:lvlText w:val=""/>
+      <w:lvlJc w:val="left"/>
+      <w:pPr>
+        <w:ind w:left="2880" w:hanging="360"/>
+      </w:pPr>
+      <w:rPr>
+        <w:rFonts w:ascii="Symbol" w:hAnsi="Symbol" w:hint="default"/>
+      </w:rPr>
+    </w:lvl>
+    <w:lvl w:ilvl="4" w:tplc="04090003" w:tentative="1">
+      <w:start w:val="1"/>
+      <w:numFmt w:val="bullet"/>
+      <w:lvlText w:val="o"/>
+      <w:lvlJc w:val="left"/>
+      <w:pPr>
+        <w:ind w:left="3600" w:hanging="360"/>
+      </w:pPr>
+      <w:rPr>
+        <w:rFonts w:ascii="Courier New" w:hAnsi="Courier New" w:cs="Courier New" w:hint="default"/>
+      </w:rPr>
+    </w:lvl>
+    <w:lvl w:ilvl="5" w:tplc="04090005" w:tentative="1">
+      <w:start w:val="1"/>
+      <w:numFmt w:val="bullet"/>
+      <w:lvlText w:val=""/>
+      <w:lvlJc w:val="left"/>
+      <w:pPr>
+        <w:ind w:left="4320" w:hanging="360"/>
+      </w:pPr>
+      <w:rPr>
+        <w:rFonts w:ascii="Wingdings" w:hAnsi="Wingdings" w:hint="default"/>
+      </w:rPr>
+    </w:lvl>
+    <w:lvl w:ilvl="6" w:tplc="04090001" w:tentative="1">
+      <w:start w:val="1"/>
+      <w:numFmt w:val="bullet"/>
+      <w:lvlText w:val=""/>
+      <w:lvlJc w:val="left"/>
+      <w:pPr>
+        <w:ind w:left="5040" w:hanging="360"/>
+      </w:pPr>
+      <w:rPr>
+        <w:rFonts w:ascii="Symbol" w:hAnsi="Symbol" w:hint="default"/>
+      </w:rPr>
+    </w:lvl>
+    <w:lvl w:ilvl="7" w:tplc="04090003" w:tentative="1">
+      <w:start w:val="1"/>
+      <w:numFmt w:val="bullet"/>
+      <w:lvlText w:val="o"/>
+      <w:lvlJc w:val="left"/>
+      <w:pPr>
+        <w:ind w:left="5760" w:hanging="360"/>
+      </w:pPr>
+      <w:rPr>
+        <w:rFonts w:ascii="Courier New" w:hAnsi="Courier New" w:cs="Courier New" w:hint="default"/>
+      </w:rPr>
+    </w:lvl>
+    <w:lvl w:ilvl="8" w:tplc="04090005" w:tentative="1">
+      <w:start w:val="1"/>
+      <w:numFmt w:val="bullet"/>
+      <w:lvlText w:val=""/>
+      <w:lvlJc w:val="left"/>
+      <w:pPr>
+        <w:ind w:left="6480" w:hanging="360"/>
+      </w:pPr>
+      <w:rPr>
+        <w:rFonts w:ascii="Wingdings" w:hAnsi="Wingdings" w:hint="default"/>
+      </w:rPr>
+    </w:lvl>
+  </w:abstractNum>
   <w:num w:numId="1">
+    <w:abstractNumId w:val="1"/>
+  </w:num>
+  <w:num w:numId="2">
+    <w:abstractNumId w:val="2"/>
+  </w:num>
+  <w:num w:numId="3">
+    <w:abstractNumId w:val="4"/>
+  </w:num>
+  <w:num w:numId="4">
+    <w:abstractNumId w:val="3"/>
+  </w:num>
+  <w:num w:numId="5">
     <w:abstractNumId w:val="0"/>
   </w:num>
 </w:numbering>

</xml_diff>

<commit_message>
feat: Grid overlay tilemap & Mouse indicator
</commit_message>
<xml_diff>
--- a/Document.docx
+++ b/Document.docx
@@ -273,8 +273,8 @@
       <w:r>
         <w:rPr>
           <w:rFonts w:ascii="Times New Roman" w:hAnsi="Times New Roman" w:cs="Times New Roman"/>
-          <w:sz w:val="28"/>
-          <w:lang w:val="vi-VN"/>
+          <w:noProof/>
+          <w:sz w:val="28"/>
         </w:rPr>
         <w:drawing>
           <wp:inline distT="0" distB="0" distL="0" distR="0" wp14:anchorId="34C298D2" wp14:editId="3A0FD7F5">
@@ -408,8 +408,8 @@
       <w:r>
         <w:rPr>
           <w:rFonts w:ascii="Times New Roman" w:hAnsi="Times New Roman" w:cs="Times New Roman"/>
-          <w:sz w:val="28"/>
-          <w:lang w:val="vi-VN"/>
+          <w:noProof/>
+          <w:sz w:val="28"/>
         </w:rPr>
         <w:drawing>
           <wp:inline distT="0" distB="0" distL="0" distR="0" wp14:anchorId="7137C7BF" wp14:editId="0875597E">
@@ -526,8 +526,8 @@
       <w:r>
         <w:rPr>
           <w:rFonts w:ascii="Times New Roman" w:hAnsi="Times New Roman" w:cs="Times New Roman"/>
-          <w:sz w:val="28"/>
-          <w:lang w:val="vi-VN"/>
+          <w:noProof/>
+          <w:sz w:val="28"/>
         </w:rPr>
         <w:drawing>
           <wp:inline distT="0" distB="0" distL="0" distR="0" wp14:anchorId="44DEA3FF" wp14:editId="15D70499">
@@ -600,8 +600,8 @@
       <w:r>
         <w:rPr>
           <w:rFonts w:ascii="Times New Roman" w:hAnsi="Times New Roman" w:cs="Times New Roman"/>
-          <w:sz w:val="28"/>
-          <w:lang w:val="vi-VN"/>
+          <w:noProof/>
+          <w:sz w:val="28"/>
         </w:rPr>
         <w:drawing>
           <wp:inline distT="0" distB="0" distL="0" distR="0" wp14:anchorId="2F90AD9B" wp14:editId="55BBB0A8">
@@ -676,8 +676,8 @@
       <w:r>
         <w:rPr>
           <w:rFonts w:ascii="Times New Roman" w:hAnsi="Times New Roman" w:cs="Times New Roman"/>
-          <w:sz w:val="28"/>
-          <w:lang w:val="vi-VN"/>
+          <w:noProof/>
+          <w:sz w:val="28"/>
         </w:rPr>
         <w:drawing>
           <wp:inline distT="0" distB="0" distL="0" distR="0" wp14:anchorId="6545437D" wp14:editId="7A08E24B">
@@ -779,6 +779,36 @@
     </w:p>
     <w:p>
       <w:pPr>
+        <w:pStyle w:val="ListParagraph"/>
+        <w:numPr>
+          <w:ilvl w:val="0"/>
+          <w:numId w:val="1"/>
+        </w:numPr>
+        <w:rPr>
+          <w:rFonts w:ascii="Times New Roman" w:hAnsi="Times New Roman" w:cs="Times New Roman"/>
+          <w:sz w:val="28"/>
+          <w:lang w:val="vi-VN"/>
+        </w:rPr>
+      </w:pPr>
+      <w:r>
+        <w:rPr>
+          <w:rFonts w:ascii="Times New Roman" w:hAnsi="Times New Roman" w:cs="Times New Roman"/>
+          <w:sz w:val="28"/>
+        </w:rPr>
+        <w:lastRenderedPageBreak/>
+        <w:t xml:space="preserve">Shader </w:t>
+      </w:r>
+      <w:r>
+        <w:rPr>
+          <w:rFonts w:ascii="Times New Roman" w:hAnsi="Times New Roman" w:cs="Times New Roman"/>
+          <w:sz w:val="28"/>
+          <w:lang w:val="vi-VN"/>
+        </w:rPr>
+        <w:t>để vẽ grid overlay</w:t>
+      </w:r>
+    </w:p>
+    <w:p>
+      <w:pPr>
         <w:rPr>
           <w:rFonts w:ascii="Times New Roman" w:hAnsi="Times New Roman" w:cs="Times New Roman"/>
           <w:sz w:val="28"/>
@@ -846,6 +876,64 @@
         <w:pStyle w:val="ListParagraph"/>
         <w:numPr>
           <w:ilvl w:val="0"/>
+          <w:numId w:val="6"/>
+        </w:numPr>
+        <w:rPr>
+          <w:rFonts w:ascii="Times New Roman" w:hAnsi="Times New Roman" w:cs="Times New Roman"/>
+          <w:sz w:val="28"/>
+          <w:lang w:val="vi-VN"/>
+        </w:rPr>
+      </w:pPr>
+      <w:r>
+        <w:rPr>
+          <w:rFonts w:ascii="Times New Roman" w:hAnsi="Times New Roman" w:cs="Times New Roman"/>
+          <w:sz w:val="28"/>
+          <w:lang w:val="vi-VN"/>
+        </w:rPr>
+        <w:t>Sử dụng shader để hiển thị grid</w:t>
+      </w:r>
+    </w:p>
+    <w:p>
+      <w:pPr>
+        <w:pStyle w:val="ListParagraph"/>
+        <w:numPr>
+          <w:ilvl w:val="0"/>
+          <w:numId w:val="6"/>
+        </w:numPr>
+        <w:rPr>
+          <w:rFonts w:ascii="Times New Roman" w:hAnsi="Times New Roman" w:cs="Times New Roman"/>
+          <w:sz w:val="28"/>
+          <w:lang w:val="vi-VN"/>
+        </w:rPr>
+      </w:pPr>
+      <w:r>
+        <w:rPr>
+          <w:rFonts w:ascii="Times New Roman" w:hAnsi="Times New Roman" w:cs="Times New Roman"/>
+          <w:sz w:val="28"/>
+          <w:lang w:val="vi-VN"/>
+        </w:rPr>
+        <w:t>Có thể vẽ và xóa ngay trong game</w:t>
+      </w:r>
+    </w:p>
+    <w:p>
+      <w:pPr>
+        <w:pStyle w:val="ListParagraph"/>
+        <w:numPr>
+          <w:ilvl w:val="0"/>
+          <w:numId w:val="6"/>
+        </w:numPr>
+        <w:rPr>
+          <w:rFonts w:ascii="Times New Roman" w:hAnsi="Times New Roman" w:cs="Times New Roman"/>
+          <w:sz w:val="28"/>
+          <w:lang w:val="vi-VN"/>
+        </w:rPr>
+      </w:pPr>
+    </w:p>
+    <w:p>
+      <w:pPr>
+        <w:pStyle w:val="ListParagraph"/>
+        <w:numPr>
+          <w:ilvl w:val="0"/>
           <w:numId w:val="5"/>
         </w:numPr>
         <w:rPr>
@@ -860,7 +948,29 @@
           <w:sz w:val="28"/>
           <w:lang w:val="vi-VN"/>
         </w:rPr>
-        <w:t>Hệ thống nâng c</w:t>
+        <w:t>Hệ thống nâng cấp kiến trúc</w:t>
+      </w:r>
+    </w:p>
+    <w:p>
+      <w:pPr>
+        <w:pStyle w:val="ListParagraph"/>
+        <w:numPr>
+          <w:ilvl w:val="0"/>
+          <w:numId w:val="5"/>
+        </w:numPr>
+        <w:rPr>
+          <w:rFonts w:ascii="Times New Roman" w:hAnsi="Times New Roman" w:cs="Times New Roman"/>
+          <w:sz w:val="28"/>
+          <w:lang w:val="vi-VN"/>
+        </w:rPr>
+      </w:pPr>
+      <w:r>
+        <w:rPr>
+          <w:rFonts w:ascii="Times New Roman" w:hAnsi="Times New Roman" w:cs="Times New Roman"/>
+          <w:sz w:val="28"/>
+          <w:lang w:val="vi-VN"/>
+        </w:rPr>
+        <w:t>Hệ thống lưu</w:t>
       </w:r>
       <w:bookmarkStart w:id="0" w:name="_GoBack"/>
       <w:bookmarkEnd w:id="0"/>
@@ -870,7 +980,7 @@
           <w:sz w:val="28"/>
           <w:lang w:val="vi-VN"/>
         </w:rPr>
-        <w:t>ấp kiến trúc</w:t>
+        <w:t xml:space="preserve"> map và load map</w:t>
       </w:r>
     </w:p>
     <w:sectPr>
@@ -1448,6 +1558,119 @@
       </w:rPr>
     </w:lvl>
   </w:abstractNum>
+  <w:abstractNum w:abstractNumId="5">
+    <w:nsid w:val="788B4035"/>
+    <w:multiLevelType w:val="hybridMultilevel"/>
+    <w:tmpl w:val="0B446D40"/>
+    <w:lvl w:ilvl="0" w:tplc="04090009">
+      <w:start w:val="1"/>
+      <w:numFmt w:val="bullet"/>
+      <w:lvlText w:val=""/>
+      <w:lvlJc w:val="left"/>
+      <w:pPr>
+        <w:ind w:left="1800" w:hanging="360"/>
+      </w:pPr>
+      <w:rPr>
+        <w:rFonts w:ascii="Wingdings" w:hAnsi="Wingdings" w:hint="default"/>
+      </w:rPr>
+    </w:lvl>
+    <w:lvl w:ilvl="1" w:tplc="04090003" w:tentative="1">
+      <w:start w:val="1"/>
+      <w:numFmt w:val="bullet"/>
+      <w:lvlText w:val="o"/>
+      <w:lvlJc w:val="left"/>
+      <w:pPr>
+        <w:ind w:left="2520" w:hanging="360"/>
+      </w:pPr>
+      <w:rPr>
+        <w:rFonts w:ascii="Courier New" w:hAnsi="Courier New" w:cs="Courier New" w:hint="default"/>
+      </w:rPr>
+    </w:lvl>
+    <w:lvl w:ilvl="2" w:tplc="04090005" w:tentative="1">
+      <w:start w:val="1"/>
+      <w:numFmt w:val="bullet"/>
+      <w:lvlText w:val=""/>
+      <w:lvlJc w:val="left"/>
+      <w:pPr>
+        <w:ind w:left="3240" w:hanging="360"/>
+      </w:pPr>
+      <w:rPr>
+        <w:rFonts w:ascii="Wingdings" w:hAnsi="Wingdings" w:hint="default"/>
+      </w:rPr>
+    </w:lvl>
+    <w:lvl w:ilvl="3" w:tplc="04090001" w:tentative="1">
+      <w:start w:val="1"/>
+      <w:numFmt w:val="bullet"/>
+      <w:lvlText w:val=""/>
+      <w:lvlJc w:val="left"/>
+      <w:pPr>
+        <w:ind w:left="3960" w:hanging="360"/>
+      </w:pPr>
+      <w:rPr>
+        <w:rFonts w:ascii="Symbol" w:hAnsi="Symbol" w:hint="default"/>
+      </w:rPr>
+    </w:lvl>
+    <w:lvl w:ilvl="4" w:tplc="04090003" w:tentative="1">
+      <w:start w:val="1"/>
+      <w:numFmt w:val="bullet"/>
+      <w:lvlText w:val="o"/>
+      <w:lvlJc w:val="left"/>
+      <w:pPr>
+        <w:ind w:left="4680" w:hanging="360"/>
+      </w:pPr>
+      <w:rPr>
+        <w:rFonts w:ascii="Courier New" w:hAnsi="Courier New" w:cs="Courier New" w:hint="default"/>
+      </w:rPr>
+    </w:lvl>
+    <w:lvl w:ilvl="5" w:tplc="04090005" w:tentative="1">
+      <w:start w:val="1"/>
+      <w:numFmt w:val="bullet"/>
+      <w:lvlText w:val=""/>
+      <w:lvlJc w:val="left"/>
+      <w:pPr>
+        <w:ind w:left="5400" w:hanging="360"/>
+      </w:pPr>
+      <w:rPr>
+        <w:rFonts w:ascii="Wingdings" w:hAnsi="Wingdings" w:hint="default"/>
+      </w:rPr>
+    </w:lvl>
+    <w:lvl w:ilvl="6" w:tplc="04090001" w:tentative="1">
+      <w:start w:val="1"/>
+      <w:numFmt w:val="bullet"/>
+      <w:lvlText w:val=""/>
+      <w:lvlJc w:val="left"/>
+      <w:pPr>
+        <w:ind w:left="6120" w:hanging="360"/>
+      </w:pPr>
+      <w:rPr>
+        <w:rFonts w:ascii="Symbol" w:hAnsi="Symbol" w:hint="default"/>
+      </w:rPr>
+    </w:lvl>
+    <w:lvl w:ilvl="7" w:tplc="04090003" w:tentative="1">
+      <w:start w:val="1"/>
+      <w:numFmt w:val="bullet"/>
+      <w:lvlText w:val="o"/>
+      <w:lvlJc w:val="left"/>
+      <w:pPr>
+        <w:ind w:left="6840" w:hanging="360"/>
+      </w:pPr>
+      <w:rPr>
+        <w:rFonts w:ascii="Courier New" w:hAnsi="Courier New" w:cs="Courier New" w:hint="default"/>
+      </w:rPr>
+    </w:lvl>
+    <w:lvl w:ilvl="8" w:tplc="04090005" w:tentative="1">
+      <w:start w:val="1"/>
+      <w:numFmt w:val="bullet"/>
+      <w:lvlText w:val=""/>
+      <w:lvlJc w:val="left"/>
+      <w:pPr>
+        <w:ind w:left="7560" w:hanging="360"/>
+      </w:pPr>
+      <w:rPr>
+        <w:rFonts w:ascii="Wingdings" w:hAnsi="Wingdings" w:hint="default"/>
+      </w:rPr>
+    </w:lvl>
+  </w:abstractNum>
   <w:num w:numId="1">
     <w:abstractNumId w:val="1"/>
   </w:num>
@@ -1462,6 +1685,9 @@
   </w:num>
   <w:num w:numId="5">
     <w:abstractNumId w:val="0"/>
+  </w:num>
+  <w:num w:numId="6">
+    <w:abstractNumId w:val="5"/>
   </w:num>
 </w:numbering>
 </file>

</xml_diff>

<commit_message>
feat: Place tilebase detection & Place rule
</commit_message>
<xml_diff>
--- a/Document.docx
+++ b/Document.docx
@@ -892,6 +892,14 @@
         </w:rPr>
         <w:t>Sử dụng shader để hiển thị grid</w:t>
       </w:r>
+      <w:r>
+        <w:rPr>
+          <w:rFonts w:ascii="Times New Roman" w:hAnsi="Times New Roman" w:cs="Times New Roman"/>
+          <w:sz w:val="28"/>
+          <w:lang w:val="vi-VN"/>
+        </w:rPr>
+        <w:t xml:space="preserve"> để player có thể căn vị trí đặt các tile</w:t>
+      </w:r>
     </w:p>
     <w:p>
       <w:pPr>
@@ -928,6 +936,67 @@
           <w:lang w:val="vi-VN"/>
         </w:rPr>
       </w:pPr>
+      <w:r>
+        <w:rPr>
+          <w:rFonts w:ascii="Times New Roman" w:hAnsi="Times New Roman" w:cs="Times New Roman"/>
+          <w:sz w:val="28"/>
+          <w:lang w:val="vi-VN"/>
+        </w:rPr>
+        <w:t>Mỗi tile sẽ yêu cầu có nền tile trước để đặt tile đó lên, ví dụ sand sẽ cần foam để đặt lên. Nếu không có nền trước thì không thể đặt tile lên được</w:t>
+      </w:r>
+      <w:r>
+        <w:rPr>
+          <w:rFonts w:ascii="Times New Roman" w:hAnsi="Times New Roman" w:cs="Times New Roman"/>
+          <w:sz w:val="28"/>
+          <w:lang w:val="vi-VN"/>
+        </w:rPr>
+        <w:t>. Cách làm ở đây là sử dụng scriptableobject để custom những tilemap yêu cầu có tile ở đó thì mới đặt được tile cần đặt lên. Ví dụ như sand cần có foam thì mới được đặt lên.</w:t>
+      </w:r>
+    </w:p>
+    <w:p>
+      <w:pPr>
+        <w:pStyle w:val="ListParagraph"/>
+        <w:numPr>
+          <w:ilvl w:val="0"/>
+          <w:numId w:val="6"/>
+        </w:numPr>
+        <w:rPr>
+          <w:rFonts w:ascii="Times New Roman" w:hAnsi="Times New Roman" w:cs="Times New Roman"/>
+          <w:sz w:val="28"/>
+          <w:lang w:val="vi-VN"/>
+        </w:rPr>
+      </w:pPr>
+      <w:r>
+        <w:rPr>
+          <w:rFonts w:ascii="Times New Roman" w:hAnsi="Times New Roman" w:cs="Times New Roman"/>
+          <w:sz w:val="28"/>
+          <w:lang w:val="vi-VN"/>
+        </w:rPr>
+        <w:t xml:space="preserve">Khi chọn 1 tile mà có thể đặt được thì ô đấy sẽ hiện màu xanh và ngược lại sẽ hiện màu đỏ </w:t>
+      </w:r>
+    </w:p>
+    <w:p>
+      <w:pPr>
+        <w:pStyle w:val="ListParagraph"/>
+        <w:numPr>
+          <w:ilvl w:val="0"/>
+          <w:numId w:val="6"/>
+        </w:numPr>
+        <w:rPr>
+          <w:rFonts w:ascii="Times New Roman" w:hAnsi="Times New Roman" w:cs="Times New Roman"/>
+          <w:sz w:val="28"/>
+          <w:lang w:val="vi-VN"/>
+        </w:rPr>
+      </w:pPr>
+    </w:p>
+    <w:p>
+      <w:pPr>
+        <w:rPr>
+          <w:rFonts w:ascii="Times New Roman" w:hAnsi="Times New Roman" w:cs="Times New Roman"/>
+          <w:sz w:val="28"/>
+          <w:lang w:val="vi-VN"/>
+        </w:rPr>
+      </w:pPr>
     </w:p>
     <w:p>
       <w:pPr>
@@ -970,18 +1039,163 @@
           <w:sz w:val="28"/>
           <w:lang w:val="vi-VN"/>
         </w:rPr>
-        <w:t>Hệ thống lưu</w:t>
-      </w:r>
+        <w:t>Hệ thống lưu map và load map</w:t>
+      </w:r>
+    </w:p>
+    <w:p>
+      <w:pPr>
+        <w:rPr>
+          <w:rFonts w:ascii="Times New Roman" w:hAnsi="Times New Roman" w:cs="Times New Roman"/>
+          <w:sz w:val="28"/>
+          <w:lang w:val="vi-VN"/>
+        </w:rPr>
+      </w:pPr>
+    </w:p>
+    <w:p>
+      <w:pPr>
+        <w:rPr>
+          <w:rFonts w:ascii="Times New Roman" w:hAnsi="Times New Roman" w:cs="Times New Roman"/>
+          <w:sz w:val="28"/>
+          <w:lang w:val="vi-VN"/>
+        </w:rPr>
+      </w:pPr>
       <w:bookmarkStart w:id="0" w:name="_GoBack"/>
       <w:bookmarkEnd w:id="0"/>
-      <w:r>
-        <w:rPr>
-          <w:rFonts w:ascii="Times New Roman" w:hAnsi="Times New Roman" w:cs="Times New Roman"/>
-          <w:sz w:val="28"/>
-          <w:lang w:val="vi-VN"/>
-        </w:rPr>
-        <w:t xml:space="preserve"> map và load map</w:t>
-      </w:r>
+    </w:p>
+    <w:p>
+      <w:pPr>
+        <w:rPr>
+          <w:rFonts w:ascii="Times New Roman" w:hAnsi="Times New Roman" w:cs="Times New Roman"/>
+          <w:sz w:val="28"/>
+          <w:lang w:val="vi-VN"/>
+        </w:rPr>
+      </w:pPr>
+    </w:p>
+    <w:p>
+      <w:pPr>
+        <w:rPr>
+          <w:rFonts w:ascii="Times New Roman" w:hAnsi="Times New Roman" w:cs="Times New Roman"/>
+          <w:sz w:val="28"/>
+          <w:lang w:val="vi-VN"/>
+        </w:rPr>
+      </w:pPr>
+      <w:r>
+        <w:rPr>
+          <w:rFonts w:ascii="Times New Roman" w:hAnsi="Times New Roman" w:cs="Times New Roman"/>
+          <w:sz w:val="28"/>
+          <w:lang w:val="vi-VN"/>
+        </w:rPr>
+        <w:t>Cách thêm 1 thứ gì đó mới:</w:t>
+      </w:r>
+    </w:p>
+    <w:p>
+      <w:pPr>
+        <w:pStyle w:val="ListParagraph"/>
+        <w:numPr>
+          <w:ilvl w:val="0"/>
+          <w:numId w:val="7"/>
+        </w:numPr>
+        <w:rPr>
+          <w:rFonts w:ascii="Times New Roman" w:hAnsi="Times New Roman" w:cs="Times New Roman"/>
+          <w:sz w:val="28"/>
+          <w:lang w:val="vi-VN"/>
+        </w:rPr>
+      </w:pPr>
+      <w:r>
+        <w:rPr>
+          <w:rFonts w:ascii="Times New Roman" w:hAnsi="Times New Roman" w:cs="Times New Roman"/>
+          <w:sz w:val="28"/>
+          <w:lang w:val="vi-VN"/>
+        </w:rPr>
+        <w:t>Tile</w:t>
+      </w:r>
+      <w:r>
+        <w:rPr>
+          <w:rFonts w:ascii="Times New Roman" w:hAnsi="Times New Roman" w:cs="Times New Roman"/>
+          <w:sz w:val="28"/>
+        </w:rPr>
+        <w:t xml:space="preserve"> Rule</w:t>
+      </w:r>
+      <w:r>
+        <w:rPr>
+          <w:rFonts w:ascii="Times New Roman" w:hAnsi="Times New Roman" w:cs="Times New Roman"/>
+          <w:sz w:val="28"/>
+          <w:lang w:val="vi-VN"/>
+        </w:rPr>
+        <w:t>:</w:t>
+      </w:r>
+    </w:p>
+    <w:p>
+      <w:pPr>
+        <w:pStyle w:val="ListParagraph"/>
+        <w:numPr>
+          <w:ilvl w:val="0"/>
+          <w:numId w:val="8"/>
+        </w:numPr>
+        <w:rPr>
+          <w:rFonts w:ascii="Times New Roman" w:hAnsi="Times New Roman" w:cs="Times New Roman"/>
+          <w:sz w:val="28"/>
+          <w:lang w:val="vi-VN"/>
+        </w:rPr>
+      </w:pPr>
+      <w:r>
+        <w:rPr>
+          <w:rFonts w:ascii="Times New Roman" w:hAnsi="Times New Roman" w:cs="Times New Roman"/>
+          <w:sz w:val="28"/>
+        </w:rPr>
+        <w:t>Cập</w:t>
+      </w:r>
+      <w:r>
+        <w:rPr>
+          <w:rFonts w:ascii="Times New Roman" w:hAnsi="Times New Roman" w:cs="Times New Roman"/>
+          <w:sz w:val="28"/>
+          <w:lang w:val="vi-VN"/>
+        </w:rPr>
+        <w:t xml:space="preserve"> nhật trongg MenuTileController</w:t>
+      </w:r>
+    </w:p>
+    <w:p>
+      <w:pPr>
+        <w:pStyle w:val="ListParagraph"/>
+        <w:numPr>
+          <w:ilvl w:val="0"/>
+          <w:numId w:val="8"/>
+        </w:numPr>
+        <w:rPr>
+          <w:rFonts w:ascii="Times New Roman" w:hAnsi="Times New Roman" w:cs="Times New Roman"/>
+          <w:sz w:val="28"/>
+          <w:lang w:val="vi-VN"/>
+        </w:rPr>
+      </w:pPr>
+      <w:r>
+        <w:rPr>
+          <w:rFonts w:ascii="Times New Roman" w:hAnsi="Times New Roman" w:cs="Times New Roman"/>
+          <w:sz w:val="28"/>
+          <w:lang w:val="vi-VN"/>
+        </w:rPr>
+        <w:t>Cập nhật trong M</w:t>
+      </w:r>
+      <w:r>
+        <w:rPr>
+          <w:rFonts w:ascii="Times New Roman" w:hAnsi="Times New Roman" w:cs="Times New Roman"/>
+          <w:sz w:val="28"/>
+        </w:rPr>
+        <w:t>apSaver, MapLoader</w:t>
+      </w:r>
+    </w:p>
+    <w:p>
+      <w:pPr>
+        <w:pStyle w:val="ListParagraph"/>
+        <w:numPr>
+          <w:ilvl w:val="0"/>
+          <w:numId w:val="8"/>
+        </w:numPr>
+        <w:rPr>
+          <w:rFonts w:ascii="Times New Roman" w:hAnsi="Times New Roman" w:cs="Times New Roman"/>
+          <w:sz w:val="28"/>
+          <w:lang w:val="vi-VN"/>
+        </w:rPr>
+      </w:pPr>
     </w:p>
     <w:sectPr>
       <w:pgSz w:w="12240" w:h="15840"/>
@@ -1446,6 +1660,118 @@
     </w:lvl>
   </w:abstractNum>
   <w:abstractNum w:abstractNumId="4">
+    <w:nsid w:val="419B2833"/>
+    <w:multiLevelType w:val="hybridMultilevel"/>
+    <w:tmpl w:val="F1200C94"/>
+    <w:lvl w:ilvl="0" w:tplc="A52AEB74">
+      <w:numFmt w:val="bullet"/>
+      <w:lvlText w:val="-"/>
+      <w:lvlJc w:val="left"/>
+      <w:pPr>
+        <w:ind w:left="720" w:hanging="360"/>
+      </w:pPr>
+      <w:rPr>
+        <w:rFonts w:ascii="Times New Roman" w:eastAsiaTheme="minorHAnsi" w:hAnsi="Times New Roman" w:cs="Times New Roman" w:hint="default"/>
+      </w:rPr>
+    </w:lvl>
+    <w:lvl w:ilvl="1" w:tplc="04090003" w:tentative="1">
+      <w:start w:val="1"/>
+      <w:numFmt w:val="bullet"/>
+      <w:lvlText w:val="o"/>
+      <w:lvlJc w:val="left"/>
+      <w:pPr>
+        <w:ind w:left="1440" w:hanging="360"/>
+      </w:pPr>
+      <w:rPr>
+        <w:rFonts w:ascii="Courier New" w:hAnsi="Courier New" w:cs="Courier New" w:hint="default"/>
+      </w:rPr>
+    </w:lvl>
+    <w:lvl w:ilvl="2" w:tplc="04090005" w:tentative="1">
+      <w:start w:val="1"/>
+      <w:numFmt w:val="bullet"/>
+      <w:lvlText w:val=""/>
+      <w:lvlJc w:val="left"/>
+      <w:pPr>
+        <w:ind w:left="2160" w:hanging="360"/>
+      </w:pPr>
+      <w:rPr>
+        <w:rFonts w:ascii="Wingdings" w:hAnsi="Wingdings" w:hint="default"/>
+      </w:rPr>
+    </w:lvl>
+    <w:lvl w:ilvl="3" w:tplc="04090001" w:tentative="1">
+      <w:start w:val="1"/>
+      <w:numFmt w:val="bullet"/>
+      <w:lvlText w:val=""/>
+      <w:lvlJc w:val="left"/>
+      <w:pPr>
+        <w:ind w:left="2880" w:hanging="360"/>
+      </w:pPr>
+      <w:rPr>
+        <w:rFonts w:ascii="Symbol" w:hAnsi="Symbol" w:hint="default"/>
+      </w:rPr>
+    </w:lvl>
+    <w:lvl w:ilvl="4" w:tplc="04090003" w:tentative="1">
+      <w:start w:val="1"/>
+      <w:numFmt w:val="bullet"/>
+      <w:lvlText w:val="o"/>
+      <w:lvlJc w:val="left"/>
+      <w:pPr>
+        <w:ind w:left="3600" w:hanging="360"/>
+      </w:pPr>
+      <w:rPr>
+        <w:rFonts w:ascii="Courier New" w:hAnsi="Courier New" w:cs="Courier New" w:hint="default"/>
+      </w:rPr>
+    </w:lvl>
+    <w:lvl w:ilvl="5" w:tplc="04090005" w:tentative="1">
+      <w:start w:val="1"/>
+      <w:numFmt w:val="bullet"/>
+      <w:lvlText w:val=""/>
+      <w:lvlJc w:val="left"/>
+      <w:pPr>
+        <w:ind w:left="4320" w:hanging="360"/>
+      </w:pPr>
+      <w:rPr>
+        <w:rFonts w:ascii="Wingdings" w:hAnsi="Wingdings" w:hint="default"/>
+      </w:rPr>
+    </w:lvl>
+    <w:lvl w:ilvl="6" w:tplc="04090001" w:tentative="1">
+      <w:start w:val="1"/>
+      <w:numFmt w:val="bullet"/>
+      <w:lvlText w:val=""/>
+      <w:lvlJc w:val="left"/>
+      <w:pPr>
+        <w:ind w:left="5040" w:hanging="360"/>
+      </w:pPr>
+      <w:rPr>
+        <w:rFonts w:ascii="Symbol" w:hAnsi="Symbol" w:hint="default"/>
+      </w:rPr>
+    </w:lvl>
+    <w:lvl w:ilvl="7" w:tplc="04090003" w:tentative="1">
+      <w:start w:val="1"/>
+      <w:numFmt w:val="bullet"/>
+      <w:lvlText w:val="o"/>
+      <w:lvlJc w:val="left"/>
+      <w:pPr>
+        <w:ind w:left="5760" w:hanging="360"/>
+      </w:pPr>
+      <w:rPr>
+        <w:rFonts w:ascii="Courier New" w:hAnsi="Courier New" w:cs="Courier New" w:hint="default"/>
+      </w:rPr>
+    </w:lvl>
+    <w:lvl w:ilvl="8" w:tplc="04090005" w:tentative="1">
+      <w:start w:val="1"/>
+      <w:numFmt w:val="bullet"/>
+      <w:lvlText w:val=""/>
+      <w:lvlJc w:val="left"/>
+      <w:pPr>
+        <w:ind w:left="6480" w:hanging="360"/>
+      </w:pPr>
+      <w:rPr>
+        <w:rFonts w:ascii="Wingdings" w:hAnsi="Wingdings" w:hint="default"/>
+      </w:rPr>
+    </w:lvl>
+  </w:abstractNum>
+  <w:abstractNum w:abstractNumId="5">
     <w:nsid w:val="53BE79AD"/>
     <w:multiLevelType w:val="hybridMultilevel"/>
     <w:tmpl w:val="85DEFE72"/>
@@ -1558,7 +1884,120 @@
       </w:rPr>
     </w:lvl>
   </w:abstractNum>
-  <w:abstractNum w:abstractNumId="5">
+  <w:abstractNum w:abstractNumId="6">
+    <w:nsid w:val="62CB5D83"/>
+    <w:multiLevelType w:val="hybridMultilevel"/>
+    <w:tmpl w:val="54743E80"/>
+    <w:lvl w:ilvl="0" w:tplc="04090001">
+      <w:start w:val="1"/>
+      <w:numFmt w:val="bullet"/>
+      <w:lvlText w:val=""/>
+      <w:lvlJc w:val="left"/>
+      <w:pPr>
+        <w:ind w:left="720" w:hanging="360"/>
+      </w:pPr>
+      <w:rPr>
+        <w:rFonts w:ascii="Symbol" w:hAnsi="Symbol" w:hint="default"/>
+      </w:rPr>
+    </w:lvl>
+    <w:lvl w:ilvl="1" w:tplc="04090003" w:tentative="1">
+      <w:start w:val="1"/>
+      <w:numFmt w:val="bullet"/>
+      <w:lvlText w:val="o"/>
+      <w:lvlJc w:val="left"/>
+      <w:pPr>
+        <w:ind w:left="1440" w:hanging="360"/>
+      </w:pPr>
+      <w:rPr>
+        <w:rFonts w:ascii="Courier New" w:hAnsi="Courier New" w:cs="Courier New" w:hint="default"/>
+      </w:rPr>
+    </w:lvl>
+    <w:lvl w:ilvl="2" w:tplc="04090005" w:tentative="1">
+      <w:start w:val="1"/>
+      <w:numFmt w:val="bullet"/>
+      <w:lvlText w:val=""/>
+      <w:lvlJc w:val="left"/>
+      <w:pPr>
+        <w:ind w:left="2160" w:hanging="360"/>
+      </w:pPr>
+      <w:rPr>
+        <w:rFonts w:ascii="Wingdings" w:hAnsi="Wingdings" w:hint="default"/>
+      </w:rPr>
+    </w:lvl>
+    <w:lvl w:ilvl="3" w:tplc="04090001" w:tentative="1">
+      <w:start w:val="1"/>
+      <w:numFmt w:val="bullet"/>
+      <w:lvlText w:val=""/>
+      <w:lvlJc w:val="left"/>
+      <w:pPr>
+        <w:ind w:left="2880" w:hanging="360"/>
+      </w:pPr>
+      <w:rPr>
+        <w:rFonts w:ascii="Symbol" w:hAnsi="Symbol" w:hint="default"/>
+      </w:rPr>
+    </w:lvl>
+    <w:lvl w:ilvl="4" w:tplc="04090003" w:tentative="1">
+      <w:start w:val="1"/>
+      <w:numFmt w:val="bullet"/>
+      <w:lvlText w:val="o"/>
+      <w:lvlJc w:val="left"/>
+      <w:pPr>
+        <w:ind w:left="3600" w:hanging="360"/>
+      </w:pPr>
+      <w:rPr>
+        <w:rFonts w:ascii="Courier New" w:hAnsi="Courier New" w:cs="Courier New" w:hint="default"/>
+      </w:rPr>
+    </w:lvl>
+    <w:lvl w:ilvl="5" w:tplc="04090005" w:tentative="1">
+      <w:start w:val="1"/>
+      <w:numFmt w:val="bullet"/>
+      <w:lvlText w:val=""/>
+      <w:lvlJc w:val="left"/>
+      <w:pPr>
+        <w:ind w:left="4320" w:hanging="360"/>
+      </w:pPr>
+      <w:rPr>
+        <w:rFonts w:ascii="Wingdings" w:hAnsi="Wingdings" w:hint="default"/>
+      </w:rPr>
+    </w:lvl>
+    <w:lvl w:ilvl="6" w:tplc="04090001" w:tentative="1">
+      <w:start w:val="1"/>
+      <w:numFmt w:val="bullet"/>
+      <w:lvlText w:val=""/>
+      <w:lvlJc w:val="left"/>
+      <w:pPr>
+        <w:ind w:left="5040" w:hanging="360"/>
+      </w:pPr>
+      <w:rPr>
+        <w:rFonts w:ascii="Symbol" w:hAnsi="Symbol" w:hint="default"/>
+      </w:rPr>
+    </w:lvl>
+    <w:lvl w:ilvl="7" w:tplc="04090003" w:tentative="1">
+      <w:start w:val="1"/>
+      <w:numFmt w:val="bullet"/>
+      <w:lvlText w:val="o"/>
+      <w:lvlJc w:val="left"/>
+      <w:pPr>
+        <w:ind w:left="5760" w:hanging="360"/>
+      </w:pPr>
+      <w:rPr>
+        <w:rFonts w:ascii="Courier New" w:hAnsi="Courier New" w:cs="Courier New" w:hint="default"/>
+      </w:rPr>
+    </w:lvl>
+    <w:lvl w:ilvl="8" w:tplc="04090005" w:tentative="1">
+      <w:start w:val="1"/>
+      <w:numFmt w:val="bullet"/>
+      <w:lvlText w:val=""/>
+      <w:lvlJc w:val="left"/>
+      <w:pPr>
+        <w:ind w:left="6480" w:hanging="360"/>
+      </w:pPr>
+      <w:rPr>
+        <w:rFonts w:ascii="Wingdings" w:hAnsi="Wingdings" w:hint="default"/>
+      </w:rPr>
+    </w:lvl>
+  </w:abstractNum>
+  <w:abstractNum w:abstractNumId="7">
     <w:nsid w:val="788B4035"/>
     <w:multiLevelType w:val="hybridMultilevel"/>
     <w:tmpl w:val="0B446D40"/>
@@ -1678,7 +2117,7 @@
     <w:abstractNumId w:val="2"/>
   </w:num>
   <w:num w:numId="3">
-    <w:abstractNumId w:val="4"/>
+    <w:abstractNumId w:val="5"/>
   </w:num>
   <w:num w:numId="4">
     <w:abstractNumId w:val="3"/>
@@ -1687,7 +2126,13 @@
     <w:abstractNumId w:val="0"/>
   </w:num>
   <w:num w:numId="6">
-    <w:abstractNumId w:val="5"/>
+    <w:abstractNumId w:val="7"/>
+  </w:num>
+  <w:num w:numId="7">
+    <w:abstractNumId w:val="6"/>
+  </w:num>
+  <w:num w:numId="8">
+    <w:abstractNumId w:val="4"/>
   </w:num>
 </w:numbering>
 </file>

</xml_diff>

<commit_message>
feat: State Machine for Pawn Animation & Cinemachine Camera
</commit_message>
<xml_diff>
--- a/Document.docx
+++ b/Document.docx
@@ -809,217 +809,238 @@
     </w:p>
     <w:p>
       <w:pPr>
-        <w:rPr>
-          <w:rFonts w:ascii="Times New Roman" w:hAnsi="Times New Roman" w:cs="Times New Roman"/>
-          <w:sz w:val="28"/>
-          <w:lang w:val="vi-VN"/>
-        </w:rPr>
-      </w:pPr>
-    </w:p>
-    <w:p>
-      <w:pPr>
-        <w:rPr>
-          <w:rFonts w:ascii="Times New Roman" w:hAnsi="Times New Roman" w:cs="Times New Roman"/>
-          <w:sz w:val="28"/>
-          <w:lang w:val="vi-VN"/>
-        </w:rPr>
-      </w:pPr>
-      <w:r>
-        <w:rPr>
-          <w:rFonts w:ascii="Times New Roman" w:hAnsi="Times New Roman" w:cs="Times New Roman"/>
-          <w:sz w:val="28"/>
-          <w:lang w:val="vi-VN"/>
-        </w:rPr>
-        <w:t xml:space="preserve">Những </w:t>
-      </w:r>
-      <w:r>
-        <w:rPr>
-          <w:rFonts w:ascii="Times New Roman" w:hAnsi="Times New Roman" w:cs="Times New Roman"/>
-          <w:sz w:val="28"/>
-          <w:lang w:val="vi-VN"/>
-        </w:rPr>
-        <w:t xml:space="preserve">chức năng </w:t>
-      </w:r>
-      <w:r>
-        <w:rPr>
-          <w:rFonts w:ascii="Times New Roman" w:hAnsi="Times New Roman" w:cs="Times New Roman"/>
-          <w:sz w:val="28"/>
-          <w:lang w:val="vi-VN"/>
-        </w:rPr>
-        <w:t>chính:</w:t>
-      </w:r>
-    </w:p>
-    <w:p>
-      <w:pPr>
-        <w:pStyle w:val="ListParagraph"/>
-        <w:numPr>
-          <w:ilvl w:val="0"/>
-          <w:numId w:val="5"/>
-        </w:numPr>
-        <w:rPr>
-          <w:rFonts w:ascii="Times New Roman" w:hAnsi="Times New Roman" w:cs="Times New Roman"/>
-          <w:sz w:val="28"/>
-          <w:lang w:val="vi-VN"/>
-        </w:rPr>
-      </w:pPr>
-      <w:r>
-        <w:rPr>
-          <w:rFonts w:ascii="Times New Roman" w:hAnsi="Times New Roman" w:cs="Times New Roman"/>
-          <w:sz w:val="28"/>
-          <w:lang w:val="vi-VN"/>
-        </w:rPr>
-        <w:t xml:space="preserve">Map Editor Ingame: Người chơi có thể sử dụng tile để thiết kế map cho mình </w:t>
-      </w:r>
-    </w:p>
-    <w:p>
-      <w:pPr>
-        <w:pStyle w:val="ListParagraph"/>
-        <w:numPr>
-          <w:ilvl w:val="0"/>
-          <w:numId w:val="6"/>
-        </w:numPr>
-        <w:rPr>
-          <w:rFonts w:ascii="Times New Roman" w:hAnsi="Times New Roman" w:cs="Times New Roman"/>
-          <w:sz w:val="28"/>
-          <w:lang w:val="vi-VN"/>
-        </w:rPr>
-      </w:pPr>
-      <w:r>
-        <w:rPr>
-          <w:rFonts w:ascii="Times New Roman" w:hAnsi="Times New Roman" w:cs="Times New Roman"/>
-          <w:sz w:val="28"/>
-          <w:lang w:val="vi-VN"/>
-        </w:rPr>
-        <w:t>Sử dụng shader để hiển thị grid</w:t>
-      </w:r>
-      <w:r>
-        <w:rPr>
-          <w:rFonts w:ascii="Times New Roman" w:hAnsi="Times New Roman" w:cs="Times New Roman"/>
-          <w:sz w:val="28"/>
-          <w:lang w:val="vi-VN"/>
-        </w:rPr>
-        <w:t xml:space="preserve"> để player có thể căn vị trí đặt các tile</w:t>
-      </w:r>
-    </w:p>
-    <w:p>
-      <w:pPr>
-        <w:pStyle w:val="ListParagraph"/>
-        <w:numPr>
-          <w:ilvl w:val="0"/>
-          <w:numId w:val="6"/>
-        </w:numPr>
-        <w:rPr>
-          <w:rFonts w:ascii="Times New Roman" w:hAnsi="Times New Roman" w:cs="Times New Roman"/>
-          <w:sz w:val="28"/>
-          <w:lang w:val="vi-VN"/>
-        </w:rPr>
-      </w:pPr>
-      <w:r>
-        <w:rPr>
-          <w:rFonts w:ascii="Times New Roman" w:hAnsi="Times New Roman" w:cs="Times New Roman"/>
-          <w:sz w:val="28"/>
-          <w:lang w:val="vi-VN"/>
-        </w:rPr>
-        <w:t>Có thể vẽ và xóa ngay trong game</w:t>
-      </w:r>
-    </w:p>
-    <w:p>
-      <w:pPr>
-        <w:pStyle w:val="ListParagraph"/>
-        <w:numPr>
-          <w:ilvl w:val="0"/>
-          <w:numId w:val="6"/>
-        </w:numPr>
-        <w:rPr>
-          <w:rFonts w:ascii="Times New Roman" w:hAnsi="Times New Roman" w:cs="Times New Roman"/>
-          <w:sz w:val="28"/>
-          <w:lang w:val="vi-VN"/>
-        </w:rPr>
-      </w:pPr>
-      <w:r>
-        <w:rPr>
-          <w:rFonts w:ascii="Times New Roman" w:hAnsi="Times New Roman" w:cs="Times New Roman"/>
-          <w:sz w:val="28"/>
-          <w:lang w:val="vi-VN"/>
-        </w:rPr>
-        <w:t>Mỗi tile sẽ yêu cầu có nền tile trước để đặt tile đó lên, ví dụ sand sẽ cần foam để đặt lên. Nếu không có nền trước thì không thể đặt tile lên được</w:t>
-      </w:r>
-      <w:r>
-        <w:rPr>
-          <w:rFonts w:ascii="Times New Roman" w:hAnsi="Times New Roman" w:cs="Times New Roman"/>
-          <w:sz w:val="28"/>
-          <w:lang w:val="vi-VN"/>
-        </w:rPr>
-        <w:t>. Cách làm ở đây là sử dụng scriptableobject để custom những tilemap yêu cầu có tile ở đó thì mới đặt được tile cần đặt lên. Ví dụ như sand cần có foam thì mới được đặt lên.</w:t>
-      </w:r>
-    </w:p>
-    <w:p>
-      <w:pPr>
-        <w:pStyle w:val="ListParagraph"/>
-        <w:numPr>
-          <w:ilvl w:val="0"/>
-          <w:numId w:val="6"/>
-        </w:numPr>
-        <w:rPr>
-          <w:rFonts w:ascii="Times New Roman" w:hAnsi="Times New Roman" w:cs="Times New Roman"/>
-          <w:sz w:val="28"/>
-          <w:lang w:val="vi-VN"/>
-        </w:rPr>
-      </w:pPr>
-      <w:r>
-        <w:rPr>
-          <w:rFonts w:ascii="Times New Roman" w:hAnsi="Times New Roman" w:cs="Times New Roman"/>
-          <w:sz w:val="28"/>
-          <w:lang w:val="vi-VN"/>
-        </w:rPr>
-        <w:t xml:space="preserve">Khi chọn 1 tile mà có thể đặt được thì ô đấy sẽ hiện màu xanh và ngược lại sẽ hiện màu đỏ </w:t>
-      </w:r>
-    </w:p>
-    <w:p>
-      <w:pPr>
-        <w:pStyle w:val="ListParagraph"/>
-        <w:numPr>
-          <w:ilvl w:val="0"/>
-          <w:numId w:val="6"/>
-        </w:numPr>
-        <w:rPr>
-          <w:rFonts w:ascii="Times New Roman" w:hAnsi="Times New Roman" w:cs="Times New Roman"/>
-          <w:sz w:val="28"/>
-          <w:lang w:val="vi-VN"/>
-        </w:rPr>
-      </w:pPr>
-      <w:r>
-        <w:rPr>
-          <w:rFonts w:ascii="Times New Roman" w:hAnsi="Times New Roman" w:cs="Times New Roman"/>
-          <w:sz w:val="28"/>
-          <w:lang w:val="vi-VN"/>
-        </w:rPr>
-        <w:t xml:space="preserve">Mỗi tile có thể thiết lập link tới 1 tile nào đó. Nếu xóa tile đó đi thì tile được link cũng sẽ bị xóa. </w:t>
-      </w:r>
-    </w:p>
-    <w:p>
-      <w:pPr>
-        <w:pStyle w:val="ListParagraph"/>
-        <w:numPr>
-          <w:ilvl w:val="0"/>
-          <w:numId w:val="6"/>
-        </w:numPr>
-        <w:rPr>
-          <w:rFonts w:ascii="Times New Roman" w:hAnsi="Times New Roman" w:cs="Times New Roman"/>
-          <w:sz w:val="28"/>
-          <w:lang w:val="vi-VN"/>
-        </w:rPr>
-      </w:pPr>
-      <w:r>
-        <w:rPr>
-          <w:rFonts w:ascii="Times New Roman" w:hAnsi="Times New Roman" w:cs="Times New Roman"/>
-          <w:sz w:val="28"/>
-          <w:lang w:val="vi-VN"/>
-        </w:rPr>
-        <w:t xml:space="preserve">Khi xóa 1 tile ở dưới đáy như foam thì toàn bộ tile ở bên trên cũng sẽ bị xóa </w:t>
+        <w:pStyle w:val="ListParagraph"/>
+        <w:numPr>
+          <w:ilvl w:val="0"/>
+          <w:numId w:val="1"/>
+        </w:numPr>
+        <w:rPr>
+          <w:rFonts w:ascii="Times New Roman" w:hAnsi="Times New Roman" w:cs="Times New Roman"/>
+          <w:sz w:val="28"/>
+          <w:lang w:val="vi-VN"/>
+        </w:rPr>
+      </w:pPr>
+      <w:r>
+        <w:rPr>
+          <w:rFonts w:ascii="Times New Roman" w:hAnsi="Times New Roman" w:cs="Times New Roman"/>
+          <w:sz w:val="28"/>
+        </w:rPr>
+        <w:t>State Machine System</w:t>
       </w:r>
       <w:bookmarkStart w:id="0" w:name="_GoBack"/>
       <w:bookmarkEnd w:id="0"/>
+    </w:p>
+    <w:p>
+      <w:pPr>
+        <w:rPr>
+          <w:rFonts w:ascii="Times New Roman" w:hAnsi="Times New Roman" w:cs="Times New Roman"/>
+          <w:sz w:val="28"/>
+          <w:lang w:val="vi-VN"/>
+        </w:rPr>
+      </w:pPr>
+    </w:p>
+    <w:p>
+      <w:pPr>
+        <w:rPr>
+          <w:rFonts w:ascii="Times New Roman" w:hAnsi="Times New Roman" w:cs="Times New Roman"/>
+          <w:sz w:val="28"/>
+          <w:lang w:val="vi-VN"/>
+        </w:rPr>
+      </w:pPr>
+      <w:r>
+        <w:rPr>
+          <w:rFonts w:ascii="Times New Roman" w:hAnsi="Times New Roman" w:cs="Times New Roman"/>
+          <w:sz w:val="28"/>
+          <w:lang w:val="vi-VN"/>
+        </w:rPr>
+        <w:t xml:space="preserve">Những </w:t>
+      </w:r>
+      <w:r>
+        <w:rPr>
+          <w:rFonts w:ascii="Times New Roman" w:hAnsi="Times New Roman" w:cs="Times New Roman"/>
+          <w:sz w:val="28"/>
+          <w:lang w:val="vi-VN"/>
+        </w:rPr>
+        <w:t xml:space="preserve">chức năng </w:t>
+      </w:r>
+      <w:r>
+        <w:rPr>
+          <w:rFonts w:ascii="Times New Roman" w:hAnsi="Times New Roman" w:cs="Times New Roman"/>
+          <w:sz w:val="28"/>
+          <w:lang w:val="vi-VN"/>
+        </w:rPr>
+        <w:t>chính:</w:t>
+      </w:r>
+    </w:p>
+    <w:p>
+      <w:pPr>
+        <w:pStyle w:val="ListParagraph"/>
+        <w:numPr>
+          <w:ilvl w:val="0"/>
+          <w:numId w:val="5"/>
+        </w:numPr>
+        <w:rPr>
+          <w:rFonts w:ascii="Times New Roman" w:hAnsi="Times New Roman" w:cs="Times New Roman"/>
+          <w:sz w:val="28"/>
+          <w:lang w:val="vi-VN"/>
+        </w:rPr>
+      </w:pPr>
+      <w:r>
+        <w:rPr>
+          <w:rFonts w:ascii="Times New Roman" w:hAnsi="Times New Roman" w:cs="Times New Roman"/>
+          <w:sz w:val="28"/>
+          <w:lang w:val="vi-VN"/>
+        </w:rPr>
+        <w:t xml:space="preserve">Map Editor Ingame: Người chơi có thể sử dụng tile để thiết kế map cho mình </w:t>
+      </w:r>
+    </w:p>
+    <w:p>
+      <w:pPr>
+        <w:pStyle w:val="ListParagraph"/>
+        <w:numPr>
+          <w:ilvl w:val="0"/>
+          <w:numId w:val="6"/>
+        </w:numPr>
+        <w:rPr>
+          <w:rFonts w:ascii="Times New Roman" w:hAnsi="Times New Roman" w:cs="Times New Roman"/>
+          <w:sz w:val="28"/>
+          <w:lang w:val="vi-VN"/>
+        </w:rPr>
+      </w:pPr>
+      <w:r>
+        <w:rPr>
+          <w:rFonts w:ascii="Times New Roman" w:hAnsi="Times New Roman" w:cs="Times New Roman"/>
+          <w:sz w:val="28"/>
+          <w:lang w:val="vi-VN"/>
+        </w:rPr>
+        <w:t>Sử dụng shader để hiển thị grid</w:t>
+      </w:r>
+      <w:r>
+        <w:rPr>
+          <w:rFonts w:ascii="Times New Roman" w:hAnsi="Times New Roman" w:cs="Times New Roman"/>
+          <w:sz w:val="28"/>
+          <w:lang w:val="vi-VN"/>
+        </w:rPr>
+        <w:t xml:space="preserve"> để player có thể căn vị trí đặt các tile</w:t>
+      </w:r>
+    </w:p>
+    <w:p>
+      <w:pPr>
+        <w:pStyle w:val="ListParagraph"/>
+        <w:numPr>
+          <w:ilvl w:val="0"/>
+          <w:numId w:val="6"/>
+        </w:numPr>
+        <w:rPr>
+          <w:rFonts w:ascii="Times New Roman" w:hAnsi="Times New Roman" w:cs="Times New Roman"/>
+          <w:sz w:val="28"/>
+          <w:lang w:val="vi-VN"/>
+        </w:rPr>
+      </w:pPr>
+      <w:r>
+        <w:rPr>
+          <w:rFonts w:ascii="Times New Roman" w:hAnsi="Times New Roman" w:cs="Times New Roman"/>
+          <w:sz w:val="28"/>
+          <w:lang w:val="vi-VN"/>
+        </w:rPr>
+        <w:t>Có thể vẽ và xóa ngay trong game</w:t>
+      </w:r>
+    </w:p>
+    <w:p>
+      <w:pPr>
+        <w:pStyle w:val="ListParagraph"/>
+        <w:numPr>
+          <w:ilvl w:val="0"/>
+          <w:numId w:val="6"/>
+        </w:numPr>
+        <w:rPr>
+          <w:rFonts w:ascii="Times New Roman" w:hAnsi="Times New Roman" w:cs="Times New Roman"/>
+          <w:sz w:val="28"/>
+          <w:lang w:val="vi-VN"/>
+        </w:rPr>
+      </w:pPr>
+      <w:r>
+        <w:rPr>
+          <w:rFonts w:ascii="Times New Roman" w:hAnsi="Times New Roman" w:cs="Times New Roman"/>
+          <w:sz w:val="28"/>
+          <w:lang w:val="vi-VN"/>
+        </w:rPr>
+        <w:t>Mỗi tile sẽ yêu cầu có nền tile trước để đặt tile đó lên, ví dụ sand sẽ cần foam để đặt lên. Nếu không có nền trước thì không thể đặt tile lên được</w:t>
+      </w:r>
+      <w:r>
+        <w:rPr>
+          <w:rFonts w:ascii="Times New Roman" w:hAnsi="Times New Roman" w:cs="Times New Roman"/>
+          <w:sz w:val="28"/>
+          <w:lang w:val="vi-VN"/>
+        </w:rPr>
+        <w:t>. Cách làm ở đây là sử dụng scriptableobject để custom những tilemap yêu cầu có tile ở đó thì mới đặt được tile cần đặt lên. Ví dụ như sand cần có foam thì mới được đặt lên.</w:t>
+      </w:r>
+    </w:p>
+    <w:p>
+      <w:pPr>
+        <w:pStyle w:val="ListParagraph"/>
+        <w:numPr>
+          <w:ilvl w:val="0"/>
+          <w:numId w:val="6"/>
+        </w:numPr>
+        <w:rPr>
+          <w:rFonts w:ascii="Times New Roman" w:hAnsi="Times New Roman" w:cs="Times New Roman"/>
+          <w:sz w:val="28"/>
+          <w:lang w:val="vi-VN"/>
+        </w:rPr>
+      </w:pPr>
+      <w:r>
+        <w:rPr>
+          <w:rFonts w:ascii="Times New Roman" w:hAnsi="Times New Roman" w:cs="Times New Roman"/>
+          <w:sz w:val="28"/>
+          <w:lang w:val="vi-VN"/>
+        </w:rPr>
+        <w:t xml:space="preserve">Khi chọn 1 tile mà có thể đặt được thì ô đấy sẽ hiện màu xanh và ngược lại sẽ hiện màu đỏ </w:t>
+      </w:r>
+    </w:p>
+    <w:p>
+      <w:pPr>
+        <w:pStyle w:val="ListParagraph"/>
+        <w:numPr>
+          <w:ilvl w:val="0"/>
+          <w:numId w:val="6"/>
+        </w:numPr>
+        <w:rPr>
+          <w:rFonts w:ascii="Times New Roman" w:hAnsi="Times New Roman" w:cs="Times New Roman"/>
+          <w:sz w:val="28"/>
+          <w:lang w:val="vi-VN"/>
+        </w:rPr>
+      </w:pPr>
+      <w:r>
+        <w:rPr>
+          <w:rFonts w:ascii="Times New Roman" w:hAnsi="Times New Roman" w:cs="Times New Roman"/>
+          <w:sz w:val="28"/>
+          <w:lang w:val="vi-VN"/>
+        </w:rPr>
+        <w:t xml:space="preserve">Mỗi tile có thể thiết lập link tới 1 tile nào đó. Nếu xóa tile đó đi thì tile được link cũng sẽ bị xóa. </w:t>
+      </w:r>
+    </w:p>
+    <w:p>
+      <w:pPr>
+        <w:pStyle w:val="ListParagraph"/>
+        <w:numPr>
+          <w:ilvl w:val="0"/>
+          <w:numId w:val="6"/>
+        </w:numPr>
+        <w:rPr>
+          <w:rFonts w:ascii="Times New Roman" w:hAnsi="Times New Roman" w:cs="Times New Roman"/>
+          <w:sz w:val="28"/>
+          <w:lang w:val="vi-VN"/>
+        </w:rPr>
+      </w:pPr>
+      <w:r>
+        <w:rPr>
+          <w:rFonts w:ascii="Times New Roman" w:hAnsi="Times New Roman" w:cs="Times New Roman"/>
+          <w:sz w:val="28"/>
+          <w:lang w:val="vi-VN"/>
+        </w:rPr>
+        <w:t xml:space="preserve">Khi xóa 1 tile ở dưới đáy như foam thì toàn bộ tile ở bên trên cũng sẽ bị xóa </w:t>
+      </w:r>
     </w:p>
     <w:p>
       <w:pPr>

</xml_diff>

<commit_message>
feat: add basic Custom Collision
</commit_message>
<xml_diff>
--- a/Document.docx
+++ b/Document.docx
@@ -825,275 +825,394 @@
           <w:rFonts w:ascii="Times New Roman" w:hAnsi="Times New Roman" w:cs="Times New Roman"/>
           <w:sz w:val="28"/>
         </w:rPr>
-        <w:t>State Machine System</w:t>
+        <w:t>Finite</w:t>
+      </w:r>
+      <w:r>
+        <w:rPr>
+          <w:rFonts w:ascii="Times New Roman" w:hAnsi="Times New Roman" w:cs="Times New Roman"/>
+          <w:sz w:val="28"/>
+          <w:lang w:val="vi-VN"/>
+        </w:rPr>
+        <w:t xml:space="preserve"> </w:t>
+      </w:r>
+      <w:r>
+        <w:rPr>
+          <w:rFonts w:ascii="Times New Roman" w:hAnsi="Times New Roman" w:cs="Times New Roman"/>
+          <w:sz w:val="28"/>
+        </w:rPr>
+        <w:t xml:space="preserve">State Machine </w:t>
+      </w:r>
+    </w:p>
+    <w:p>
+      <w:pPr>
+        <w:rPr>
+          <w:rFonts w:ascii="Times New Roman" w:hAnsi="Times New Roman" w:cs="Times New Roman"/>
+          <w:sz w:val="28"/>
+          <w:lang w:val="vi-VN"/>
+        </w:rPr>
+      </w:pPr>
+    </w:p>
+    <w:p>
+      <w:pPr>
+        <w:rPr>
+          <w:rFonts w:ascii="Times New Roman" w:hAnsi="Times New Roman" w:cs="Times New Roman"/>
+          <w:sz w:val="28"/>
+          <w:lang w:val="vi-VN"/>
+        </w:rPr>
+      </w:pPr>
+      <w:r>
+        <w:rPr>
+          <w:rFonts w:ascii="Times New Roman" w:hAnsi="Times New Roman" w:cs="Times New Roman"/>
+          <w:sz w:val="28"/>
+          <w:lang w:val="vi-VN"/>
+        </w:rPr>
+        <w:t xml:space="preserve">Những </w:t>
+      </w:r>
+      <w:r>
+        <w:rPr>
+          <w:rFonts w:ascii="Times New Roman" w:hAnsi="Times New Roman" w:cs="Times New Roman"/>
+          <w:sz w:val="28"/>
+          <w:lang w:val="vi-VN"/>
+        </w:rPr>
+        <w:t xml:space="preserve">chức năng </w:t>
+      </w:r>
+      <w:r>
+        <w:rPr>
+          <w:rFonts w:ascii="Times New Roman" w:hAnsi="Times New Roman" w:cs="Times New Roman"/>
+          <w:sz w:val="28"/>
+          <w:lang w:val="vi-VN"/>
+        </w:rPr>
+        <w:t>chính:</w:t>
+      </w:r>
+    </w:p>
+    <w:p>
+      <w:pPr>
+        <w:pStyle w:val="ListParagraph"/>
+        <w:numPr>
+          <w:ilvl w:val="0"/>
+          <w:numId w:val="5"/>
+        </w:numPr>
+        <w:rPr>
+          <w:rFonts w:ascii="Times New Roman" w:hAnsi="Times New Roman" w:cs="Times New Roman"/>
+          <w:sz w:val="28"/>
+          <w:lang w:val="vi-VN"/>
+        </w:rPr>
+      </w:pPr>
+      <w:r>
+        <w:rPr>
+          <w:rFonts w:ascii="Times New Roman" w:hAnsi="Times New Roman" w:cs="Times New Roman"/>
+          <w:sz w:val="28"/>
+          <w:lang w:val="vi-VN"/>
+        </w:rPr>
+        <w:t xml:space="preserve">Map Editor Ingame: Người chơi có thể sử dụng tile để thiết kế map cho mình </w:t>
+      </w:r>
+    </w:p>
+    <w:p>
+      <w:pPr>
+        <w:pStyle w:val="ListParagraph"/>
+        <w:numPr>
+          <w:ilvl w:val="0"/>
+          <w:numId w:val="6"/>
+        </w:numPr>
+        <w:rPr>
+          <w:rFonts w:ascii="Times New Roman" w:hAnsi="Times New Roman" w:cs="Times New Roman"/>
+          <w:sz w:val="28"/>
+          <w:lang w:val="vi-VN"/>
+        </w:rPr>
+      </w:pPr>
+      <w:r>
+        <w:rPr>
+          <w:rFonts w:ascii="Times New Roman" w:hAnsi="Times New Roman" w:cs="Times New Roman"/>
+          <w:sz w:val="28"/>
+          <w:lang w:val="vi-VN"/>
+        </w:rPr>
+        <w:t>Sử dụng shader để hiển thị grid</w:t>
+      </w:r>
+      <w:r>
+        <w:rPr>
+          <w:rFonts w:ascii="Times New Roman" w:hAnsi="Times New Roman" w:cs="Times New Roman"/>
+          <w:sz w:val="28"/>
+          <w:lang w:val="vi-VN"/>
+        </w:rPr>
+        <w:t xml:space="preserve"> để player có thể căn vị trí đặt các tile</w:t>
+      </w:r>
+    </w:p>
+    <w:p>
+      <w:pPr>
+        <w:pStyle w:val="ListParagraph"/>
+        <w:numPr>
+          <w:ilvl w:val="0"/>
+          <w:numId w:val="6"/>
+        </w:numPr>
+        <w:rPr>
+          <w:rFonts w:ascii="Times New Roman" w:hAnsi="Times New Roman" w:cs="Times New Roman"/>
+          <w:sz w:val="28"/>
+          <w:lang w:val="vi-VN"/>
+        </w:rPr>
+      </w:pPr>
+      <w:r>
+        <w:rPr>
+          <w:rFonts w:ascii="Times New Roman" w:hAnsi="Times New Roman" w:cs="Times New Roman"/>
+          <w:sz w:val="28"/>
+          <w:lang w:val="vi-VN"/>
+        </w:rPr>
+        <w:t>Có thể vẽ và xóa ngay trong game</w:t>
+      </w:r>
+    </w:p>
+    <w:p>
+      <w:pPr>
+        <w:pStyle w:val="ListParagraph"/>
+        <w:numPr>
+          <w:ilvl w:val="0"/>
+          <w:numId w:val="6"/>
+        </w:numPr>
+        <w:rPr>
+          <w:rFonts w:ascii="Times New Roman" w:hAnsi="Times New Roman" w:cs="Times New Roman"/>
+          <w:sz w:val="28"/>
+          <w:lang w:val="vi-VN"/>
+        </w:rPr>
+      </w:pPr>
+      <w:r>
+        <w:rPr>
+          <w:rFonts w:ascii="Times New Roman" w:hAnsi="Times New Roman" w:cs="Times New Roman"/>
+          <w:sz w:val="28"/>
+          <w:lang w:val="vi-VN"/>
+        </w:rPr>
+        <w:t>Mỗi tile sẽ yêu cầu có nền tile trước để đặt tile đó lên, ví dụ sand sẽ cần foam để đặt lên. Nếu không có nền trước thì không thể đặt tile lên được</w:t>
+      </w:r>
+      <w:r>
+        <w:rPr>
+          <w:rFonts w:ascii="Times New Roman" w:hAnsi="Times New Roman" w:cs="Times New Roman"/>
+          <w:sz w:val="28"/>
+          <w:lang w:val="vi-VN"/>
+        </w:rPr>
+        <w:t>. Cách làm ở đây là sử dụng scriptableobject để custom những tilemap yêu cầu có tile ở đó thì mới đặt được tile cần đặt lên. Ví dụ như sand cần có foam thì mới được đặt lên.</w:t>
+      </w:r>
+    </w:p>
+    <w:p>
+      <w:pPr>
+        <w:pStyle w:val="ListParagraph"/>
+        <w:numPr>
+          <w:ilvl w:val="0"/>
+          <w:numId w:val="6"/>
+        </w:numPr>
+        <w:rPr>
+          <w:rFonts w:ascii="Times New Roman" w:hAnsi="Times New Roman" w:cs="Times New Roman"/>
+          <w:sz w:val="28"/>
+          <w:lang w:val="vi-VN"/>
+        </w:rPr>
+      </w:pPr>
+      <w:r>
+        <w:rPr>
+          <w:rFonts w:ascii="Times New Roman" w:hAnsi="Times New Roman" w:cs="Times New Roman"/>
+          <w:sz w:val="28"/>
+          <w:lang w:val="vi-VN"/>
+        </w:rPr>
+        <w:t xml:space="preserve">Khi chọn 1 tile mà có thể đặt được thì ô đấy sẽ hiện màu xanh và ngược lại sẽ hiện màu đỏ </w:t>
+      </w:r>
+    </w:p>
+    <w:p>
+      <w:pPr>
+        <w:pStyle w:val="ListParagraph"/>
+        <w:numPr>
+          <w:ilvl w:val="0"/>
+          <w:numId w:val="6"/>
+        </w:numPr>
+        <w:rPr>
+          <w:rFonts w:ascii="Times New Roman" w:hAnsi="Times New Roman" w:cs="Times New Roman"/>
+          <w:sz w:val="28"/>
+          <w:lang w:val="vi-VN"/>
+        </w:rPr>
+      </w:pPr>
+      <w:r>
+        <w:rPr>
+          <w:rFonts w:ascii="Times New Roman" w:hAnsi="Times New Roman" w:cs="Times New Roman"/>
+          <w:sz w:val="28"/>
+          <w:lang w:val="vi-VN"/>
+        </w:rPr>
+        <w:t xml:space="preserve">Mỗi tile có thể thiết lập link tới 1 tile nào đó. Nếu xóa tile đó đi thì tile được link cũng sẽ bị xóa. </w:t>
+      </w:r>
+    </w:p>
+    <w:p>
+      <w:pPr>
+        <w:pStyle w:val="ListParagraph"/>
+        <w:numPr>
+          <w:ilvl w:val="0"/>
+          <w:numId w:val="6"/>
+        </w:numPr>
+        <w:rPr>
+          <w:rFonts w:ascii="Times New Roman" w:hAnsi="Times New Roman" w:cs="Times New Roman"/>
+          <w:sz w:val="28"/>
+          <w:lang w:val="vi-VN"/>
+        </w:rPr>
+      </w:pPr>
+      <w:r>
+        <w:rPr>
+          <w:rFonts w:ascii="Times New Roman" w:hAnsi="Times New Roman" w:cs="Times New Roman"/>
+          <w:sz w:val="28"/>
+          <w:lang w:val="vi-VN"/>
+        </w:rPr>
+        <w:t xml:space="preserve">Khi xóa 1 tile ở dưới đáy như foam thì toàn bộ tile ở bên trên cũng sẽ bị xóa </w:t>
+      </w:r>
+    </w:p>
+    <w:p>
+      <w:pPr>
+        <w:rPr>
+          <w:rFonts w:ascii="Times New Roman" w:hAnsi="Times New Roman" w:cs="Times New Roman"/>
+          <w:sz w:val="28"/>
+          <w:lang w:val="vi-VN"/>
+        </w:rPr>
+      </w:pPr>
+    </w:p>
+    <w:p>
+      <w:pPr>
+        <w:pStyle w:val="ListParagraph"/>
+        <w:numPr>
+          <w:ilvl w:val="0"/>
+          <w:numId w:val="5"/>
+        </w:numPr>
+        <w:rPr>
+          <w:rFonts w:ascii="Times New Roman" w:hAnsi="Times New Roman" w:cs="Times New Roman"/>
+          <w:sz w:val="28"/>
+          <w:lang w:val="vi-VN"/>
+        </w:rPr>
+      </w:pPr>
+      <w:r>
+        <w:rPr>
+          <w:rFonts w:ascii="Times New Roman" w:hAnsi="Times New Roman" w:cs="Times New Roman"/>
+          <w:sz w:val="28"/>
+          <w:lang w:val="vi-VN"/>
+        </w:rPr>
+        <w:t>Hệ thống nâng cấp kiến trúc</w:t>
+      </w:r>
+    </w:p>
+    <w:p>
+      <w:pPr>
+        <w:pStyle w:val="ListParagraph"/>
+        <w:numPr>
+          <w:ilvl w:val="0"/>
+          <w:numId w:val="5"/>
+        </w:numPr>
+        <w:rPr>
+          <w:rFonts w:ascii="Times New Roman" w:hAnsi="Times New Roman" w:cs="Times New Roman"/>
+          <w:sz w:val="28"/>
+          <w:lang w:val="vi-VN"/>
+        </w:rPr>
+      </w:pPr>
+      <w:r>
+        <w:rPr>
+          <w:rFonts w:ascii="Times New Roman" w:hAnsi="Times New Roman" w:cs="Times New Roman"/>
+          <w:sz w:val="28"/>
+          <w:lang w:val="vi-VN"/>
+        </w:rPr>
+        <w:t>Hệ thống lưu map và load map</w:t>
+      </w:r>
+    </w:p>
+    <w:p>
+      <w:pPr>
+        <w:pStyle w:val="ListParagraph"/>
+        <w:numPr>
+          <w:ilvl w:val="0"/>
+          <w:numId w:val="5"/>
+        </w:numPr>
+        <w:rPr>
+          <w:rFonts w:ascii="Times New Roman" w:hAnsi="Times New Roman" w:cs="Times New Roman"/>
+          <w:sz w:val="28"/>
+          <w:lang w:val="vi-VN"/>
+        </w:rPr>
+      </w:pPr>
+      <w:r>
+        <w:rPr>
+          <w:rFonts w:ascii="Times New Roman" w:hAnsi="Times New Roman" w:cs="Times New Roman"/>
+          <w:sz w:val="28"/>
+          <w:lang w:val="vi-VN"/>
+        </w:rPr>
+        <w:t>Map collider</w:t>
+      </w:r>
+    </w:p>
+    <w:p>
+      <w:pPr>
+        <w:pStyle w:val="ListParagraph"/>
+        <w:numPr>
+          <w:ilvl w:val="0"/>
+          <w:numId w:val="11"/>
+        </w:numPr>
+        <w:rPr>
+          <w:rFonts w:ascii="Times New Roman" w:hAnsi="Times New Roman" w:cs="Times New Roman"/>
+          <w:sz w:val="28"/>
+          <w:lang w:val="vi-VN"/>
+        </w:rPr>
+      </w:pPr>
+      <w:r>
+        <w:rPr>
+          <w:rFonts w:ascii="Times New Roman" w:hAnsi="Times New Roman" w:cs="Times New Roman"/>
+          <w:sz w:val="28"/>
+          <w:lang w:val="vi-VN"/>
+        </w:rPr>
+        <w:t xml:space="preserve">Mỗi tầng sẽ có 1 Layer riêng. </w:t>
+      </w:r>
+    </w:p>
+    <w:p>
+      <w:pPr>
+        <w:pStyle w:val="ListParagraph"/>
+        <w:numPr>
+          <w:ilvl w:val="0"/>
+          <w:numId w:val="11"/>
+        </w:numPr>
+        <w:rPr>
+          <w:rFonts w:ascii="Times New Roman" w:hAnsi="Times New Roman" w:cs="Times New Roman"/>
+          <w:sz w:val="28"/>
+          <w:lang w:val="vi-VN"/>
+        </w:rPr>
+      </w:pPr>
+      <w:r>
+        <w:rPr>
+          <w:rFonts w:ascii="Times New Roman" w:hAnsi="Times New Roman" w:cs="Times New Roman"/>
+          <w:sz w:val="28"/>
+          <w:lang w:val="vi-VN"/>
+        </w:rPr>
+        <w:t xml:space="preserve">Ta sẽ tắt </w:t>
+      </w:r>
+      <w:r>
+        <w:rPr>
+          <w:rFonts w:ascii="Times New Roman" w:hAnsi="Times New Roman" w:cs="Times New Roman"/>
+          <w:sz w:val="28"/>
+          <w:lang w:val="vi-VN"/>
+        </w:rPr>
+        <w:t>LayerCollision</w:t>
+      </w:r>
+      <w:r>
+        <w:rPr>
+          <w:rFonts w:ascii="Times New Roman" w:hAnsi="Times New Roman" w:cs="Times New Roman"/>
+          <w:sz w:val="28"/>
+          <w:lang w:val="vi-VN"/>
+        </w:rPr>
+        <w:t xml:space="preserve"> của các tầng trong Physic2D sao cho tầng các tầng không thể va chạm lẫn nhau</w:t>
+      </w:r>
+    </w:p>
+    <w:p>
+      <w:pPr>
+        <w:pStyle w:val="ListParagraph"/>
+        <w:numPr>
+          <w:ilvl w:val="0"/>
+          <w:numId w:val="11"/>
+        </w:numPr>
+        <w:rPr>
+          <w:rFonts w:ascii="Times New Roman" w:hAnsi="Times New Roman" w:cs="Times New Roman"/>
+          <w:sz w:val="28"/>
+          <w:lang w:val="vi-VN"/>
+        </w:rPr>
+      </w:pPr>
+      <w:r>
+        <w:rPr>
+          <w:rFonts w:ascii="Times New Roman" w:hAnsi="Times New Roman" w:cs="Times New Roman"/>
+          <w:sz w:val="28"/>
+          <w:lang w:val="vi-VN"/>
+        </w:rPr>
+        <w:t>Tương ứng với mỗi layer của map thì nhân vật sẽ có layer riêng của tầng đó để hiển thị trên bản đồ 1 cách chân thực. Collision của layer nhân vật trong tầng đó sẽ chỉ bật với layer của tilemap trong tầng đó. Không thể tương tác với tilemap trong tầng khác.</w:t>
       </w:r>
       <w:bookmarkStart w:id="0" w:name="_GoBack"/>
       <w:bookmarkEnd w:id="0"/>
-    </w:p>
-    <w:p>
-      <w:pPr>
-        <w:rPr>
-          <w:rFonts w:ascii="Times New Roman" w:hAnsi="Times New Roman" w:cs="Times New Roman"/>
-          <w:sz w:val="28"/>
-          <w:lang w:val="vi-VN"/>
-        </w:rPr>
-      </w:pPr>
-    </w:p>
-    <w:p>
-      <w:pPr>
-        <w:rPr>
-          <w:rFonts w:ascii="Times New Roman" w:hAnsi="Times New Roman" w:cs="Times New Roman"/>
-          <w:sz w:val="28"/>
-          <w:lang w:val="vi-VN"/>
-        </w:rPr>
-      </w:pPr>
-      <w:r>
-        <w:rPr>
-          <w:rFonts w:ascii="Times New Roman" w:hAnsi="Times New Roman" w:cs="Times New Roman"/>
-          <w:sz w:val="28"/>
-          <w:lang w:val="vi-VN"/>
-        </w:rPr>
-        <w:t xml:space="preserve">Những </w:t>
-      </w:r>
-      <w:r>
-        <w:rPr>
-          <w:rFonts w:ascii="Times New Roman" w:hAnsi="Times New Roman" w:cs="Times New Roman"/>
-          <w:sz w:val="28"/>
-          <w:lang w:val="vi-VN"/>
-        </w:rPr>
-        <w:t xml:space="preserve">chức năng </w:t>
-      </w:r>
-      <w:r>
-        <w:rPr>
-          <w:rFonts w:ascii="Times New Roman" w:hAnsi="Times New Roman" w:cs="Times New Roman"/>
-          <w:sz w:val="28"/>
-          <w:lang w:val="vi-VN"/>
-        </w:rPr>
-        <w:t>chính:</w:t>
-      </w:r>
-    </w:p>
-    <w:p>
-      <w:pPr>
-        <w:pStyle w:val="ListParagraph"/>
-        <w:numPr>
-          <w:ilvl w:val="0"/>
-          <w:numId w:val="5"/>
-        </w:numPr>
-        <w:rPr>
-          <w:rFonts w:ascii="Times New Roman" w:hAnsi="Times New Roman" w:cs="Times New Roman"/>
-          <w:sz w:val="28"/>
-          <w:lang w:val="vi-VN"/>
-        </w:rPr>
-      </w:pPr>
-      <w:r>
-        <w:rPr>
-          <w:rFonts w:ascii="Times New Roman" w:hAnsi="Times New Roman" w:cs="Times New Roman"/>
-          <w:sz w:val="28"/>
-          <w:lang w:val="vi-VN"/>
-        </w:rPr>
-        <w:t xml:space="preserve">Map Editor Ingame: Người chơi có thể sử dụng tile để thiết kế map cho mình </w:t>
-      </w:r>
-    </w:p>
-    <w:p>
-      <w:pPr>
-        <w:pStyle w:val="ListParagraph"/>
-        <w:numPr>
-          <w:ilvl w:val="0"/>
-          <w:numId w:val="6"/>
-        </w:numPr>
-        <w:rPr>
-          <w:rFonts w:ascii="Times New Roman" w:hAnsi="Times New Roman" w:cs="Times New Roman"/>
-          <w:sz w:val="28"/>
-          <w:lang w:val="vi-VN"/>
-        </w:rPr>
-      </w:pPr>
-      <w:r>
-        <w:rPr>
-          <w:rFonts w:ascii="Times New Roman" w:hAnsi="Times New Roman" w:cs="Times New Roman"/>
-          <w:sz w:val="28"/>
-          <w:lang w:val="vi-VN"/>
-        </w:rPr>
-        <w:t>Sử dụng shader để hiển thị grid</w:t>
-      </w:r>
-      <w:r>
-        <w:rPr>
-          <w:rFonts w:ascii="Times New Roman" w:hAnsi="Times New Roman" w:cs="Times New Roman"/>
-          <w:sz w:val="28"/>
-          <w:lang w:val="vi-VN"/>
-        </w:rPr>
-        <w:t xml:space="preserve"> để player có thể căn vị trí đặt các tile</w:t>
-      </w:r>
-    </w:p>
-    <w:p>
-      <w:pPr>
-        <w:pStyle w:val="ListParagraph"/>
-        <w:numPr>
-          <w:ilvl w:val="0"/>
-          <w:numId w:val="6"/>
-        </w:numPr>
-        <w:rPr>
-          <w:rFonts w:ascii="Times New Roman" w:hAnsi="Times New Roman" w:cs="Times New Roman"/>
-          <w:sz w:val="28"/>
-          <w:lang w:val="vi-VN"/>
-        </w:rPr>
-      </w:pPr>
-      <w:r>
-        <w:rPr>
-          <w:rFonts w:ascii="Times New Roman" w:hAnsi="Times New Roman" w:cs="Times New Roman"/>
-          <w:sz w:val="28"/>
-          <w:lang w:val="vi-VN"/>
-        </w:rPr>
-        <w:t>Có thể vẽ và xóa ngay trong game</w:t>
-      </w:r>
-    </w:p>
-    <w:p>
-      <w:pPr>
-        <w:pStyle w:val="ListParagraph"/>
-        <w:numPr>
-          <w:ilvl w:val="0"/>
-          <w:numId w:val="6"/>
-        </w:numPr>
-        <w:rPr>
-          <w:rFonts w:ascii="Times New Roman" w:hAnsi="Times New Roman" w:cs="Times New Roman"/>
-          <w:sz w:val="28"/>
-          <w:lang w:val="vi-VN"/>
-        </w:rPr>
-      </w:pPr>
-      <w:r>
-        <w:rPr>
-          <w:rFonts w:ascii="Times New Roman" w:hAnsi="Times New Roman" w:cs="Times New Roman"/>
-          <w:sz w:val="28"/>
-          <w:lang w:val="vi-VN"/>
-        </w:rPr>
-        <w:t>Mỗi tile sẽ yêu cầu có nền tile trước để đặt tile đó lên, ví dụ sand sẽ cần foam để đặt lên. Nếu không có nền trước thì không thể đặt tile lên được</w:t>
-      </w:r>
-      <w:r>
-        <w:rPr>
-          <w:rFonts w:ascii="Times New Roman" w:hAnsi="Times New Roman" w:cs="Times New Roman"/>
-          <w:sz w:val="28"/>
-          <w:lang w:val="vi-VN"/>
-        </w:rPr>
-        <w:t>. Cách làm ở đây là sử dụng scriptableobject để custom những tilemap yêu cầu có tile ở đó thì mới đặt được tile cần đặt lên. Ví dụ như sand cần có foam thì mới được đặt lên.</w:t>
-      </w:r>
-    </w:p>
-    <w:p>
-      <w:pPr>
-        <w:pStyle w:val="ListParagraph"/>
-        <w:numPr>
-          <w:ilvl w:val="0"/>
-          <w:numId w:val="6"/>
-        </w:numPr>
-        <w:rPr>
-          <w:rFonts w:ascii="Times New Roman" w:hAnsi="Times New Roman" w:cs="Times New Roman"/>
-          <w:sz w:val="28"/>
-          <w:lang w:val="vi-VN"/>
-        </w:rPr>
-      </w:pPr>
-      <w:r>
-        <w:rPr>
-          <w:rFonts w:ascii="Times New Roman" w:hAnsi="Times New Roman" w:cs="Times New Roman"/>
-          <w:sz w:val="28"/>
-          <w:lang w:val="vi-VN"/>
-        </w:rPr>
-        <w:t xml:space="preserve">Khi chọn 1 tile mà có thể đặt được thì ô đấy sẽ hiện màu xanh và ngược lại sẽ hiện màu đỏ </w:t>
-      </w:r>
-    </w:p>
-    <w:p>
-      <w:pPr>
-        <w:pStyle w:val="ListParagraph"/>
-        <w:numPr>
-          <w:ilvl w:val="0"/>
-          <w:numId w:val="6"/>
-        </w:numPr>
-        <w:rPr>
-          <w:rFonts w:ascii="Times New Roman" w:hAnsi="Times New Roman" w:cs="Times New Roman"/>
-          <w:sz w:val="28"/>
-          <w:lang w:val="vi-VN"/>
-        </w:rPr>
-      </w:pPr>
-      <w:r>
-        <w:rPr>
-          <w:rFonts w:ascii="Times New Roman" w:hAnsi="Times New Roman" w:cs="Times New Roman"/>
-          <w:sz w:val="28"/>
-          <w:lang w:val="vi-VN"/>
-        </w:rPr>
-        <w:t xml:space="preserve">Mỗi tile có thể thiết lập link tới 1 tile nào đó. Nếu xóa tile đó đi thì tile được link cũng sẽ bị xóa. </w:t>
-      </w:r>
-    </w:p>
-    <w:p>
-      <w:pPr>
-        <w:pStyle w:val="ListParagraph"/>
-        <w:numPr>
-          <w:ilvl w:val="0"/>
-          <w:numId w:val="6"/>
-        </w:numPr>
-        <w:rPr>
-          <w:rFonts w:ascii="Times New Roman" w:hAnsi="Times New Roman" w:cs="Times New Roman"/>
-          <w:sz w:val="28"/>
-          <w:lang w:val="vi-VN"/>
-        </w:rPr>
-      </w:pPr>
-      <w:r>
-        <w:rPr>
-          <w:rFonts w:ascii="Times New Roman" w:hAnsi="Times New Roman" w:cs="Times New Roman"/>
-          <w:sz w:val="28"/>
-          <w:lang w:val="vi-VN"/>
-        </w:rPr>
-        <w:t xml:space="preserve">Khi xóa 1 tile ở dưới đáy như foam thì toàn bộ tile ở bên trên cũng sẽ bị xóa </w:t>
-      </w:r>
-    </w:p>
-    <w:p>
-      <w:pPr>
-        <w:rPr>
-          <w:rFonts w:ascii="Times New Roman" w:hAnsi="Times New Roman" w:cs="Times New Roman"/>
-          <w:sz w:val="28"/>
-          <w:lang w:val="vi-VN"/>
-        </w:rPr>
-      </w:pPr>
-    </w:p>
-    <w:p>
-      <w:pPr>
-        <w:pStyle w:val="ListParagraph"/>
-        <w:numPr>
-          <w:ilvl w:val="0"/>
-          <w:numId w:val="5"/>
-        </w:numPr>
-        <w:rPr>
-          <w:rFonts w:ascii="Times New Roman" w:hAnsi="Times New Roman" w:cs="Times New Roman"/>
-          <w:sz w:val="28"/>
-          <w:lang w:val="vi-VN"/>
-        </w:rPr>
-      </w:pPr>
-      <w:r>
-        <w:rPr>
-          <w:rFonts w:ascii="Times New Roman" w:hAnsi="Times New Roman" w:cs="Times New Roman"/>
-          <w:sz w:val="28"/>
-          <w:lang w:val="vi-VN"/>
-        </w:rPr>
-        <w:t>Hệ thống nâng cấp kiến trúc</w:t>
-      </w:r>
-    </w:p>
-    <w:p>
-      <w:pPr>
-        <w:pStyle w:val="ListParagraph"/>
-        <w:numPr>
-          <w:ilvl w:val="0"/>
-          <w:numId w:val="5"/>
-        </w:numPr>
-        <w:rPr>
-          <w:rFonts w:ascii="Times New Roman" w:hAnsi="Times New Roman" w:cs="Times New Roman"/>
-          <w:sz w:val="28"/>
-          <w:lang w:val="vi-VN"/>
-        </w:rPr>
-      </w:pPr>
-      <w:r>
-        <w:rPr>
-          <w:rFonts w:ascii="Times New Roman" w:hAnsi="Times New Roman" w:cs="Times New Roman"/>
-          <w:sz w:val="28"/>
-          <w:lang w:val="vi-VN"/>
-        </w:rPr>
-        <w:t>Hệ thống lưu map và load map</w:t>
-      </w:r>
     </w:p>
     <w:p>
       <w:pPr>
@@ -1530,6 +1649,119 @@
     </w:lvl>
   </w:abstractNum>
   <w:abstractNum w:abstractNumId="2">
+    <w:nsid w:val="1E4B6628"/>
+    <w:multiLevelType w:val="hybridMultilevel"/>
+    <w:tmpl w:val="C02625B8"/>
+    <w:lvl w:ilvl="0" w:tplc="04090005">
+      <w:start w:val="1"/>
+      <w:numFmt w:val="bullet"/>
+      <w:lvlText w:val=""/>
+      <w:lvlJc w:val="left"/>
+      <w:pPr>
+        <w:ind w:left="1800" w:hanging="360"/>
+      </w:pPr>
+      <w:rPr>
+        <w:rFonts w:ascii="Wingdings" w:hAnsi="Wingdings" w:hint="default"/>
+      </w:rPr>
+    </w:lvl>
+    <w:lvl w:ilvl="1" w:tplc="04090003" w:tentative="1">
+      <w:start w:val="1"/>
+      <w:numFmt w:val="bullet"/>
+      <w:lvlText w:val="o"/>
+      <w:lvlJc w:val="left"/>
+      <w:pPr>
+        <w:ind w:left="2520" w:hanging="360"/>
+      </w:pPr>
+      <w:rPr>
+        <w:rFonts w:ascii="Courier New" w:hAnsi="Courier New" w:cs="Courier New" w:hint="default"/>
+      </w:rPr>
+    </w:lvl>
+    <w:lvl w:ilvl="2" w:tplc="04090005" w:tentative="1">
+      <w:start w:val="1"/>
+      <w:numFmt w:val="bullet"/>
+      <w:lvlText w:val=""/>
+      <w:lvlJc w:val="left"/>
+      <w:pPr>
+        <w:ind w:left="3240" w:hanging="360"/>
+      </w:pPr>
+      <w:rPr>
+        <w:rFonts w:ascii="Wingdings" w:hAnsi="Wingdings" w:hint="default"/>
+      </w:rPr>
+    </w:lvl>
+    <w:lvl w:ilvl="3" w:tplc="04090001" w:tentative="1">
+      <w:start w:val="1"/>
+      <w:numFmt w:val="bullet"/>
+      <w:lvlText w:val=""/>
+      <w:lvlJc w:val="left"/>
+      <w:pPr>
+        <w:ind w:left="3960" w:hanging="360"/>
+      </w:pPr>
+      <w:rPr>
+        <w:rFonts w:ascii="Symbol" w:hAnsi="Symbol" w:hint="default"/>
+      </w:rPr>
+    </w:lvl>
+    <w:lvl w:ilvl="4" w:tplc="04090003" w:tentative="1">
+      <w:start w:val="1"/>
+      <w:numFmt w:val="bullet"/>
+      <w:lvlText w:val="o"/>
+      <w:lvlJc w:val="left"/>
+      <w:pPr>
+        <w:ind w:left="4680" w:hanging="360"/>
+      </w:pPr>
+      <w:rPr>
+        <w:rFonts w:ascii="Courier New" w:hAnsi="Courier New" w:cs="Courier New" w:hint="default"/>
+      </w:rPr>
+    </w:lvl>
+    <w:lvl w:ilvl="5" w:tplc="04090005" w:tentative="1">
+      <w:start w:val="1"/>
+      <w:numFmt w:val="bullet"/>
+      <w:lvlText w:val=""/>
+      <w:lvlJc w:val="left"/>
+      <w:pPr>
+        <w:ind w:left="5400" w:hanging="360"/>
+      </w:pPr>
+      <w:rPr>
+        <w:rFonts w:ascii="Wingdings" w:hAnsi="Wingdings" w:hint="default"/>
+      </w:rPr>
+    </w:lvl>
+    <w:lvl w:ilvl="6" w:tplc="04090001" w:tentative="1">
+      <w:start w:val="1"/>
+      <w:numFmt w:val="bullet"/>
+      <w:lvlText w:val=""/>
+      <w:lvlJc w:val="left"/>
+      <w:pPr>
+        <w:ind w:left="6120" w:hanging="360"/>
+      </w:pPr>
+      <w:rPr>
+        <w:rFonts w:ascii="Symbol" w:hAnsi="Symbol" w:hint="default"/>
+      </w:rPr>
+    </w:lvl>
+    <w:lvl w:ilvl="7" w:tplc="04090003" w:tentative="1">
+      <w:start w:val="1"/>
+      <w:numFmt w:val="bullet"/>
+      <w:lvlText w:val="o"/>
+      <w:lvlJc w:val="left"/>
+      <w:pPr>
+        <w:ind w:left="6840" w:hanging="360"/>
+      </w:pPr>
+      <w:rPr>
+        <w:rFonts w:ascii="Courier New" w:hAnsi="Courier New" w:cs="Courier New" w:hint="default"/>
+      </w:rPr>
+    </w:lvl>
+    <w:lvl w:ilvl="8" w:tplc="04090005" w:tentative="1">
+      <w:start w:val="1"/>
+      <w:numFmt w:val="bullet"/>
+      <w:lvlText w:val=""/>
+      <w:lvlJc w:val="left"/>
+      <w:pPr>
+        <w:ind w:left="7560" w:hanging="360"/>
+      </w:pPr>
+      <w:rPr>
+        <w:rFonts w:ascii="Wingdings" w:hAnsi="Wingdings" w:hint="default"/>
+      </w:rPr>
+    </w:lvl>
+  </w:abstractNum>
+  <w:abstractNum w:abstractNumId="3">
     <w:nsid w:val="34CC260E"/>
     <w:multiLevelType w:val="hybridMultilevel"/>
     <w:tmpl w:val="B5C841D0"/>
@@ -1641,7 +1873,7 @@
       </w:rPr>
     </w:lvl>
   </w:abstractNum>
-  <w:abstractNum w:abstractNumId="3">
+  <w:abstractNum w:abstractNumId="4">
     <w:nsid w:val="34FF4EDC"/>
     <w:multiLevelType w:val="hybridMultilevel"/>
     <w:tmpl w:val="17846B00"/>
@@ -1753,7 +1985,7 @@
       </w:rPr>
     </w:lvl>
   </w:abstractNum>
-  <w:abstractNum w:abstractNumId="4">
+  <w:abstractNum w:abstractNumId="5">
     <w:nsid w:val="354552A6"/>
     <w:multiLevelType w:val="hybridMultilevel"/>
     <w:tmpl w:val="C9020C54"/>
@@ -1866,7 +2098,93 @@
       </w:rPr>
     </w:lvl>
   </w:abstractNum>
-  <w:abstractNum w:abstractNumId="5">
+  <w:abstractNum w:abstractNumId="6">
+    <w:nsid w:val="398E4A83"/>
+    <w:multiLevelType w:val="hybridMultilevel"/>
+    <w:tmpl w:val="816CA948"/>
+    <w:lvl w:ilvl="0" w:tplc="0409000F">
+      <w:start w:val="1"/>
+      <w:numFmt w:val="decimal"/>
+      <w:lvlText w:val="%1."/>
+      <w:lvlJc w:val="left"/>
+      <w:pPr>
+        <w:ind w:left="1800" w:hanging="360"/>
+      </w:pPr>
+    </w:lvl>
+    <w:lvl w:ilvl="1" w:tplc="04090019" w:tentative="1">
+      <w:start w:val="1"/>
+      <w:numFmt w:val="lowerLetter"/>
+      <w:lvlText w:val="%2."/>
+      <w:lvlJc w:val="left"/>
+      <w:pPr>
+        <w:ind w:left="2520" w:hanging="360"/>
+      </w:pPr>
+    </w:lvl>
+    <w:lvl w:ilvl="2" w:tplc="0409001B" w:tentative="1">
+      <w:start w:val="1"/>
+      <w:numFmt w:val="lowerRoman"/>
+      <w:lvlText w:val="%3."/>
+      <w:lvlJc w:val="right"/>
+      <w:pPr>
+        <w:ind w:left="3240" w:hanging="180"/>
+      </w:pPr>
+    </w:lvl>
+    <w:lvl w:ilvl="3" w:tplc="0409000F" w:tentative="1">
+      <w:start w:val="1"/>
+      <w:numFmt w:val="decimal"/>
+      <w:lvlText w:val="%4."/>
+      <w:lvlJc w:val="left"/>
+      <w:pPr>
+        <w:ind w:left="3960" w:hanging="360"/>
+      </w:pPr>
+    </w:lvl>
+    <w:lvl w:ilvl="4" w:tplc="04090019" w:tentative="1">
+      <w:start w:val="1"/>
+      <w:numFmt w:val="lowerLetter"/>
+      <w:lvlText w:val="%5."/>
+      <w:lvlJc w:val="left"/>
+      <w:pPr>
+        <w:ind w:left="4680" w:hanging="360"/>
+      </w:pPr>
+    </w:lvl>
+    <w:lvl w:ilvl="5" w:tplc="0409001B" w:tentative="1">
+      <w:start w:val="1"/>
+      <w:numFmt w:val="lowerRoman"/>
+      <w:lvlText w:val="%6."/>
+      <w:lvlJc w:val="right"/>
+      <w:pPr>
+        <w:ind w:left="5400" w:hanging="180"/>
+      </w:pPr>
+    </w:lvl>
+    <w:lvl w:ilvl="6" w:tplc="0409000F" w:tentative="1">
+      <w:start w:val="1"/>
+      <w:numFmt w:val="decimal"/>
+      <w:lvlText w:val="%7."/>
+      <w:lvlJc w:val="left"/>
+      <w:pPr>
+        <w:ind w:left="6120" w:hanging="360"/>
+      </w:pPr>
+    </w:lvl>
+    <w:lvl w:ilvl="7" w:tplc="04090019" w:tentative="1">
+      <w:start w:val="1"/>
+      <w:numFmt w:val="lowerLetter"/>
+      <w:lvlText w:val="%8."/>
+      <w:lvlJc w:val="left"/>
+      <w:pPr>
+        <w:ind w:left="6840" w:hanging="360"/>
+      </w:pPr>
+    </w:lvl>
+    <w:lvl w:ilvl="8" w:tplc="0409001B" w:tentative="1">
+      <w:start w:val="1"/>
+      <w:numFmt w:val="lowerRoman"/>
+      <w:lvlText w:val="%9."/>
+      <w:lvlJc w:val="right"/>
+      <w:pPr>
+        <w:ind w:left="7560" w:hanging="180"/>
+      </w:pPr>
+    </w:lvl>
+  </w:abstractNum>
+  <w:abstractNum w:abstractNumId="7">
     <w:nsid w:val="419B2833"/>
     <w:multiLevelType w:val="hybridMultilevel"/>
     <w:tmpl w:val="F1200C94"/>
@@ -1978,7 +2296,7 @@
       </w:rPr>
     </w:lvl>
   </w:abstractNum>
-  <w:abstractNum w:abstractNumId="6">
+  <w:abstractNum w:abstractNumId="8">
     <w:nsid w:val="53BE79AD"/>
     <w:multiLevelType w:val="hybridMultilevel"/>
     <w:tmpl w:val="85DEFE72"/>
@@ -2091,7 +2409,7 @@
       </w:rPr>
     </w:lvl>
   </w:abstractNum>
-  <w:abstractNum w:abstractNumId="7">
+  <w:abstractNum w:abstractNumId="9">
     <w:nsid w:val="62CB5D83"/>
     <w:multiLevelType w:val="hybridMultilevel"/>
     <w:tmpl w:val="2F425586"/>
@@ -2204,7 +2522,7 @@
       </w:rPr>
     </w:lvl>
   </w:abstractNum>
-  <w:abstractNum w:abstractNumId="8">
+  <w:abstractNum w:abstractNumId="10">
     <w:nsid w:val="788B4035"/>
     <w:multiLevelType w:val="hybridMultilevel"/>
     <w:tmpl w:val="0B446D40"/>
@@ -2321,28 +2639,34 @@
     <w:abstractNumId w:val="1"/>
   </w:num>
   <w:num w:numId="2">
-    <w:abstractNumId w:val="2"/>
+    <w:abstractNumId w:val="3"/>
   </w:num>
   <w:num w:numId="3">
-    <w:abstractNumId w:val="6"/>
+    <w:abstractNumId w:val="8"/>
   </w:num>
   <w:num w:numId="4">
-    <w:abstractNumId w:val="4"/>
+    <w:abstractNumId w:val="5"/>
   </w:num>
   <w:num w:numId="5">
     <w:abstractNumId w:val="0"/>
   </w:num>
   <w:num w:numId="6">
-    <w:abstractNumId w:val="8"/>
+    <w:abstractNumId w:val="10"/>
   </w:num>
   <w:num w:numId="7">
+    <w:abstractNumId w:val="9"/>
+  </w:num>
+  <w:num w:numId="8">
     <w:abstractNumId w:val="7"/>
   </w:num>
-  <w:num w:numId="8">
-    <w:abstractNumId w:val="5"/>
+  <w:num w:numId="9">
+    <w:abstractNumId w:val="4"/>
   </w:num>
-  <w:num w:numId="9">
-    <w:abstractNumId w:val="3"/>
+  <w:num w:numId="10">
+    <w:abstractNumId w:val="6"/>
+  </w:num>
+  <w:num w:numId="11">
+    <w:abstractNumId w:val="2"/>
   </w:num>
 </w:numbering>
 </file>

</xml_diff>

<commit_message>
update: Srcipt Create Path Graph
</commit_message>
<xml_diff>
--- a/Document.docx
+++ b/Document.docx
@@ -1231,8 +1231,91 @@
           <w:lang w:val="vi-VN"/>
         </w:rPr>
       </w:pPr>
+      <w:r>
+        <w:rPr>
+          <w:rFonts w:ascii="Times New Roman" w:hAnsi="Times New Roman" w:cs="Times New Roman"/>
+          <w:sz w:val="28"/>
+          <w:lang w:val="vi-VN"/>
+        </w:rPr>
+        <w:t>Hệ thống tìm đường đi ngắn nhất đến vị trí chỉ định bằng thuật toán</w:t>
+      </w:r>
+    </w:p>
+    <w:p>
+      <w:pPr>
+        <w:pStyle w:val="ListParagraph"/>
+        <w:numPr>
+          <w:ilvl w:val="0"/>
+          <w:numId w:val="12"/>
+        </w:numPr>
+        <w:rPr>
+          <w:rFonts w:ascii="Times New Roman" w:hAnsi="Times New Roman" w:cs="Times New Roman"/>
+          <w:sz w:val="28"/>
+          <w:lang w:val="vi-VN"/>
+        </w:rPr>
+      </w:pPr>
+      <w:r>
+        <w:rPr>
+          <w:rFonts w:ascii="Times New Roman" w:hAnsi="Times New Roman" w:cs="Times New Roman"/>
+          <w:sz w:val="28"/>
+          <w:lang w:val="vi-VN"/>
+        </w:rPr>
+        <w:lastRenderedPageBreak/>
+        <w:t>Hệ thống đồ thị được xây dựng bằng cách đọc các tile của tilemap. Trong đó thì có 2 loại tilemap: một loại là sẽ gộp các vị trí chứa các tile của tilemap lại để thành 1 đồ thị đường đi, và một loại là các tile trong đó sẽ xóa bỏ các tile trong đồ thị đường đi để biểu thị là cùng 1 tầng nhưng những tile đó không thể đi được và bị chặn</w:t>
+      </w:r>
+    </w:p>
+    <w:p>
+      <w:pPr>
+        <w:pStyle w:val="ListParagraph"/>
+        <w:numPr>
+          <w:ilvl w:val="0"/>
+          <w:numId w:val="12"/>
+        </w:numPr>
+        <w:rPr>
+          <w:rFonts w:ascii="Times New Roman" w:hAnsi="Times New Roman" w:cs="Times New Roman"/>
+          <w:sz w:val="28"/>
+          <w:lang w:val="vi-VN"/>
+        </w:rPr>
+      </w:pPr>
+      <w:r>
+        <w:rPr>
+          <w:rFonts w:ascii="Times New Roman" w:hAnsi="Times New Roman" w:cs="Times New Roman"/>
+          <w:sz w:val="28"/>
+          <w:lang w:val="vi-VN"/>
+        </w:rPr>
+        <w:t xml:space="preserve">Hệ thống node trong đó phải lưu được vị trí chuyển tầng là cầu thang. </w:t>
+      </w:r>
       <w:bookmarkStart w:id="0" w:name="_GoBack"/>
+      <w:r>
+        <w:rPr>
+          <w:rFonts w:ascii="Times New Roman" w:hAnsi="Times New Roman" w:cs="Times New Roman"/>
+          <w:sz w:val="28"/>
+          <w:lang w:val="vi-VN"/>
+        </w:rPr>
+        <w:t>Nên lưu các tile cầu thang như nào?</w:t>
+      </w:r>
       <w:bookmarkEnd w:id="0"/>
+    </w:p>
+    <w:p>
+      <w:pPr>
+        <w:pStyle w:val="ListParagraph"/>
+        <w:numPr>
+          <w:ilvl w:val="0"/>
+          <w:numId w:val="12"/>
+        </w:numPr>
+        <w:rPr>
+          <w:rFonts w:ascii="Times New Roman" w:hAnsi="Times New Roman" w:cs="Times New Roman"/>
+          <w:sz w:val="28"/>
+          <w:lang w:val="vi-VN"/>
+        </w:rPr>
+      </w:pPr>
+      <w:r>
+        <w:rPr>
+          <w:rFonts w:ascii="Times New Roman" w:hAnsi="Times New Roman" w:cs="Times New Roman"/>
+          <w:sz w:val="28"/>
+          <w:lang w:val="vi-VN"/>
+        </w:rPr>
+        <w:t>Hệ thống tìm đường đa tầng bằng cách liên tục gọi tìm đường từ điểm xuất phát đến điểm chuyển tầng, nếu không phải tầng này thì tiếp tục từ điểm chuyển tầng đến điểm chuyển tầng, lặp lại cho đến khi đến tầng chứa điểm đích, và từ điểm chuyển tầng đến đích</w:t>
+      </w:r>
     </w:p>
     <w:p>
       <w:pPr>

</xml_diff>

<commit_message>
update: basic register unit in editor mode
</commit_message>
<xml_diff>
--- a/Document.docx
+++ b/Document.docx
@@ -842,8 +842,6 @@
         </w:rPr>
         <w:t xml:space="preserve">State Machine </w:t>
       </w:r>
-      <w:bookmarkStart w:id="0" w:name="_GoBack"/>
-      <w:bookmarkEnd w:id="0"/>
     </w:p>
     <w:p>
       <w:pPr>
@@ -909,7 +907,7 @@
           <w:sz w:val="36"/>
           <w:lang w:val="vi-VN"/>
         </w:rPr>
-        <w:t xml:space="preserve">chức năng </w:t>
+        <w:t>hệ thống</w:t>
       </w:r>
       <w:r>
         <w:rPr>
@@ -918,6 +916,15 @@
           <w:sz w:val="36"/>
           <w:lang w:val="vi-VN"/>
         </w:rPr>
+        <w:t xml:space="preserve"> </w:t>
+      </w:r>
+      <w:r>
+        <w:rPr>
+          <w:rFonts w:ascii="Times New Roman" w:hAnsi="Times New Roman" w:cs="Times New Roman"/>
+          <w:b/>
+          <w:sz w:val="36"/>
+          <w:lang w:val="vi-VN"/>
+        </w:rPr>
         <w:t>chính:</w:t>
       </w:r>
     </w:p>
@@ -949,156 +956,143 @@
           <w:sz w:val="28"/>
           <w:lang w:val="vi-VN"/>
         </w:rPr>
-        <w:t xml:space="preserve"> Người chơi có thể sử dụng tile để thiết kế map cho mình </w:t>
-      </w:r>
-    </w:p>
-    <w:p>
-      <w:pPr>
-        <w:pStyle w:val="ListParagraph"/>
-        <w:numPr>
-          <w:ilvl w:val="0"/>
-          <w:numId w:val="6"/>
-        </w:numPr>
-        <w:rPr>
-          <w:rFonts w:ascii="Times New Roman" w:hAnsi="Times New Roman" w:cs="Times New Roman"/>
-          <w:sz w:val="28"/>
-          <w:lang w:val="vi-VN"/>
-        </w:rPr>
-      </w:pPr>
-      <w:r>
-        <w:rPr>
-          <w:rFonts w:ascii="Times New Roman" w:hAnsi="Times New Roman" w:cs="Times New Roman"/>
-          <w:sz w:val="28"/>
-          <w:lang w:val="vi-VN"/>
-        </w:rPr>
-        <w:t>Sử dụng shader để hiển thị grid</w:t>
-      </w:r>
-      <w:r>
-        <w:rPr>
-          <w:rFonts w:ascii="Times New Roman" w:hAnsi="Times New Roman" w:cs="Times New Roman"/>
-          <w:sz w:val="28"/>
-          <w:lang w:val="vi-VN"/>
-        </w:rPr>
-        <w:t xml:space="preserve"> để player có thể căn vị trí đặt các tile</w:t>
-      </w:r>
-    </w:p>
-    <w:p>
-      <w:pPr>
-        <w:pStyle w:val="ListParagraph"/>
-        <w:numPr>
-          <w:ilvl w:val="0"/>
-          <w:numId w:val="6"/>
-        </w:numPr>
-        <w:rPr>
-          <w:rFonts w:ascii="Times New Roman" w:hAnsi="Times New Roman" w:cs="Times New Roman"/>
-          <w:sz w:val="28"/>
-          <w:lang w:val="vi-VN"/>
-        </w:rPr>
-      </w:pPr>
-      <w:r>
-        <w:rPr>
-          <w:rFonts w:ascii="Times New Roman" w:hAnsi="Times New Roman" w:cs="Times New Roman"/>
-          <w:sz w:val="28"/>
-          <w:lang w:val="vi-VN"/>
-        </w:rPr>
-        <w:t>Có thể vẽ và xóa ngay trong game</w:t>
-      </w:r>
-    </w:p>
-    <w:p>
-      <w:pPr>
-        <w:pStyle w:val="ListParagraph"/>
-        <w:numPr>
-          <w:ilvl w:val="0"/>
-          <w:numId w:val="6"/>
-        </w:numPr>
-        <w:rPr>
-          <w:rFonts w:ascii="Times New Roman" w:hAnsi="Times New Roman" w:cs="Times New Roman"/>
-          <w:sz w:val="28"/>
-          <w:lang w:val="vi-VN"/>
-        </w:rPr>
-      </w:pPr>
-      <w:r>
-        <w:rPr>
-          <w:rFonts w:ascii="Times New Roman" w:hAnsi="Times New Roman" w:cs="Times New Roman"/>
-          <w:sz w:val="28"/>
-          <w:lang w:val="vi-VN"/>
-        </w:rPr>
-        <w:t>Mỗi tile sẽ yêu cầu có nền tile trước để đặt tile đó lên, ví dụ sand sẽ cần foam để đặt lên. Nếu không có nền trước thì không thể đặt tile lên được</w:t>
-      </w:r>
-      <w:r>
-        <w:rPr>
-          <w:rFonts w:ascii="Times New Roman" w:hAnsi="Times New Roman" w:cs="Times New Roman"/>
-          <w:sz w:val="28"/>
-          <w:lang w:val="vi-VN"/>
-        </w:rPr>
-        <w:t>. Cách làm ở đây là sử dụng scriptableobject để custom những tilemap yêu cầu có tile ở đó thì mới đặt được tile cần đặt lên. Ví dụ như sand cần có foam thì mới được đặt lên.</w:t>
-      </w:r>
-    </w:p>
-    <w:p>
-      <w:pPr>
-        <w:pStyle w:val="ListParagraph"/>
-        <w:numPr>
-          <w:ilvl w:val="0"/>
-          <w:numId w:val="6"/>
-        </w:numPr>
-        <w:rPr>
-          <w:rFonts w:ascii="Times New Roman" w:hAnsi="Times New Roman" w:cs="Times New Roman"/>
-          <w:sz w:val="28"/>
-          <w:lang w:val="vi-VN"/>
-        </w:rPr>
-      </w:pPr>
-      <w:r>
-        <w:rPr>
-          <w:rFonts w:ascii="Times New Roman" w:hAnsi="Times New Roman" w:cs="Times New Roman"/>
-          <w:sz w:val="28"/>
-          <w:lang w:val="vi-VN"/>
-        </w:rPr>
-        <w:t xml:space="preserve">Khi chọn 1 tile mà có thể đặt được thì ô đấy sẽ hiện màu xanh và ngược lại sẽ hiện màu đỏ </w:t>
-      </w:r>
-    </w:p>
-    <w:p>
-      <w:pPr>
-        <w:pStyle w:val="ListParagraph"/>
-        <w:numPr>
-          <w:ilvl w:val="0"/>
-          <w:numId w:val="6"/>
-        </w:numPr>
-        <w:rPr>
-          <w:rFonts w:ascii="Times New Roman" w:hAnsi="Times New Roman" w:cs="Times New Roman"/>
-          <w:sz w:val="28"/>
-          <w:lang w:val="vi-VN"/>
-        </w:rPr>
-      </w:pPr>
-      <w:r>
-        <w:rPr>
-          <w:rFonts w:ascii="Times New Roman" w:hAnsi="Times New Roman" w:cs="Times New Roman"/>
-          <w:sz w:val="28"/>
-          <w:lang w:val="vi-VN"/>
-        </w:rPr>
-        <w:t xml:space="preserve">Mỗi tile có thể thiết lập link tới 1 tile nào đó. Nếu xóa tile đó đi thì tile được link cũng sẽ bị xóa. </w:t>
-      </w:r>
-    </w:p>
-    <w:p>
-      <w:pPr>
-        <w:pStyle w:val="ListParagraph"/>
-        <w:numPr>
-          <w:ilvl w:val="0"/>
-          <w:numId w:val="6"/>
-        </w:numPr>
-        <w:rPr>
-          <w:rFonts w:ascii="Times New Roman" w:hAnsi="Times New Roman" w:cs="Times New Roman"/>
-          <w:sz w:val="28"/>
-          <w:lang w:val="vi-VN"/>
-        </w:rPr>
-      </w:pPr>
-      <w:r>
-        <w:rPr>
-          <w:rFonts w:ascii="Times New Roman" w:hAnsi="Times New Roman" w:cs="Times New Roman"/>
-          <w:sz w:val="28"/>
-          <w:lang w:val="vi-VN"/>
-        </w:rPr>
-        <w:t xml:space="preserve">Khi xóa 1 tile ở dưới đáy như foam thì toàn bộ tile ở bên trên cũng sẽ bị xóa </w:t>
-      </w:r>
+        <w:t xml:space="preserve"> </w:t>
+      </w:r>
+      <w:r>
+        <w:rPr>
+          <w:rFonts w:ascii="Times New Roman" w:hAnsi="Times New Roman" w:cs="Times New Roman"/>
+          <w:sz w:val="28"/>
+          <w:lang w:val="vi-VN"/>
+        </w:rPr>
+        <w:t>Người chơi sử dụng chức năng này để đặt công trình và xây dựng công trình</w:t>
+      </w:r>
+    </w:p>
+    <w:p>
+      <w:pPr>
+        <w:pStyle w:val="ListParagraph"/>
+        <w:numPr>
+          <w:ilvl w:val="0"/>
+          <w:numId w:val="20"/>
+        </w:numPr>
+        <w:rPr>
+          <w:rFonts w:ascii="Times New Roman" w:hAnsi="Times New Roman" w:cs="Times New Roman"/>
+          <w:sz w:val="28"/>
+          <w:lang w:val="vi-VN"/>
+        </w:rPr>
+      </w:pPr>
+      <w:r>
+        <w:rPr>
+          <w:rFonts w:ascii="Times New Roman" w:hAnsi="Times New Roman" w:cs="Times New Roman"/>
+          <w:sz w:val="28"/>
+          <w:lang w:val="vi-VN"/>
+        </w:rPr>
+        <w:t>Khi mở editor mode lên sẽ lấy layerIndex hiện tại của tầng mà nhân vật đang đứng để gán cho layerIndex mà editor mode khi bật lên sẽ target đến</w:t>
+      </w:r>
+    </w:p>
+    <w:p>
+      <w:pPr>
+        <w:pStyle w:val="ListParagraph"/>
+        <w:numPr>
+          <w:ilvl w:val="0"/>
+          <w:numId w:val="20"/>
+        </w:numPr>
+        <w:rPr>
+          <w:rFonts w:ascii="Times New Roman" w:hAnsi="Times New Roman" w:cs="Times New Roman"/>
+          <w:sz w:val="28"/>
+          <w:lang w:val="vi-VN"/>
+        </w:rPr>
+      </w:pPr>
+      <w:r>
+        <w:rPr>
+          <w:rFonts w:ascii="Times New Roman" w:hAnsi="Times New Roman" w:cs="Times New Roman"/>
+          <w:sz w:val="28"/>
+          <w:lang w:val="vi-VN"/>
+        </w:rPr>
+        <w:t>Editor mode sẽ có ribbons để thể hiện currentLayerIndex mà editor target đến, nhấn các số 1,2,3 trên bàn phím để đổi tầng</w:t>
+      </w:r>
+    </w:p>
+    <w:p>
+      <w:pPr>
+        <w:pStyle w:val="ListParagraph"/>
+        <w:numPr>
+          <w:ilvl w:val="0"/>
+          <w:numId w:val="20"/>
+        </w:numPr>
+        <w:rPr>
+          <w:rFonts w:ascii="Times New Roman" w:hAnsi="Times New Roman" w:cs="Times New Roman"/>
+          <w:sz w:val="28"/>
+          <w:lang w:val="vi-VN"/>
+        </w:rPr>
+      </w:pPr>
+      <w:r>
+        <w:rPr>
+          <w:rFonts w:ascii="Times New Roman" w:hAnsi="Times New Roman" w:cs="Times New Roman"/>
+          <w:sz w:val="28"/>
+          <w:lang w:val="vi-VN"/>
+        </w:rPr>
+        <w:t xml:space="preserve">Có thể nhấn giữ vào nhân vật để kéo và di chuyển đến nơi khác, khi thả chuột ra thì sẽ đặt nhân vật tại đó. </w:t>
+      </w:r>
+    </w:p>
+    <w:p>
+      <w:pPr>
+        <w:pStyle w:val="ListParagraph"/>
+        <w:numPr>
+          <w:ilvl w:val="0"/>
+          <w:numId w:val="5"/>
+        </w:numPr>
+        <w:ind w:left="1800"/>
+        <w:rPr>
+          <w:rFonts w:ascii="Times New Roman" w:hAnsi="Times New Roman" w:cs="Times New Roman"/>
+          <w:sz w:val="28"/>
+          <w:lang w:val="vi-VN"/>
+        </w:rPr>
+      </w:pPr>
+      <w:r>
+        <w:rPr>
+          <w:rFonts w:ascii="Times New Roman" w:hAnsi="Times New Roman" w:cs="Times New Roman"/>
+          <w:sz w:val="28"/>
+          <w:lang w:val="vi-VN"/>
+        </w:rPr>
+        <w:t>Nếu nhân vật đang trong trạng thái rảnh mà kéo vào một công trình thì sẽ đăng kí nhân vật vào công trình đó và chuyển sang trạng thái khác.</w:t>
+      </w:r>
+    </w:p>
+    <w:p>
+      <w:pPr>
+        <w:pStyle w:val="ListParagraph"/>
+        <w:numPr>
+          <w:ilvl w:val="0"/>
+          <w:numId w:val="5"/>
+        </w:numPr>
+        <w:ind w:left="1800"/>
+        <w:rPr>
+          <w:rFonts w:ascii="Times New Roman" w:hAnsi="Times New Roman" w:cs="Times New Roman"/>
+          <w:sz w:val="28"/>
+          <w:lang w:val="vi-VN"/>
+        </w:rPr>
+      </w:pPr>
+      <w:r>
+        <w:rPr>
+          <w:rFonts w:ascii="Times New Roman" w:hAnsi="Times New Roman" w:cs="Times New Roman"/>
+          <w:sz w:val="28"/>
+          <w:lang w:val="vi-VN"/>
+        </w:rPr>
+        <w:t>Nếu đang trong trạng thái đã đăng kí vào công trình thì khi kéo đi chỗ khác sẽ đăng kí nhân vật vào công trình mới và hủy đăng kí ở công trình cũ</w:t>
+      </w:r>
+    </w:p>
+    <w:p>
+      <w:pPr>
+        <w:pStyle w:val="ListParagraph"/>
+        <w:numPr>
+          <w:ilvl w:val="0"/>
+          <w:numId w:val="21"/>
+        </w:numPr>
+        <w:ind w:left="1440"/>
+        <w:rPr>
+          <w:rFonts w:ascii="Times New Roman" w:hAnsi="Times New Roman" w:cs="Times New Roman"/>
+          <w:sz w:val="28"/>
+          <w:lang w:val="vi-VN"/>
+        </w:rPr>
+      </w:pPr>
     </w:p>
     <w:p>
       <w:pPr>
@@ -1243,8 +1237,8 @@
       <w:r>
         <w:rPr>
           <w:rFonts w:ascii="Times New Roman" w:hAnsi="Times New Roman" w:cs="Times New Roman"/>
-          <w:sz w:val="28"/>
-          <w:lang w:val="vi-VN"/>
+          <w:noProof/>
+          <w:sz w:val="28"/>
         </w:rPr>
         <w:lastRenderedPageBreak/>
         <w:drawing>
@@ -1459,8 +1453,8 @@
         <w:rPr>
           <w:rFonts w:ascii="Times New Roman" w:hAnsi="Times New Roman" w:cs="Times New Roman"/>
           <w:b/>
-          <w:sz w:val="28"/>
-          <w:lang w:val="vi-VN"/>
+          <w:noProof/>
+          <w:sz w:val="28"/>
         </w:rPr>
         <w:drawing>
           <wp:inline distT="0" distB="0" distL="0" distR="0" wp14:anchorId="7908250A" wp14:editId="0C19B705">
@@ -1708,8 +1702,8 @@
       <w:r>
         <w:rPr>
           <w:rFonts w:ascii="Times New Roman" w:hAnsi="Times New Roman" w:cs="Times New Roman"/>
-          <w:sz w:val="28"/>
-          <w:lang w:val="vi-VN"/>
+          <w:noProof/>
+          <w:sz w:val="28"/>
         </w:rPr>
         <w:drawing>
           <wp:inline distT="0" distB="0" distL="0" distR="0" wp14:anchorId="717B3D2E" wp14:editId="1F72430F">
@@ -1807,6 +1801,44 @@
     </w:p>
     <w:p>
       <w:pPr>
+        <w:pStyle w:val="ListParagraph"/>
+        <w:rPr>
+          <w:rFonts w:ascii="Times New Roman" w:hAnsi="Times New Roman" w:cs="Times New Roman"/>
+          <w:b/>
+          <w:sz w:val="28"/>
+          <w:lang w:val="vi-VN"/>
+        </w:rPr>
+      </w:pPr>
+      <w:bookmarkStart w:id="0" w:name="_GoBack"/>
+      <w:bookmarkEnd w:id="0"/>
+    </w:p>
+    <w:p>
+      <w:pPr>
+        <w:pStyle w:val="ListParagraph"/>
+        <w:rPr>
+          <w:rFonts w:ascii="Times New Roman" w:hAnsi="Times New Roman" w:cs="Times New Roman"/>
+          <w:sz w:val="28"/>
+        </w:rPr>
+      </w:pPr>
+      <w:r>
+        <w:rPr>
+          <w:rFonts w:ascii="Times New Roman" w:hAnsi="Times New Roman" w:cs="Times New Roman"/>
+          <w:sz w:val="28"/>
+          <w:lang w:val="vi-VN"/>
+        </w:rPr>
+        <w:t xml:space="preserve">Dữ liệu về công trình và nhân vật được lưu trong file json. Khi </w:t>
+      </w:r>
+      <w:r>
+        <w:rPr>
+          <w:rFonts w:ascii="Times New Roman" w:hAnsi="Times New Roman" w:cs="Times New Roman"/>
+          <w:sz w:val="28"/>
+          <w:lang w:val="vi-VN"/>
+        </w:rPr>
+        <w:t>trong editor mode, khi thay đổi về nhân vật, công trình sẽ lưu các thay đổi lại và khi nhấn lưu sẽ cập nhật lại thay đổi vào file json</w:t>
+      </w:r>
+    </w:p>
+    <w:p>
+      <w:pPr>
         <w:rPr>
           <w:rFonts w:ascii="Times New Roman" w:hAnsi="Times New Roman" w:cs="Times New Roman"/>
           <w:sz w:val="28"/>
@@ -2160,8 +2192,8 @@
         <w:rPr>
           <w:rFonts w:ascii="Times New Roman" w:hAnsi="Times New Roman" w:cs="Times New Roman"/>
           <w:b/>
-          <w:sz w:val="28"/>
-          <w:lang w:val="vi-VN"/>
+          <w:noProof/>
+          <w:sz w:val="28"/>
         </w:rPr>
         <w:drawing>
           <wp:inline distT="0" distB="0" distL="0" distR="0" wp14:anchorId="0600D781" wp14:editId="50377804">
@@ -2339,6 +2371,7 @@
           <w:sz w:val="28"/>
           <w:lang w:val="vi-VN"/>
         </w:rPr>
+        <w:lastRenderedPageBreak/>
         <w:t xml:space="preserve">PathSegment: </w:t>
       </w:r>
       <w:r>
@@ -2414,7 +2447,6 @@
           <w:sz w:val="28"/>
           <w:lang w:val="vi-VN"/>
         </w:rPr>
-        <w:lastRenderedPageBreak/>
         <w:t>Pathfindin</w:t>
       </w:r>
       <w:r>
@@ -2446,8 +2478,8 @@
       <w:r>
         <w:rPr>
           <w:rFonts w:ascii="Times New Roman" w:hAnsi="Times New Roman" w:cs="Times New Roman"/>
-          <w:sz w:val="28"/>
-          <w:lang w:val="vi-VN"/>
+          <w:noProof/>
+          <w:sz w:val="28"/>
         </w:rPr>
         <w:drawing>
           <wp:inline distT="0" distB="0" distL="0" distR="0" wp14:anchorId="44B06423" wp14:editId="1FFF748D">
@@ -2721,7 +2753,7 @@
   <w:abstractNum w:abstractNumId="0">
     <w:nsid w:val="06D82F64"/>
     <w:multiLevelType w:val="hybridMultilevel"/>
-    <w:tmpl w:val="F9502BB2"/>
+    <w:tmpl w:val="906E63EA"/>
     <w:lvl w:ilvl="0" w:tplc="04090001">
       <w:start w:val="1"/>
       <w:numFmt w:val="bullet"/>
@@ -2832,6 +2864,118 @@
     </w:lvl>
   </w:abstractNum>
   <w:abstractNum w:abstractNumId="1">
+    <w:nsid w:val="0C6777D2"/>
+    <w:multiLevelType w:val="hybridMultilevel"/>
+    <w:tmpl w:val="24843D16"/>
+    <w:lvl w:ilvl="0" w:tplc="A52AEB74">
+      <w:numFmt w:val="bullet"/>
+      <w:lvlText w:val="-"/>
+      <w:lvlJc w:val="left"/>
+      <w:pPr>
+        <w:ind w:left="1440" w:hanging="360"/>
+      </w:pPr>
+      <w:rPr>
+        <w:rFonts w:ascii="Times New Roman" w:eastAsiaTheme="minorHAnsi" w:hAnsi="Times New Roman" w:cs="Times New Roman" w:hint="default"/>
+      </w:rPr>
+    </w:lvl>
+    <w:lvl w:ilvl="1" w:tplc="04090003" w:tentative="1">
+      <w:start w:val="1"/>
+      <w:numFmt w:val="bullet"/>
+      <w:lvlText w:val="o"/>
+      <w:lvlJc w:val="left"/>
+      <w:pPr>
+        <w:ind w:left="2160" w:hanging="360"/>
+      </w:pPr>
+      <w:rPr>
+        <w:rFonts w:ascii="Courier New" w:hAnsi="Courier New" w:cs="Courier New" w:hint="default"/>
+      </w:rPr>
+    </w:lvl>
+    <w:lvl w:ilvl="2" w:tplc="04090005" w:tentative="1">
+      <w:start w:val="1"/>
+      <w:numFmt w:val="bullet"/>
+      <w:lvlText w:val=""/>
+      <w:lvlJc w:val="left"/>
+      <w:pPr>
+        <w:ind w:left="2880" w:hanging="360"/>
+      </w:pPr>
+      <w:rPr>
+        <w:rFonts w:ascii="Wingdings" w:hAnsi="Wingdings" w:hint="default"/>
+      </w:rPr>
+    </w:lvl>
+    <w:lvl w:ilvl="3" w:tplc="04090001" w:tentative="1">
+      <w:start w:val="1"/>
+      <w:numFmt w:val="bullet"/>
+      <w:lvlText w:val=""/>
+      <w:lvlJc w:val="left"/>
+      <w:pPr>
+        <w:ind w:left="3600" w:hanging="360"/>
+      </w:pPr>
+      <w:rPr>
+        <w:rFonts w:ascii="Symbol" w:hAnsi="Symbol" w:hint="default"/>
+      </w:rPr>
+    </w:lvl>
+    <w:lvl w:ilvl="4" w:tplc="04090003" w:tentative="1">
+      <w:start w:val="1"/>
+      <w:numFmt w:val="bullet"/>
+      <w:lvlText w:val="o"/>
+      <w:lvlJc w:val="left"/>
+      <w:pPr>
+        <w:ind w:left="4320" w:hanging="360"/>
+      </w:pPr>
+      <w:rPr>
+        <w:rFonts w:ascii="Courier New" w:hAnsi="Courier New" w:cs="Courier New" w:hint="default"/>
+      </w:rPr>
+    </w:lvl>
+    <w:lvl w:ilvl="5" w:tplc="04090005" w:tentative="1">
+      <w:start w:val="1"/>
+      <w:numFmt w:val="bullet"/>
+      <w:lvlText w:val=""/>
+      <w:lvlJc w:val="left"/>
+      <w:pPr>
+        <w:ind w:left="5040" w:hanging="360"/>
+      </w:pPr>
+      <w:rPr>
+        <w:rFonts w:ascii="Wingdings" w:hAnsi="Wingdings" w:hint="default"/>
+      </w:rPr>
+    </w:lvl>
+    <w:lvl w:ilvl="6" w:tplc="04090001" w:tentative="1">
+      <w:start w:val="1"/>
+      <w:numFmt w:val="bullet"/>
+      <w:lvlText w:val=""/>
+      <w:lvlJc w:val="left"/>
+      <w:pPr>
+        <w:ind w:left="5760" w:hanging="360"/>
+      </w:pPr>
+      <w:rPr>
+        <w:rFonts w:ascii="Symbol" w:hAnsi="Symbol" w:hint="default"/>
+      </w:rPr>
+    </w:lvl>
+    <w:lvl w:ilvl="7" w:tplc="04090003" w:tentative="1">
+      <w:start w:val="1"/>
+      <w:numFmt w:val="bullet"/>
+      <w:lvlText w:val="o"/>
+      <w:lvlJc w:val="left"/>
+      <w:pPr>
+        <w:ind w:left="6480" w:hanging="360"/>
+      </w:pPr>
+      <w:rPr>
+        <w:rFonts w:ascii="Courier New" w:hAnsi="Courier New" w:cs="Courier New" w:hint="default"/>
+      </w:rPr>
+    </w:lvl>
+    <w:lvl w:ilvl="8" w:tplc="04090005" w:tentative="1">
+      <w:start w:val="1"/>
+      <w:numFmt w:val="bullet"/>
+      <w:lvlText w:val=""/>
+      <w:lvlJc w:val="left"/>
+      <w:pPr>
+        <w:ind w:left="7200" w:hanging="360"/>
+      </w:pPr>
+      <w:rPr>
+        <w:rFonts w:ascii="Wingdings" w:hAnsi="Wingdings" w:hint="default"/>
+      </w:rPr>
+    </w:lvl>
+  </w:abstractNum>
+  <w:abstractNum w:abstractNumId="2">
     <w:nsid w:val="0DDF46DB"/>
     <w:multiLevelType w:val="hybridMultilevel"/>
     <w:tmpl w:val="278A569E"/>
@@ -2917,7 +3061,7 @@
       </w:pPr>
     </w:lvl>
   </w:abstractNum>
-  <w:abstractNum w:abstractNumId="2">
+  <w:abstractNum w:abstractNumId="3">
     <w:nsid w:val="0E2A0864"/>
     <w:multiLevelType w:val="hybridMultilevel"/>
     <w:tmpl w:val="3C808E38"/>
@@ -3030,7 +3174,7 @@
       </w:rPr>
     </w:lvl>
   </w:abstractNum>
-  <w:abstractNum w:abstractNumId="3">
+  <w:abstractNum w:abstractNumId="4">
     <w:nsid w:val="165E42C4"/>
     <w:multiLevelType w:val="hybridMultilevel"/>
     <w:tmpl w:val="64A2F55C"/>
@@ -3142,7 +3286,7 @@
       </w:rPr>
     </w:lvl>
   </w:abstractNum>
-  <w:abstractNum w:abstractNumId="4">
+  <w:abstractNum w:abstractNumId="5">
     <w:nsid w:val="1E4B6628"/>
     <w:multiLevelType w:val="hybridMultilevel"/>
     <w:tmpl w:val="C02625B8"/>
@@ -3255,7 +3399,7 @@
       </w:rPr>
     </w:lvl>
   </w:abstractNum>
-  <w:abstractNum w:abstractNumId="5">
+  <w:abstractNum w:abstractNumId="6">
     <w:nsid w:val="2C3D4997"/>
     <w:multiLevelType w:val="hybridMultilevel"/>
     <w:tmpl w:val="DF3ED9B8"/>
@@ -3341,7 +3485,7 @@
       </w:pPr>
     </w:lvl>
   </w:abstractNum>
-  <w:abstractNum w:abstractNumId="6">
+  <w:abstractNum w:abstractNumId="7">
     <w:nsid w:val="2F1C733D"/>
     <w:multiLevelType w:val="hybridMultilevel"/>
     <w:tmpl w:val="8F589454"/>
@@ -3453,7 +3597,119 @@
       </w:rPr>
     </w:lvl>
   </w:abstractNum>
-  <w:abstractNum w:abstractNumId="7">
+  <w:abstractNum w:abstractNumId="8">
+    <w:nsid w:val="33F90776"/>
+    <w:multiLevelType w:val="hybridMultilevel"/>
+    <w:tmpl w:val="CA162904"/>
+    <w:lvl w:ilvl="0" w:tplc="A52AEB74">
+      <w:numFmt w:val="bullet"/>
+      <w:lvlText w:val="-"/>
+      <w:lvlJc w:val="left"/>
+      <w:pPr>
+        <w:ind w:left="2160" w:hanging="360"/>
+      </w:pPr>
+      <w:rPr>
+        <w:rFonts w:ascii="Times New Roman" w:eastAsiaTheme="minorHAnsi" w:hAnsi="Times New Roman" w:cs="Times New Roman" w:hint="default"/>
+      </w:rPr>
+    </w:lvl>
+    <w:lvl w:ilvl="1" w:tplc="04090003" w:tentative="1">
+      <w:start w:val="1"/>
+      <w:numFmt w:val="bullet"/>
+      <w:lvlText w:val="o"/>
+      <w:lvlJc w:val="left"/>
+      <w:pPr>
+        <w:ind w:left="2880" w:hanging="360"/>
+      </w:pPr>
+      <w:rPr>
+        <w:rFonts w:ascii="Courier New" w:hAnsi="Courier New" w:cs="Courier New" w:hint="default"/>
+      </w:rPr>
+    </w:lvl>
+    <w:lvl w:ilvl="2" w:tplc="04090005" w:tentative="1">
+      <w:start w:val="1"/>
+      <w:numFmt w:val="bullet"/>
+      <w:lvlText w:val=""/>
+      <w:lvlJc w:val="left"/>
+      <w:pPr>
+        <w:ind w:left="3600" w:hanging="360"/>
+      </w:pPr>
+      <w:rPr>
+        <w:rFonts w:ascii="Wingdings" w:hAnsi="Wingdings" w:hint="default"/>
+      </w:rPr>
+    </w:lvl>
+    <w:lvl w:ilvl="3" w:tplc="04090001" w:tentative="1">
+      <w:start w:val="1"/>
+      <w:numFmt w:val="bullet"/>
+      <w:lvlText w:val=""/>
+      <w:lvlJc w:val="left"/>
+      <w:pPr>
+        <w:ind w:left="4320" w:hanging="360"/>
+      </w:pPr>
+      <w:rPr>
+        <w:rFonts w:ascii="Symbol" w:hAnsi="Symbol" w:hint="default"/>
+      </w:rPr>
+    </w:lvl>
+    <w:lvl w:ilvl="4" w:tplc="04090003" w:tentative="1">
+      <w:start w:val="1"/>
+      <w:numFmt w:val="bullet"/>
+      <w:lvlText w:val="o"/>
+      <w:lvlJc w:val="left"/>
+      <w:pPr>
+        <w:ind w:left="5040" w:hanging="360"/>
+      </w:pPr>
+      <w:rPr>
+        <w:rFonts w:ascii="Courier New" w:hAnsi="Courier New" w:cs="Courier New" w:hint="default"/>
+      </w:rPr>
+    </w:lvl>
+    <w:lvl w:ilvl="5" w:tplc="04090005" w:tentative="1">
+      <w:start w:val="1"/>
+      <w:numFmt w:val="bullet"/>
+      <w:lvlText w:val=""/>
+      <w:lvlJc w:val="left"/>
+      <w:pPr>
+        <w:ind w:left="5760" w:hanging="360"/>
+      </w:pPr>
+      <w:rPr>
+        <w:rFonts w:ascii="Wingdings" w:hAnsi="Wingdings" w:hint="default"/>
+      </w:rPr>
+    </w:lvl>
+    <w:lvl w:ilvl="6" w:tplc="04090001" w:tentative="1">
+      <w:start w:val="1"/>
+      <w:numFmt w:val="bullet"/>
+      <w:lvlText w:val=""/>
+      <w:lvlJc w:val="left"/>
+      <w:pPr>
+        <w:ind w:left="6480" w:hanging="360"/>
+      </w:pPr>
+      <w:rPr>
+        <w:rFonts w:ascii="Symbol" w:hAnsi="Symbol" w:hint="default"/>
+      </w:rPr>
+    </w:lvl>
+    <w:lvl w:ilvl="7" w:tplc="04090003" w:tentative="1">
+      <w:start w:val="1"/>
+      <w:numFmt w:val="bullet"/>
+      <w:lvlText w:val="o"/>
+      <w:lvlJc w:val="left"/>
+      <w:pPr>
+        <w:ind w:left="7200" w:hanging="360"/>
+      </w:pPr>
+      <w:rPr>
+        <w:rFonts w:ascii="Courier New" w:hAnsi="Courier New" w:cs="Courier New" w:hint="default"/>
+      </w:rPr>
+    </w:lvl>
+    <w:lvl w:ilvl="8" w:tplc="04090005" w:tentative="1">
+      <w:start w:val="1"/>
+      <w:numFmt w:val="bullet"/>
+      <w:lvlText w:val=""/>
+      <w:lvlJc w:val="left"/>
+      <w:pPr>
+        <w:ind w:left="7920" w:hanging="360"/>
+      </w:pPr>
+      <w:rPr>
+        <w:rFonts w:ascii="Wingdings" w:hAnsi="Wingdings" w:hint="default"/>
+      </w:rPr>
+    </w:lvl>
+  </w:abstractNum>
+  <w:abstractNum w:abstractNumId="9">
     <w:nsid w:val="34CC260E"/>
     <w:multiLevelType w:val="hybridMultilevel"/>
     <w:tmpl w:val="B5C841D0"/>
@@ -3565,7 +3821,7 @@
       </w:rPr>
     </w:lvl>
   </w:abstractNum>
-  <w:abstractNum w:abstractNumId="8">
+  <w:abstractNum w:abstractNumId="10">
     <w:nsid w:val="34FF4EDC"/>
     <w:multiLevelType w:val="hybridMultilevel"/>
     <w:tmpl w:val="17846B00"/>
@@ -3677,7 +3933,7 @@
       </w:rPr>
     </w:lvl>
   </w:abstractNum>
-  <w:abstractNum w:abstractNumId="9">
+  <w:abstractNum w:abstractNumId="11">
     <w:nsid w:val="354552A6"/>
     <w:multiLevelType w:val="hybridMultilevel"/>
     <w:tmpl w:val="C9020C54"/>
@@ -3790,7 +4046,7 @@
       </w:rPr>
     </w:lvl>
   </w:abstractNum>
-  <w:abstractNum w:abstractNumId="10">
+  <w:abstractNum w:abstractNumId="12">
     <w:nsid w:val="363B420A"/>
     <w:multiLevelType w:val="hybridMultilevel"/>
     <w:tmpl w:val="75D83F10"/>
@@ -3903,7 +4159,7 @@
       </w:rPr>
     </w:lvl>
   </w:abstractNum>
-  <w:abstractNum w:abstractNumId="11">
+  <w:abstractNum w:abstractNumId="13">
     <w:nsid w:val="398E4A83"/>
     <w:multiLevelType w:val="hybridMultilevel"/>
     <w:tmpl w:val="816CA948"/>
@@ -3989,7 +4245,7 @@
       </w:pPr>
     </w:lvl>
   </w:abstractNum>
-  <w:abstractNum w:abstractNumId="12">
+  <w:abstractNum w:abstractNumId="14">
     <w:nsid w:val="419B2833"/>
     <w:multiLevelType w:val="hybridMultilevel"/>
     <w:tmpl w:val="F1200C94"/>
@@ -4101,7 +4357,7 @@
       </w:rPr>
     </w:lvl>
   </w:abstractNum>
-  <w:abstractNum w:abstractNumId="13">
+  <w:abstractNum w:abstractNumId="15">
     <w:nsid w:val="4D033B94"/>
     <w:multiLevelType w:val="hybridMultilevel"/>
     <w:tmpl w:val="2FE84C22"/>
@@ -4190,7 +4446,7 @@
       </w:pPr>
     </w:lvl>
   </w:abstractNum>
-  <w:abstractNum w:abstractNumId="14">
+  <w:abstractNum w:abstractNumId="16">
     <w:nsid w:val="4E276DA9"/>
     <w:multiLevelType w:val="hybridMultilevel"/>
     <w:tmpl w:val="5F7C7D4A"/>
@@ -4302,7 +4558,7 @@
       </w:rPr>
     </w:lvl>
   </w:abstractNum>
-  <w:abstractNum w:abstractNumId="15">
+  <w:abstractNum w:abstractNumId="17">
     <w:nsid w:val="53BE79AD"/>
     <w:multiLevelType w:val="hybridMultilevel"/>
     <w:tmpl w:val="85DEFE72"/>
@@ -4415,7 +4671,7 @@
       </w:rPr>
     </w:lvl>
   </w:abstractNum>
-  <w:abstractNum w:abstractNumId="16">
+  <w:abstractNum w:abstractNumId="18">
     <w:nsid w:val="627569F1"/>
     <w:multiLevelType w:val="hybridMultilevel"/>
     <w:tmpl w:val="39CE228C"/>
@@ -4527,7 +4783,7 @@
       </w:rPr>
     </w:lvl>
   </w:abstractNum>
-  <w:abstractNum w:abstractNumId="17">
+  <w:abstractNum w:abstractNumId="19">
     <w:nsid w:val="62CB5D83"/>
     <w:multiLevelType w:val="hybridMultilevel"/>
     <w:tmpl w:val="2F425586"/>
@@ -4640,7 +4896,7 @@
       </w:rPr>
     </w:lvl>
   </w:abstractNum>
-  <w:abstractNum w:abstractNumId="18">
+  <w:abstractNum w:abstractNumId="20">
     <w:nsid w:val="788B4035"/>
     <w:multiLevelType w:val="hybridMultilevel"/>
     <w:tmpl w:val="0B446D40"/>
@@ -4754,61 +5010,67 @@
     </w:lvl>
   </w:abstractNum>
   <w:num w:numId="1">
-    <w:abstractNumId w:val="3"/>
+    <w:abstractNumId w:val="4"/>
   </w:num>
   <w:num w:numId="2">
-    <w:abstractNumId w:val="7"/>
+    <w:abstractNumId w:val="9"/>
   </w:num>
   <w:num w:numId="3">
-    <w:abstractNumId w:val="15"/>
+    <w:abstractNumId w:val="17"/>
   </w:num>
   <w:num w:numId="4">
-    <w:abstractNumId w:val="9"/>
+    <w:abstractNumId w:val="11"/>
   </w:num>
   <w:num w:numId="5">
     <w:abstractNumId w:val="0"/>
   </w:num>
   <w:num w:numId="6">
+    <w:abstractNumId w:val="20"/>
+  </w:num>
+  <w:num w:numId="7">
+    <w:abstractNumId w:val="19"/>
+  </w:num>
+  <w:num w:numId="8">
+    <w:abstractNumId w:val="14"/>
+  </w:num>
+  <w:num w:numId="9">
+    <w:abstractNumId w:val="10"/>
+  </w:num>
+  <w:num w:numId="10">
+    <w:abstractNumId w:val="13"/>
+  </w:num>
+  <w:num w:numId="11">
+    <w:abstractNumId w:val="5"/>
+  </w:num>
+  <w:num w:numId="12">
+    <w:abstractNumId w:val="3"/>
+  </w:num>
+  <w:num w:numId="13">
+    <w:abstractNumId w:val="15"/>
+  </w:num>
+  <w:num w:numId="14">
+    <w:abstractNumId w:val="6"/>
+  </w:num>
+  <w:num w:numId="15">
+    <w:abstractNumId w:val="2"/>
+  </w:num>
+  <w:num w:numId="16">
+    <w:abstractNumId w:val="7"/>
+  </w:num>
+  <w:num w:numId="17">
+    <w:abstractNumId w:val="16"/>
+  </w:num>
+  <w:num w:numId="18">
+    <w:abstractNumId w:val="12"/>
+  </w:num>
+  <w:num w:numId="19">
     <w:abstractNumId w:val="18"/>
   </w:num>
-  <w:num w:numId="7">
-    <w:abstractNumId w:val="17"/>
-  </w:num>
-  <w:num w:numId="8">
-    <w:abstractNumId w:val="12"/>
-  </w:num>
-  <w:num w:numId="9">
-    <w:abstractNumId w:val="8"/>
-  </w:num>
-  <w:num w:numId="10">
-    <w:abstractNumId w:val="11"/>
-  </w:num>
-  <w:num w:numId="11">
-    <w:abstractNumId w:val="4"/>
-  </w:num>
-  <w:num w:numId="12">
-    <w:abstractNumId w:val="2"/>
-  </w:num>
-  <w:num w:numId="13">
-    <w:abstractNumId w:val="13"/>
-  </w:num>
-  <w:num w:numId="14">
-    <w:abstractNumId w:val="5"/>
-  </w:num>
-  <w:num w:numId="15">
+  <w:num w:numId="20">
     <w:abstractNumId w:val="1"/>
   </w:num>
-  <w:num w:numId="16">
-    <w:abstractNumId w:val="6"/>
-  </w:num>
-  <w:num w:numId="17">
-    <w:abstractNumId w:val="14"/>
-  </w:num>
-  <w:num w:numId="18">
-    <w:abstractNumId w:val="10"/>
-  </w:num>
-  <w:num w:numId="19">
-    <w:abstractNumId w:val="16"/>
+  <w:num w:numId="21">
+    <w:abstractNumId w:val="8"/>
   </w:num>
 </w:numbering>
 </file>

</xml_diff>

<commit_message>
fix: neighbor of bridge node
</commit_message>
<xml_diff>
--- a/Document.docx
+++ b/Document.docx
@@ -1809,8 +1809,6 @@
           <w:lang w:val="vi-VN"/>
         </w:rPr>
       </w:pPr>
-      <w:bookmarkStart w:id="0" w:name="_GoBack"/>
-      <w:bookmarkEnd w:id="0"/>
     </w:p>
     <w:p>
       <w:pPr>
@@ -2679,14 +2677,60 @@
         <w:pStyle w:val="ListParagraph"/>
         <w:numPr>
           <w:ilvl w:val="0"/>
-          <w:numId w:val="9"/>
-        </w:numPr>
-        <w:rPr>
-          <w:rFonts w:ascii="Times New Roman" w:hAnsi="Times New Roman" w:cs="Times New Roman"/>
-          <w:sz w:val="28"/>
-          <w:lang w:val="vi-VN"/>
-        </w:rPr>
-      </w:pPr>
+          <w:numId w:val="13"/>
+        </w:numPr>
+        <w:rPr>
+          <w:rFonts w:ascii="Times New Roman" w:hAnsi="Times New Roman" w:cs="Times New Roman"/>
+          <w:b/>
+          <w:sz w:val="28"/>
+          <w:lang w:val="vi-VN"/>
+        </w:rPr>
+      </w:pPr>
+      <w:r>
+        <w:rPr>
+          <w:rFonts w:ascii="Times New Roman" w:hAnsi="Times New Roman" w:cs="Times New Roman"/>
+          <w:b/>
+          <w:sz w:val="28"/>
+          <w:lang w:val="vi-VN"/>
+        </w:rPr>
+        <w:t>Hệ thống auto spawn cây và động vật</w:t>
+      </w:r>
+    </w:p>
+    <w:p>
+      <w:pPr>
+        <w:rPr>
+          <w:rFonts w:ascii="Times New Roman" w:hAnsi="Times New Roman" w:cs="Times New Roman"/>
+          <w:sz w:val="28"/>
+          <w:lang w:val="vi-VN"/>
+        </w:rPr>
+      </w:pPr>
+      <w:r>
+        <w:rPr>
+          <w:rFonts w:ascii="Times New Roman" w:hAnsi="Times New Roman" w:cs="Times New Roman"/>
+          <w:sz w:val="28"/>
+          <w:lang w:val="vi-VN"/>
+        </w:rPr>
+        <w:t>Đây là hệ thống đảm bảo việc spawn cây và động vật một cách hợp lí để người chơi có thể khai thác tài nguyên</w:t>
+      </w:r>
+      <w:bookmarkStart w:id="0" w:name="_GoBack"/>
+      <w:bookmarkEnd w:id="0"/>
+    </w:p>
+    <w:p>
+      <w:pPr>
+        <w:rPr>
+          <w:rFonts w:ascii="Times New Roman" w:hAnsi="Times New Roman" w:cs="Times New Roman"/>
+          <w:sz w:val="28"/>
+          <w:lang w:val="vi-VN"/>
+        </w:rPr>
+      </w:pPr>
+      <w:r>
+        <w:rPr>
+          <w:rFonts w:ascii="Times New Roman" w:hAnsi="Times New Roman" w:cs="Times New Roman"/>
+          <w:sz w:val="28"/>
+          <w:lang w:val="vi-VN"/>
+        </w:rPr>
+        <w:t>Hệ thống sử dụng phương pháp Hybrid kết hợp giữa Noise-base Clustering và Clustering-based Spawner</w:t>
+      </w:r>
     </w:p>
     <w:sectPr>
       <w:pgSz w:w="12240" w:h="15840"/>
@@ -4360,7 +4404,7 @@
   <w:abstractNum w:abstractNumId="15">
     <w:nsid w:val="4D033B94"/>
     <w:multiLevelType w:val="hybridMultilevel"/>
-    <w:tmpl w:val="2FE84C22"/>
+    <w:tmpl w:val="DFBCD864"/>
     <w:lvl w:ilvl="0" w:tplc="0409000F">
       <w:start w:val="1"/>
       <w:numFmt w:val="decimal"/>

</xml_diff>

<commit_message>
feat: Optimize game batches with Sprite Atlas and Occlusion Culling
</commit_message>
<xml_diff>
--- a/Document.docx
+++ b/Document.docx
@@ -2712,24 +2712,170 @@
         </w:rPr>
         <w:t>Đây là hệ thống đảm bảo việc spawn cây và động vật một cách hợp lí để người chơi có thể khai thác tài nguyên</w:t>
       </w:r>
+    </w:p>
+    <w:p>
+      <w:pPr>
+        <w:rPr>
+          <w:rFonts w:ascii="Times New Roman" w:hAnsi="Times New Roman" w:cs="Times New Roman"/>
+          <w:sz w:val="28"/>
+          <w:lang w:val="vi-VN"/>
+        </w:rPr>
+      </w:pPr>
+      <w:r>
+        <w:rPr>
+          <w:rFonts w:ascii="Times New Roman" w:hAnsi="Times New Roman" w:cs="Times New Roman"/>
+          <w:sz w:val="28"/>
+          <w:lang w:val="vi-VN"/>
+        </w:rPr>
+        <w:t>Hệ thống sử dụng phương pháp Hybrid kết hợp giữa Noise-base Clustering và Clustering-based Spawner</w:t>
+      </w:r>
+    </w:p>
+    <w:p>
+      <w:pPr>
+        <w:pStyle w:val="ListParagraph"/>
+        <w:numPr>
+          <w:ilvl w:val="0"/>
+          <w:numId w:val="13"/>
+        </w:numPr>
+        <w:rPr>
+          <w:rFonts w:ascii="Times New Roman" w:hAnsi="Times New Roman" w:cs="Times New Roman"/>
+          <w:b/>
+          <w:sz w:val="28"/>
+          <w:lang w:val="vi-VN"/>
+        </w:rPr>
+      </w:pPr>
+      <w:r>
+        <w:rPr>
+          <w:rFonts w:ascii="Times New Roman" w:hAnsi="Times New Roman" w:cs="Times New Roman"/>
+          <w:b/>
+          <w:sz w:val="28"/>
+          <w:lang w:val="vi-VN"/>
+        </w:rPr>
+        <w:t>Tối ưu hiệu suất</w:t>
+      </w:r>
+    </w:p>
+    <w:p>
+      <w:pPr>
+        <w:ind w:left="360"/>
+        <w:rPr>
+          <w:rFonts w:ascii="Times New Roman" w:hAnsi="Times New Roman" w:cs="Times New Roman"/>
+          <w:sz w:val="28"/>
+          <w:lang w:val="vi-VN"/>
+        </w:rPr>
+      </w:pPr>
+      <w:r>
+        <w:rPr>
+          <w:rFonts w:ascii="Times New Roman" w:hAnsi="Times New Roman" w:cs="Times New Roman"/>
+          <w:sz w:val="28"/>
+          <w:lang w:val="vi-VN"/>
+        </w:rPr>
+        <w:t>Việc</w:t>
+      </w:r>
+      <w:r>
+        <w:rPr>
+          <w:rFonts w:ascii="Times New Roman" w:hAnsi="Times New Roman" w:cs="Times New Roman"/>
+          <w:sz w:val="28"/>
+          <w:lang w:val="vi-VN"/>
+        </w:rPr>
+        <w:t xml:space="preserve"> render toàn bộ game object trên ma</w:t>
+      </w:r>
       <w:bookmarkStart w:id="0" w:name="_GoBack"/>
       <w:bookmarkEnd w:id="0"/>
-    </w:p>
-    <w:p>
-      <w:pPr>
-        <w:rPr>
-          <w:rFonts w:ascii="Times New Roman" w:hAnsi="Times New Roman" w:cs="Times New Roman"/>
-          <w:sz w:val="28"/>
-          <w:lang w:val="vi-VN"/>
-        </w:rPr>
-      </w:pPr>
-      <w:r>
-        <w:rPr>
-          <w:rFonts w:ascii="Times New Roman" w:hAnsi="Times New Roman" w:cs="Times New Roman"/>
-          <w:sz w:val="28"/>
-          <w:lang w:val="vi-VN"/>
-        </w:rPr>
-        <w:t>Hệ thống sử dụng phương pháp Hybrid kết hợp giữa Noise-base Clustering và Clustering-based Spawner</w:t>
+      <w:r>
+        <w:rPr>
+          <w:rFonts w:ascii="Times New Roman" w:hAnsi="Times New Roman" w:cs="Times New Roman"/>
+          <w:sz w:val="28"/>
+          <w:lang w:val="vi-VN"/>
+        </w:rPr>
+        <w:t>p khiến cho game trở nên giật lag, vì vậy ta phải sử dụng các phương pháp để tối ưu hiệu suất.</w:t>
+      </w:r>
+    </w:p>
+    <w:p>
+      <w:pPr>
+        <w:pStyle w:val="ListParagraph"/>
+        <w:numPr>
+          <w:ilvl w:val="0"/>
+          <w:numId w:val="7"/>
+        </w:numPr>
+        <w:rPr>
+          <w:rFonts w:ascii="Times New Roman" w:hAnsi="Times New Roman" w:cs="Times New Roman"/>
+          <w:sz w:val="28"/>
+          <w:lang w:val="vi-VN"/>
+        </w:rPr>
+      </w:pPr>
+      <w:r>
+        <w:rPr>
+          <w:rFonts w:ascii="Times New Roman" w:hAnsi="Times New Roman" w:cs="Times New Roman"/>
+          <w:sz w:val="28"/>
+          <w:lang w:val="vi-VN"/>
+        </w:rPr>
+        <w:t>Visibility Culling</w:t>
+      </w:r>
+    </w:p>
+    <w:p>
+      <w:pPr>
+        <w:pStyle w:val="ListParagraph"/>
+        <w:numPr>
+          <w:ilvl w:val="0"/>
+          <w:numId w:val="7"/>
+        </w:numPr>
+        <w:rPr>
+          <w:rFonts w:ascii="Times New Roman" w:hAnsi="Times New Roman" w:cs="Times New Roman"/>
+          <w:sz w:val="28"/>
+          <w:lang w:val="vi-VN"/>
+        </w:rPr>
+      </w:pPr>
+      <w:r>
+        <w:rPr>
+          <w:rFonts w:ascii="Times New Roman" w:hAnsi="Times New Roman" w:cs="Times New Roman"/>
+          <w:sz w:val="28"/>
+          <w:lang w:val="vi-VN"/>
+        </w:rPr>
+        <w:t>Animator Culling Mode</w:t>
+      </w:r>
+    </w:p>
+    <w:p>
+      <w:pPr>
+        <w:pStyle w:val="ListParagraph"/>
+        <w:numPr>
+          <w:ilvl w:val="0"/>
+          <w:numId w:val="7"/>
+        </w:numPr>
+        <w:rPr>
+          <w:rFonts w:ascii="Times New Roman" w:hAnsi="Times New Roman" w:cs="Times New Roman"/>
+          <w:sz w:val="28"/>
+          <w:lang w:val="vi-VN"/>
+        </w:rPr>
+      </w:pPr>
+      <w:r>
+        <w:rPr>
+          <w:rFonts w:ascii="Times New Roman" w:hAnsi="Times New Roman" w:cs="Times New Roman"/>
+          <w:sz w:val="28"/>
+          <w:lang w:val="vi-VN"/>
+        </w:rPr>
+        <w:t>Group-Based Culling (Batch Culling)</w:t>
+      </w:r>
+    </w:p>
+    <w:p>
+      <w:pPr>
+        <w:pStyle w:val="ListParagraph"/>
+        <w:numPr>
+          <w:ilvl w:val="0"/>
+          <w:numId w:val="7"/>
+        </w:numPr>
+        <w:rPr>
+          <w:rFonts w:ascii="Times New Roman" w:hAnsi="Times New Roman" w:cs="Times New Roman"/>
+          <w:sz w:val="28"/>
+          <w:lang w:val="vi-VN"/>
+        </w:rPr>
+      </w:pPr>
+      <w:r>
+        <w:rPr>
+          <w:rFonts w:ascii="Times New Roman" w:hAnsi="Times New Roman" w:cs="Times New Roman"/>
+          <w:sz w:val="28"/>
+          <w:lang w:val="vi-VN"/>
+        </w:rPr>
+        <w:t>Sprite Atlas</w:t>
       </w:r>
     </w:p>
     <w:sectPr>
@@ -4404,7 +4550,7 @@
   <w:abstractNum w:abstractNumId="15">
     <w:nsid w:val="4D033B94"/>
     <w:multiLevelType w:val="hybridMultilevel"/>
-    <w:tmpl w:val="DFBCD864"/>
+    <w:tmpl w:val="3F4EFAF0"/>
     <w:lvl w:ilvl="0" w:tplc="0409000F">
       <w:start w:val="1"/>
       <w:numFmt w:val="decimal"/>
@@ -4830,7 +4976,7 @@
   <w:abstractNum w:abstractNumId="19">
     <w:nsid w:val="62CB5D83"/>
     <w:multiLevelType w:val="hybridMultilevel"/>
-    <w:tmpl w:val="2F425586"/>
+    <w:tmpl w:val="A6546814"/>
     <w:lvl w:ilvl="0" w:tplc="04090001">
       <w:start w:val="1"/>
       <w:numFmt w:val="bullet"/>

</xml_diff>

<commit_message>
feat: Add Task ChopTree for Builder
</commit_message>
<xml_diff>
--- a/Document.docx
+++ b/Document.docx
@@ -1824,7 +1824,23 @@
           <w:sz w:val="28"/>
           <w:lang w:val="vi-VN"/>
         </w:rPr>
-        <w:t xml:space="preserve">Dữ liệu về công trình và nhân vật được lưu trong file json. Khi </w:t>
+        <w:t xml:space="preserve">Dữ liệu về công </w:t>
+      </w:r>
+      <w:r>
+        <w:rPr>
+          <w:rFonts w:ascii="Times New Roman" w:hAnsi="Times New Roman" w:cs="Times New Roman"/>
+          <w:sz w:val="28"/>
+          <w:lang w:val="vi-VN"/>
+        </w:rPr>
+        <w:t>trình, cây cối, động vật</w:t>
+      </w:r>
+      <w:r>
+        <w:rPr>
+          <w:rFonts w:ascii="Times New Roman" w:hAnsi="Times New Roman" w:cs="Times New Roman"/>
+          <w:sz w:val="28"/>
+          <w:lang w:val="vi-VN"/>
+        </w:rPr>
+        <w:t xml:space="preserve"> và nhân vật được lưu trong file json. Khi </w:t>
       </w:r>
       <w:r>
         <w:rPr>
@@ -2710,74 +2726,7 @@
           <w:sz w:val="28"/>
           <w:lang w:val="vi-VN"/>
         </w:rPr>
-        <w:t>Đây là hệ thống đảm bảo việc spawn cây và động vật một cách hợp lí để người chơi có thể khai thác tài nguyên</w:t>
-      </w:r>
-    </w:p>
-    <w:p>
-      <w:pPr>
-        <w:rPr>
-          <w:rFonts w:ascii="Times New Roman" w:hAnsi="Times New Roman" w:cs="Times New Roman"/>
-          <w:sz w:val="28"/>
-          <w:lang w:val="vi-VN"/>
-        </w:rPr>
-      </w:pPr>
-      <w:r>
-        <w:rPr>
-          <w:rFonts w:ascii="Times New Roman" w:hAnsi="Times New Roman" w:cs="Times New Roman"/>
-          <w:sz w:val="28"/>
-          <w:lang w:val="vi-VN"/>
-        </w:rPr>
-        <w:t>Hệ thống sử dụng phương pháp Hybrid kết hợp giữa Noise-base Clustering và Clustering-based Spawner</w:t>
-      </w:r>
-    </w:p>
-    <w:p>
-      <w:pPr>
-        <w:pStyle w:val="ListParagraph"/>
-        <w:numPr>
-          <w:ilvl w:val="0"/>
-          <w:numId w:val="13"/>
-        </w:numPr>
-        <w:rPr>
-          <w:rFonts w:ascii="Times New Roman" w:hAnsi="Times New Roman" w:cs="Times New Roman"/>
-          <w:b/>
-          <w:sz w:val="28"/>
-          <w:lang w:val="vi-VN"/>
-        </w:rPr>
-      </w:pPr>
-      <w:r>
-        <w:rPr>
-          <w:rFonts w:ascii="Times New Roman" w:hAnsi="Times New Roman" w:cs="Times New Roman"/>
-          <w:b/>
-          <w:sz w:val="28"/>
-          <w:lang w:val="vi-VN"/>
-        </w:rPr>
-        <w:t>Tối ưu hiệu suất</w:t>
-      </w:r>
-    </w:p>
-    <w:p>
-      <w:pPr>
-        <w:ind w:left="360"/>
-        <w:rPr>
-          <w:rFonts w:ascii="Times New Roman" w:hAnsi="Times New Roman" w:cs="Times New Roman"/>
-          <w:sz w:val="28"/>
-          <w:lang w:val="vi-VN"/>
-        </w:rPr>
-      </w:pPr>
-      <w:r>
-        <w:rPr>
-          <w:rFonts w:ascii="Times New Roman" w:hAnsi="Times New Roman" w:cs="Times New Roman"/>
-          <w:sz w:val="28"/>
-          <w:lang w:val="vi-VN"/>
-        </w:rPr>
-        <w:t>Việc</w:t>
-      </w:r>
-      <w:r>
-        <w:rPr>
-          <w:rFonts w:ascii="Times New Roman" w:hAnsi="Times New Roman" w:cs="Times New Roman"/>
-          <w:sz w:val="28"/>
-          <w:lang w:val="vi-VN"/>
-        </w:rPr>
-        <w:t xml:space="preserve"> render toàn bộ game object trên ma</w:t>
+        <w:t xml:space="preserve">Đây là hệ thống đảm bảo việc spawn cây và động vật một cách hợp lí để người </w:t>
       </w:r>
       <w:bookmarkStart w:id="0" w:name="_GoBack"/>
       <w:bookmarkEnd w:id="0"/>
@@ -2787,7 +2736,74 @@
           <w:sz w:val="28"/>
           <w:lang w:val="vi-VN"/>
         </w:rPr>
-        <w:t>p khiến cho game trở nên giật lag, vì vậy ta phải sử dụng các phương pháp để tối ưu hiệu suất.</w:t>
+        <w:t>chơi có thể khai thác tài nguyên</w:t>
+      </w:r>
+    </w:p>
+    <w:p>
+      <w:pPr>
+        <w:rPr>
+          <w:rFonts w:ascii="Times New Roman" w:hAnsi="Times New Roman" w:cs="Times New Roman"/>
+          <w:sz w:val="28"/>
+          <w:lang w:val="vi-VN"/>
+        </w:rPr>
+      </w:pPr>
+      <w:r>
+        <w:rPr>
+          <w:rFonts w:ascii="Times New Roman" w:hAnsi="Times New Roman" w:cs="Times New Roman"/>
+          <w:sz w:val="28"/>
+          <w:lang w:val="vi-VN"/>
+        </w:rPr>
+        <w:t>Hệ thống sử dụng phương pháp Hybrid kết hợp giữa Noise-base Clustering và Clustering-based Spawner</w:t>
+      </w:r>
+    </w:p>
+    <w:p>
+      <w:pPr>
+        <w:pStyle w:val="ListParagraph"/>
+        <w:numPr>
+          <w:ilvl w:val="0"/>
+          <w:numId w:val="13"/>
+        </w:numPr>
+        <w:rPr>
+          <w:rFonts w:ascii="Times New Roman" w:hAnsi="Times New Roman" w:cs="Times New Roman"/>
+          <w:b/>
+          <w:sz w:val="28"/>
+          <w:lang w:val="vi-VN"/>
+        </w:rPr>
+      </w:pPr>
+      <w:r>
+        <w:rPr>
+          <w:rFonts w:ascii="Times New Roman" w:hAnsi="Times New Roman" w:cs="Times New Roman"/>
+          <w:b/>
+          <w:sz w:val="28"/>
+          <w:lang w:val="vi-VN"/>
+        </w:rPr>
+        <w:t>Tối ưu hiệu suất</w:t>
+      </w:r>
+    </w:p>
+    <w:p>
+      <w:pPr>
+        <w:ind w:left="360"/>
+        <w:rPr>
+          <w:rFonts w:ascii="Times New Roman" w:hAnsi="Times New Roman" w:cs="Times New Roman"/>
+          <w:sz w:val="28"/>
+          <w:lang w:val="vi-VN"/>
+        </w:rPr>
+      </w:pPr>
+      <w:r>
+        <w:rPr>
+          <w:rFonts w:ascii="Times New Roman" w:hAnsi="Times New Roman" w:cs="Times New Roman"/>
+          <w:sz w:val="28"/>
+          <w:lang w:val="vi-VN"/>
+        </w:rPr>
+        <w:t>Việc</w:t>
+      </w:r>
+      <w:r>
+        <w:rPr>
+          <w:rFonts w:ascii="Times New Roman" w:hAnsi="Times New Roman" w:cs="Times New Roman"/>
+          <w:sz w:val="28"/>
+          <w:lang w:val="vi-VN"/>
+        </w:rPr>
+        <w:t xml:space="preserve"> render toàn bộ game object trên map khiến cho game trở nên giật lag, vì vậy ta phải sử dụng các phương pháp để tối ưu hiệu suất.</w:t>
       </w:r>
     </w:p>
     <w:p>
@@ -2809,7 +2825,7 @@
           <w:sz w:val="28"/>
           <w:lang w:val="vi-VN"/>
         </w:rPr>
-        <w:t>Visibility Culling</w:t>
+        <w:t>Animator Culling Mode</w:t>
       </w:r>
     </w:p>
     <w:p>
@@ -2829,31 +2845,16 @@
         <w:rPr>
           <w:rFonts w:ascii="Times New Roman" w:hAnsi="Times New Roman" w:cs="Times New Roman"/>
           <w:sz w:val="28"/>
-          <w:lang w:val="vi-VN"/>
-        </w:rPr>
-        <w:t>Animator Culling Mode</w:t>
-      </w:r>
-    </w:p>
-    <w:p>
-      <w:pPr>
-        <w:pStyle w:val="ListParagraph"/>
-        <w:numPr>
-          <w:ilvl w:val="0"/>
-          <w:numId w:val="7"/>
-        </w:numPr>
-        <w:rPr>
-          <w:rFonts w:ascii="Times New Roman" w:hAnsi="Times New Roman" w:cs="Times New Roman"/>
-          <w:sz w:val="28"/>
-          <w:lang w:val="vi-VN"/>
-        </w:rPr>
-      </w:pPr>
-      <w:r>
-        <w:rPr>
-          <w:rFonts w:ascii="Times New Roman" w:hAnsi="Times New Roman" w:cs="Times New Roman"/>
-          <w:sz w:val="28"/>
-          <w:lang w:val="vi-VN"/>
-        </w:rPr>
-        <w:t>Group-Based Culling (Batch Culling)</w:t>
+        </w:rPr>
+        <w:t>Occlusion</w:t>
+      </w:r>
+      <w:r>
+        <w:rPr>
+          <w:rFonts w:ascii="Times New Roman" w:hAnsi="Times New Roman" w:cs="Times New Roman"/>
+          <w:sz w:val="28"/>
+          <w:lang w:val="vi-VN"/>
+        </w:rPr>
+        <w:t xml:space="preserve"> Culling (Batch Culling)</w:t>
       </w:r>
     </w:p>
     <w:p>

</xml_diff>